<commit_message>
fixes #164, fixes #165
</commit_message>
<xml_diff>
--- a/docassemble/MLHDivorceAndCustody/data/templates/noh_motion_consent.docx
+++ b/docassemble/MLHDivorceAndCustody/data/templates/noh_motion_consent.docx
@@ -681,16 +681,7 @@
           <w:sz w:val="21"/>
           <w:szCs w:val="21"/>
         </w:rPr>
-        <w:t>confidential_contact_info_</w:t>
-      </w:r>
-      <w:proofErr w:type="gramStart"/>
-      <w:r>
-        <w:rPr>
-          <w:rFonts w:ascii="Times New Roman" w:hAnsi="Times New Roman" w:cs="Times New Roman"/>
-          <w:sz w:val="21"/>
-          <w:szCs w:val="21"/>
-        </w:rPr>
-        <w:t>yn</w:t>
+        <w:t>user_ask_role</w:t>
       </w:r>
       <w:proofErr w:type="spellEnd"/>
       <w:r>
@@ -699,9 +690,26 @@
           <w:sz w:val="21"/>
           <w:szCs w:val="21"/>
         </w:rPr>
+        <w:t xml:space="preserve"> == “plaintiff” and </w:t>
+      </w:r>
+      <w:proofErr w:type="spellStart"/>
+      <w:r>
+        <w:rPr>
+          <w:rFonts w:ascii="Times New Roman" w:hAnsi="Times New Roman" w:cs="Times New Roman"/>
+          <w:sz w:val="21"/>
+          <w:szCs w:val="21"/>
+        </w:rPr>
+        <w:t>confidential_contact_info_yn</w:t>
+      </w:r>
+      <w:proofErr w:type="spellEnd"/>
+      <w:r>
+        <w:rPr>
+          <w:rFonts w:ascii="Times New Roman" w:hAnsi="Times New Roman" w:cs="Times New Roman"/>
+          <w:sz w:val="21"/>
+          <w:szCs w:val="21"/>
+        </w:rPr>
         <w:t xml:space="preserve"> %}</w:t>
       </w:r>
-      <w:proofErr w:type="gramEnd"/>
     </w:p>
     <w:p>
       <w:pPr>
@@ -984,7 +992,43 @@
           <w:sz w:val="21"/>
           <w:szCs w:val="21"/>
         </w:rPr>
-        <w:t>Does</w:t>
+        <w:t>{</w:t>
+      </w:r>
+      <w:proofErr w:type="gramEnd"/>
+      <w:r>
+        <w:rPr>
+          <w:rFonts w:ascii="Times New Roman" w:hAnsi="Times New Roman" w:cs="Times New Roman"/>
+          <w:sz w:val="21"/>
+          <w:szCs w:val="21"/>
+        </w:rPr>
+        <w:t xml:space="preserve">% if </w:t>
+      </w:r>
+      <w:proofErr w:type="spellStart"/>
+      <w:r>
+        <w:rPr>
+          <w:rFonts w:ascii="Times New Roman" w:hAnsi="Times New Roman" w:cs="Times New Roman"/>
+          <w:sz w:val="21"/>
+          <w:szCs w:val="21"/>
+        </w:rPr>
+        <w:t>user_ask_role</w:t>
+      </w:r>
+      <w:proofErr w:type="spellEnd"/>
+      <w:r>
+        <w:rPr>
+          <w:rFonts w:ascii="Times New Roman" w:hAnsi="Times New Roman" w:cs="Times New Roman"/>
+          <w:sz w:val="21"/>
+          <w:szCs w:val="21"/>
+        </w:rPr>
+        <w:t xml:space="preserve"> == “plaintiff” </w:t>
+      </w:r>
+      <w:proofErr w:type="gramStart"/>
+      <w:r>
+        <w:rPr>
+          <w:rFonts w:ascii="Times New Roman" w:hAnsi="Times New Roman" w:cs="Times New Roman"/>
+          <w:sz w:val="21"/>
+          <w:szCs w:val="21"/>
+        </w:rPr>
+        <w:t>%}Does</w:t>
       </w:r>
       <w:proofErr w:type="gramEnd"/>
       <w:r>
@@ -1020,6 +1064,60 @@
           <w:sz w:val="21"/>
           <w:szCs w:val="21"/>
         </w:rPr>
+        <w:t>%}Unknown</w:t>
+      </w:r>
+      <w:proofErr w:type="gramEnd"/>
+      <w:r>
+        <w:rPr>
+          <w:rFonts w:ascii="Times New Roman" w:hAnsi="Times New Roman" w:cs="Times New Roman"/>
+          <w:sz w:val="21"/>
+          <w:szCs w:val="21"/>
+        </w:rPr>
+        <w:t xml:space="preserve"> </w:t>
+      </w:r>
+      <w:proofErr w:type="gramStart"/>
+      <w:r>
+        <w:rPr>
+          <w:rFonts w:ascii="Times New Roman" w:hAnsi="Times New Roman" w:cs="Times New Roman"/>
+          <w:sz w:val="21"/>
+          <w:szCs w:val="21"/>
+        </w:rPr>
+        <w:t>phone{</w:t>
+      </w:r>
+      <w:proofErr w:type="gramEnd"/>
+      <w:r>
+        <w:rPr>
+          <w:rFonts w:ascii="Times New Roman" w:hAnsi="Times New Roman" w:cs="Times New Roman"/>
+          <w:sz w:val="21"/>
+          <w:szCs w:val="21"/>
+        </w:rPr>
+        <w:t xml:space="preserve">% endif </w:t>
+      </w:r>
+      <w:proofErr w:type="gramStart"/>
+      <w:r>
+        <w:rPr>
+          <w:rFonts w:ascii="Times New Roman" w:hAnsi="Times New Roman" w:cs="Times New Roman"/>
+          <w:sz w:val="21"/>
+          <w:szCs w:val="21"/>
+        </w:rPr>
+        <w:t>%}{</w:t>
+      </w:r>
+      <w:proofErr w:type="gramEnd"/>
+      <w:r>
+        <w:rPr>
+          <w:rFonts w:ascii="Times New Roman" w:hAnsi="Times New Roman" w:cs="Times New Roman"/>
+          <w:sz w:val="21"/>
+          <w:szCs w:val="21"/>
+        </w:rPr>
+        <w:t>% else</w:t>
+      </w:r>
+      <w:proofErr w:type="gramStart"/>
+      <w:r>
+        <w:rPr>
+          <w:rFonts w:ascii="Times New Roman" w:hAnsi="Times New Roman" w:cs="Times New Roman"/>
+          <w:sz w:val="21"/>
+          <w:szCs w:val="21"/>
+        </w:rPr>
         <w:t xml:space="preserve">%}{{ </w:t>
       </w:r>
       <w:proofErr w:type="spellStart"/>
@@ -1100,7 +1198,15 @@
           <w:sz w:val="21"/>
           <w:szCs w:val="21"/>
         </w:rPr>
-        <w:t>) }}{</w:t>
+        <w:t>) }}</w:t>
+      </w:r>
+      <w:r>
+        <w:rPr>
+          <w:rFonts w:ascii="Times New Roman" w:hAnsi="Times New Roman" w:cs="Times New Roman"/>
+          <w:sz w:val="21"/>
+          <w:szCs w:val="21"/>
+        </w:rPr>
+        <w:t>{</w:t>
       </w:r>
       <w:proofErr w:type="gramEnd"/>
       <w:r>
@@ -1173,6 +1279,122 @@
         </w:rPr>
         <w:t>}</w:t>
       </w:r>
+    </w:p>
+    <w:p>
+      <w:pPr>
+        <w:spacing w:after="0" w:line="240" w:lineRule="auto"/>
+        <w:rPr>
+          <w:rFonts w:ascii="Times New Roman" w:hAnsi="Times New Roman" w:cs="Times New Roman"/>
+          <w:sz w:val="21"/>
+          <w:szCs w:val="21"/>
+        </w:rPr>
+      </w:pPr>
+      <w:r>
+        <w:rPr>
+          <w:rFonts w:ascii="Times New Roman" w:hAnsi="Times New Roman" w:cs="Times New Roman"/>
+          <w:sz w:val="21"/>
+          <w:szCs w:val="21"/>
+        </w:rPr>
+        <w:t xml:space="preserve">{%p if </w:t>
+      </w:r>
+      <w:proofErr w:type="spellStart"/>
+      <w:r>
+        <w:rPr>
+          <w:rFonts w:ascii="Times New Roman" w:hAnsi="Times New Roman" w:cs="Times New Roman"/>
+          <w:sz w:val="21"/>
+          <w:szCs w:val="21"/>
+        </w:rPr>
+        <w:t>user_ask_role</w:t>
+      </w:r>
+      <w:proofErr w:type="spellEnd"/>
+      <w:r>
+        <w:rPr>
+          <w:rFonts w:ascii="Times New Roman" w:hAnsi="Times New Roman" w:cs="Times New Roman"/>
+          <w:sz w:val="21"/>
+          <w:szCs w:val="21"/>
+        </w:rPr>
+        <w:t xml:space="preserve"> == “</w:t>
+      </w:r>
+      <w:r>
+        <w:rPr>
+          <w:rFonts w:ascii="Times New Roman" w:hAnsi="Times New Roman" w:cs="Times New Roman"/>
+          <w:sz w:val="21"/>
+          <w:szCs w:val="21"/>
+        </w:rPr>
+        <w:t>defendant</w:t>
+      </w:r>
+      <w:r>
+        <w:rPr>
+          <w:rFonts w:ascii="Times New Roman" w:hAnsi="Times New Roman" w:cs="Times New Roman"/>
+          <w:sz w:val="21"/>
+          <w:szCs w:val="21"/>
+        </w:rPr>
+        <w:t xml:space="preserve">” and </w:t>
+      </w:r>
+      <w:proofErr w:type="spellStart"/>
+      <w:r>
+        <w:rPr>
+          <w:rFonts w:ascii="Times New Roman" w:hAnsi="Times New Roman" w:cs="Times New Roman"/>
+          <w:sz w:val="21"/>
+          <w:szCs w:val="21"/>
+        </w:rPr>
+        <w:t>confidential_contact_info_yn</w:t>
+      </w:r>
+      <w:proofErr w:type="spellEnd"/>
+      <w:r>
+        <w:rPr>
+          <w:rFonts w:ascii="Times New Roman" w:hAnsi="Times New Roman" w:cs="Times New Roman"/>
+          <w:sz w:val="21"/>
+          <w:szCs w:val="21"/>
+        </w:rPr>
+        <w:t xml:space="preserve"> %}</w:t>
+      </w:r>
+    </w:p>
+    <w:p>
+      <w:pPr>
+        <w:spacing w:after="0" w:line="240" w:lineRule="auto"/>
+        <w:rPr>
+          <w:rFonts w:ascii="Times New Roman" w:hAnsi="Times New Roman" w:cs="Times New Roman"/>
+          <w:sz w:val="21"/>
+          <w:szCs w:val="21"/>
+        </w:rPr>
+      </w:pPr>
+      <w:r>
+        <w:rPr>
+          <w:rFonts w:ascii="Times New Roman" w:hAnsi="Times New Roman" w:cs="Times New Roman"/>
+          <w:sz w:val="21"/>
+          <w:szCs w:val="21"/>
+        </w:rPr>
+        <w:t>Confidential – Mailing address:</w:t>
+      </w:r>
+    </w:p>
+    <w:p>
+      <w:pPr>
+        <w:spacing w:after="0" w:line="240" w:lineRule="auto"/>
+        <w:rPr>
+          <w:rFonts w:ascii="Times New Roman" w:hAnsi="Times New Roman" w:cs="Times New Roman"/>
+          <w:sz w:val="21"/>
+          <w:szCs w:val="21"/>
+        </w:rPr>
+      </w:pPr>
+      <w:r>
+        <w:rPr>
+          <w:rFonts w:ascii="Times New Roman" w:hAnsi="Times New Roman" w:cs="Times New Roman"/>
+          <w:sz w:val="21"/>
+          <w:szCs w:val="21"/>
+        </w:rPr>
+        <w:t xml:space="preserve">{%p </w:t>
+      </w:r>
+      <w:proofErr w:type="gramStart"/>
+      <w:r>
+        <w:rPr>
+          <w:rFonts w:ascii="Times New Roman" w:hAnsi="Times New Roman" w:cs="Times New Roman"/>
+          <w:sz w:val="21"/>
+          <w:szCs w:val="21"/>
+        </w:rPr>
+        <w:t>endif %}</w:t>
+      </w:r>
+      <w:proofErr w:type="gramEnd"/>
     </w:p>
     <w:p>
       <w:pPr>
@@ -1415,7 +1637,79 @@
           <w:sz w:val="21"/>
           <w:szCs w:val="21"/>
         </w:rPr>
-        <w:t>Unknown</w:t>
+        <w:t>{</w:t>
+      </w:r>
+      <w:proofErr w:type="gramEnd"/>
+      <w:r>
+        <w:rPr>
+          <w:rFonts w:ascii="Times New Roman" w:hAnsi="Times New Roman" w:cs="Times New Roman"/>
+          <w:sz w:val="21"/>
+          <w:szCs w:val="21"/>
+        </w:rPr>
+        <w:t xml:space="preserve">% if </w:t>
+      </w:r>
+      <w:proofErr w:type="spellStart"/>
+      <w:r>
+        <w:rPr>
+          <w:rFonts w:ascii="Times New Roman" w:hAnsi="Times New Roman" w:cs="Times New Roman"/>
+          <w:sz w:val="21"/>
+          <w:szCs w:val="21"/>
+        </w:rPr>
+        <w:t>user_ask_role</w:t>
+      </w:r>
+      <w:proofErr w:type="spellEnd"/>
+      <w:r>
+        <w:rPr>
+          <w:rFonts w:ascii="Times New Roman" w:hAnsi="Times New Roman" w:cs="Times New Roman"/>
+          <w:sz w:val="21"/>
+          <w:szCs w:val="21"/>
+        </w:rPr>
+        <w:t xml:space="preserve"> == “defendant” </w:t>
+      </w:r>
+      <w:proofErr w:type="gramStart"/>
+      <w:r>
+        <w:rPr>
+          <w:rFonts w:ascii="Times New Roman" w:hAnsi="Times New Roman" w:cs="Times New Roman"/>
+          <w:sz w:val="21"/>
+          <w:szCs w:val="21"/>
+        </w:rPr>
+        <w:t>%}Does</w:t>
+      </w:r>
+      <w:proofErr w:type="gramEnd"/>
+      <w:r>
+        <w:rPr>
+          <w:rFonts w:ascii="Times New Roman" w:hAnsi="Times New Roman" w:cs="Times New Roman"/>
+          <w:sz w:val="21"/>
+          <w:szCs w:val="21"/>
+        </w:rPr>
+        <w:t xml:space="preserve"> not have </w:t>
+      </w:r>
+      <w:proofErr w:type="gramStart"/>
+      <w:r>
+        <w:rPr>
+          <w:rFonts w:ascii="Times New Roman" w:hAnsi="Times New Roman" w:cs="Times New Roman"/>
+          <w:sz w:val="21"/>
+          <w:szCs w:val="21"/>
+        </w:rPr>
+        <w:t>phone{</w:t>
+      </w:r>
+      <w:proofErr w:type="gramEnd"/>
+      <w:r>
+        <w:rPr>
+          <w:rFonts w:ascii="Times New Roman" w:hAnsi="Times New Roman" w:cs="Times New Roman"/>
+          <w:sz w:val="21"/>
+          <w:szCs w:val="21"/>
+        </w:rPr>
+        <w:t xml:space="preserve">% else </w:t>
+      </w:r>
+      <w:proofErr w:type="gramStart"/>
+      <w:r>
+        <w:rPr>
+          <w:rFonts w:ascii="Times New Roman" w:hAnsi="Times New Roman" w:cs="Times New Roman"/>
+          <w:sz w:val="21"/>
+          <w:szCs w:val="21"/>
+        </w:rPr>
+        <w:t>%}Unknown</w:t>
       </w:r>
       <w:proofErr w:type="gramEnd"/>
       <w:r>
@@ -1442,6 +1736,24 @@
           <w:sz w:val="21"/>
           <w:szCs w:val="21"/>
         </w:rPr>
+        <w:t xml:space="preserve">% endif </w:t>
+      </w:r>
+      <w:proofErr w:type="gramStart"/>
+      <w:r>
+        <w:rPr>
+          <w:rFonts w:ascii="Times New Roman" w:hAnsi="Times New Roman" w:cs="Times New Roman"/>
+          <w:sz w:val="21"/>
+          <w:szCs w:val="21"/>
+        </w:rPr>
+        <w:t>%}{</w:t>
+      </w:r>
+      <w:proofErr w:type="gramEnd"/>
+      <w:r>
+        <w:rPr>
+          <w:rFonts w:ascii="Times New Roman" w:hAnsi="Times New Roman" w:cs="Times New Roman"/>
+          <w:sz w:val="21"/>
+          <w:szCs w:val="21"/>
+        </w:rPr>
         <w:t xml:space="preserve">% else </w:t>
       </w:r>
       <w:proofErr w:type="gramStart"/>
@@ -1451,7 +1763,15 @@
           <w:sz w:val="21"/>
           <w:szCs w:val="21"/>
         </w:rPr>
-        <w:t xml:space="preserve">%}{{ </w:t>
+        <w:t>%}</w:t>
+      </w:r>
+      <w:r>
+        <w:rPr>
+          <w:rFonts w:ascii="Times New Roman" w:hAnsi="Times New Roman" w:cs="Times New Roman"/>
+          <w:sz w:val="21"/>
+          <w:szCs w:val="21"/>
+        </w:rPr>
+        <w:t xml:space="preserve">{{ </w:t>
       </w:r>
       <w:proofErr w:type="spellStart"/>
       <w:r>

</xml_diff>

<commit_message>
start setting up custody complaint
</commit_message>
<xml_diff>
--- a/docassemble/MLHDivorceAndCustody/data/templates/noh_motion_consent.docx
+++ b/docassemble/MLHDivorceAndCustody/data/templates/noh_motion_consent.docx
@@ -37,16 +37,7 @@
           <w:sz w:val="22"/>
           <w:szCs w:val="22"/>
         </w:rPr>
-        <w:t xml:space="preserve">IN THE FAMILY DIVISION FOR </w:t>
-      </w:r>
-      <w:proofErr w:type="gramStart"/>
-      <w:r>
-        <w:rPr>
-          <w:rFonts w:ascii="Times New Roman" w:hAnsi="Times New Roman" w:cs="Times New Roman"/>
-          <w:sz w:val="22"/>
-          <w:szCs w:val="22"/>
-        </w:rPr>
-        <w:t xml:space="preserve">THE  {{ </w:t>
+        <w:t xml:space="preserve">IN THE FAMILY DIVISION FOR THE  {{ </w:t>
       </w:r>
       <w:proofErr w:type="spellStart"/>
       <w:r>
@@ -55,28 +46,9 @@
           <w:sz w:val="22"/>
           <w:szCs w:val="22"/>
         </w:rPr>
-        <w:t>the</w:t>
-      </w:r>
-      <w:proofErr w:type="gramEnd"/>
-      <w:r>
-        <w:rPr>
-          <w:rFonts w:ascii="Times New Roman" w:hAnsi="Times New Roman" w:cs="Times New Roman"/>
-          <w:sz w:val="22"/>
-          <w:szCs w:val="22"/>
-        </w:rPr>
-        <w:t>_</w:t>
-      </w:r>
-      <w:proofErr w:type="gramStart"/>
-      <w:r>
-        <w:rPr>
-          <w:rFonts w:ascii="Times New Roman" w:hAnsi="Times New Roman" w:cs="Times New Roman"/>
-          <w:sz w:val="22"/>
-          <w:szCs w:val="22"/>
-        </w:rPr>
-        <w:t>court.number</w:t>
+        <w:t>the_court.number</w:t>
       </w:r>
       <w:proofErr w:type="spellEnd"/>
-      <w:proofErr w:type="gramEnd"/>
       <w:r>
         <w:rPr>
           <w:rFonts w:ascii="Times New Roman" w:hAnsi="Times New Roman" w:cs="Times New Roman"/>
@@ -102,16 +74,7 @@
           <w:sz w:val="22"/>
           <w:szCs w:val="22"/>
         </w:rPr>
-        <w:t xml:space="preserve">COUNTY OF </w:t>
-      </w:r>
-      <w:proofErr w:type="gramStart"/>
-      <w:r>
-        <w:rPr>
-          <w:rFonts w:ascii="Times New Roman" w:hAnsi="Times New Roman" w:cs="Times New Roman"/>
-          <w:sz w:val="22"/>
-          <w:szCs w:val="22"/>
-        </w:rPr>
-        <w:t xml:space="preserve">{{ </w:t>
+        <w:t xml:space="preserve">COUNTY OF {{ </w:t>
       </w:r>
       <w:proofErr w:type="spellStart"/>
       <w:r>
@@ -120,16 +83,7 @@
           <w:sz w:val="22"/>
           <w:szCs w:val="22"/>
         </w:rPr>
-        <w:t>county</w:t>
-      </w:r>
-      <w:proofErr w:type="gramEnd"/>
-      <w:r>
-        <w:rPr>
-          <w:rFonts w:ascii="Times New Roman" w:hAnsi="Times New Roman" w:cs="Times New Roman"/>
-          <w:sz w:val="22"/>
-          <w:szCs w:val="22"/>
-        </w:rPr>
-        <w:t>_choice</w:t>
+        <w:t>county_choice</w:t>
       </w:r>
       <w:proofErr w:type="spellEnd"/>
       <w:r>
@@ -138,25 +92,7 @@
           <w:sz w:val="22"/>
           <w:szCs w:val="22"/>
         </w:rPr>
-        <w:t xml:space="preserve"> | </w:t>
-      </w:r>
-      <w:proofErr w:type="gramStart"/>
-      <w:r>
-        <w:rPr>
-          <w:rFonts w:ascii="Times New Roman" w:hAnsi="Times New Roman" w:cs="Times New Roman"/>
-          <w:sz w:val="22"/>
-          <w:szCs w:val="22"/>
-        </w:rPr>
-        <w:t>upper }</w:t>
-      </w:r>
-      <w:proofErr w:type="gramEnd"/>
-      <w:r>
-        <w:rPr>
-          <w:rFonts w:ascii="Times New Roman" w:hAnsi="Times New Roman" w:cs="Times New Roman"/>
-          <w:sz w:val="22"/>
-          <w:szCs w:val="22"/>
-        </w:rPr>
-        <w:t>}</w:t>
+        <w:t xml:space="preserve"> | upper }}</w:t>
       </w:r>
     </w:p>
     <w:p>
@@ -213,23 +149,13 @@
                 <w:szCs w:val="22"/>
               </w:rPr>
             </w:pPr>
-            <w:proofErr w:type="gramStart"/>
             <w:r>
               <w:rPr>
                 <w:rFonts w:ascii="Times New Roman" w:hAnsi="Times New Roman" w:cs="Times New Roman"/>
                 <w:sz w:val="22"/>
                 <w:szCs w:val="22"/>
               </w:rPr>
-              <w:t>{{ plaintiffs</w:t>
-            </w:r>
-            <w:proofErr w:type="gramEnd"/>
-            <w:r>
-              <w:rPr>
-                <w:rFonts w:ascii="Times New Roman" w:hAnsi="Times New Roman" w:cs="Times New Roman"/>
-                <w:sz w:val="22"/>
-                <w:szCs w:val="22"/>
-              </w:rPr>
-              <w:t>[0].</w:t>
+              <w:t>{{ plaintiffs[0].</w:t>
             </w:r>
             <w:proofErr w:type="spellStart"/>
             <w:r>
@@ -238,16 +164,7 @@
                 <w:sz w:val="22"/>
                 <w:szCs w:val="22"/>
               </w:rPr>
-              <w:t>name_</w:t>
-            </w:r>
-            <w:proofErr w:type="gramStart"/>
-            <w:r>
-              <w:rPr>
-                <w:rFonts w:ascii="Times New Roman" w:hAnsi="Times New Roman" w:cs="Times New Roman"/>
-                <w:sz w:val="22"/>
-                <w:szCs w:val="22"/>
-              </w:rPr>
-              <w:t>full</w:t>
+              <w:t>name_full</w:t>
             </w:r>
             <w:proofErr w:type="spellEnd"/>
             <w:r>
@@ -256,16 +173,7 @@
                 <w:sz w:val="22"/>
                 <w:szCs w:val="22"/>
               </w:rPr>
-              <w:t>() }</w:t>
-            </w:r>
-            <w:proofErr w:type="gramEnd"/>
-            <w:r>
-              <w:rPr>
-                <w:rFonts w:ascii="Times New Roman" w:hAnsi="Times New Roman" w:cs="Times New Roman"/>
-                <w:sz w:val="22"/>
-                <w:szCs w:val="22"/>
-              </w:rPr>
-              <w:t>}</w:t>
+              <w:t>() }}</w:t>
             </w:r>
           </w:p>
           <w:p>
@@ -333,23 +241,13 @@
                 <w:szCs w:val="22"/>
               </w:rPr>
             </w:pPr>
-            <w:proofErr w:type="gramStart"/>
             <w:r>
               <w:rPr>
                 <w:rFonts w:ascii="Times New Roman" w:hAnsi="Times New Roman" w:cs="Times New Roman"/>
                 <w:sz w:val="22"/>
                 <w:szCs w:val="22"/>
               </w:rPr>
-              <w:t>{{ defendants</w:t>
-            </w:r>
-            <w:proofErr w:type="gramEnd"/>
-            <w:r>
-              <w:rPr>
-                <w:rFonts w:ascii="Times New Roman" w:hAnsi="Times New Roman" w:cs="Times New Roman"/>
-                <w:sz w:val="22"/>
-                <w:szCs w:val="22"/>
-              </w:rPr>
-              <w:t>[0].</w:t>
+              <w:t>{{ defendants[0].</w:t>
             </w:r>
             <w:proofErr w:type="spellStart"/>
             <w:r>
@@ -358,16 +256,7 @@
                 <w:sz w:val="22"/>
                 <w:szCs w:val="22"/>
               </w:rPr>
-              <w:t>name_</w:t>
-            </w:r>
-            <w:proofErr w:type="gramStart"/>
-            <w:r>
-              <w:rPr>
-                <w:rFonts w:ascii="Times New Roman" w:hAnsi="Times New Roman" w:cs="Times New Roman"/>
-                <w:sz w:val="22"/>
-                <w:szCs w:val="22"/>
-              </w:rPr>
-              <w:t>full</w:t>
+              <w:t>name_full</w:t>
             </w:r>
             <w:proofErr w:type="spellEnd"/>
             <w:r>
@@ -376,16 +265,7 @@
                 <w:sz w:val="22"/>
                 <w:szCs w:val="22"/>
               </w:rPr>
-              <w:t>() }</w:t>
-            </w:r>
-            <w:proofErr w:type="gramEnd"/>
-            <w:r>
-              <w:rPr>
-                <w:rFonts w:ascii="Times New Roman" w:hAnsi="Times New Roman" w:cs="Times New Roman"/>
-                <w:sz w:val="22"/>
-                <w:szCs w:val="22"/>
-              </w:rPr>
-              <w:t>}</w:t>
+              <w:t>() }}</w:t>
             </w:r>
           </w:p>
           <w:p>
@@ -484,7 +364,6 @@
               </w:rPr>
               <w:t xml:space="preserve"> </w:t>
             </w:r>
-            <w:proofErr w:type="gramStart"/>
             <w:r>
               <w:rPr>
                 <w:rFonts w:ascii="Times New Roman" w:hAnsi="Times New Roman" w:cs="Times New Roman"/>
@@ -502,27 +381,7 @@
                 <w:szCs w:val="22"/>
                 <w:u w:val="single"/>
               </w:rPr>
-              <w:t>docket</w:t>
-            </w:r>
-            <w:proofErr w:type="gramEnd"/>
-            <w:r>
-              <w:rPr>
-                <w:rFonts w:ascii="Times New Roman" w:hAnsi="Times New Roman" w:cs="Times New Roman"/>
-                <w:sz w:val="22"/>
-                <w:szCs w:val="22"/>
-                <w:u w:val="single"/>
-              </w:rPr>
-              <w:t>_</w:t>
-            </w:r>
-            <w:proofErr w:type="gramStart"/>
-            <w:r>
-              <w:rPr>
-                <w:rFonts w:ascii="Times New Roman" w:hAnsi="Times New Roman" w:cs="Times New Roman"/>
-                <w:sz w:val="22"/>
-                <w:szCs w:val="22"/>
-                <w:u w:val="single"/>
-              </w:rPr>
-              <w:t>number</w:t>
+              <w:t>docket_number</w:t>
             </w:r>
             <w:proofErr w:type="spellEnd"/>
             <w:r>
@@ -532,17 +391,7 @@
                 <w:szCs w:val="22"/>
                 <w:u w:val="single"/>
               </w:rPr>
-              <w:t xml:space="preserve"> }</w:t>
-            </w:r>
-            <w:proofErr w:type="gramEnd"/>
-            <w:r>
-              <w:rPr>
-                <w:rFonts w:ascii="Times New Roman" w:hAnsi="Times New Roman" w:cs="Times New Roman"/>
-                <w:sz w:val="22"/>
-                <w:szCs w:val="22"/>
-                <w:u w:val="single"/>
-              </w:rPr>
-              <w:t>}</w:t>
+              <w:t xml:space="preserve"> }}</w:t>
             </w:r>
           </w:p>
           <w:p>
@@ -602,23 +451,13 @@
           <w:szCs w:val="21"/>
         </w:rPr>
       </w:pPr>
-      <w:proofErr w:type="gramStart"/>
-      <w:r>
-        <w:rPr>
-          <w:rFonts w:ascii="Times New Roman" w:hAnsi="Times New Roman" w:cs="Times New Roman"/>
-          <w:sz w:val="21"/>
-          <w:szCs w:val="21"/>
-        </w:rPr>
-        <w:t>{{ plaintiffs</w:t>
-      </w:r>
-      <w:proofErr w:type="gramEnd"/>
-      <w:r>
-        <w:rPr>
-          <w:rFonts w:ascii="Times New Roman" w:hAnsi="Times New Roman" w:cs="Times New Roman"/>
-          <w:sz w:val="21"/>
-          <w:szCs w:val="21"/>
-        </w:rPr>
-        <w:t>[0].</w:t>
+      <w:r>
+        <w:rPr>
+          <w:rFonts w:ascii="Times New Roman" w:hAnsi="Times New Roman" w:cs="Times New Roman"/>
+          <w:sz w:val="21"/>
+          <w:szCs w:val="21"/>
+        </w:rPr>
+        <w:t>{{ plaintiffs[0].</w:t>
       </w:r>
       <w:proofErr w:type="spellStart"/>
       <w:r>
@@ -627,16 +466,7 @@
           <w:sz w:val="21"/>
           <w:szCs w:val="21"/>
         </w:rPr>
-        <w:t>name_</w:t>
-      </w:r>
-      <w:proofErr w:type="gramStart"/>
-      <w:r>
-        <w:rPr>
-          <w:rFonts w:ascii="Times New Roman" w:hAnsi="Times New Roman" w:cs="Times New Roman"/>
-          <w:sz w:val="21"/>
-          <w:szCs w:val="21"/>
-        </w:rPr>
-        <w:t>full</w:t>
+        <w:t>name_full</w:t>
       </w:r>
       <w:proofErr w:type="spellEnd"/>
       <w:r>
@@ -645,16 +475,7 @@
           <w:sz w:val="21"/>
           <w:szCs w:val="21"/>
         </w:rPr>
-        <w:t>() }</w:t>
-      </w:r>
-      <w:proofErr w:type="gramEnd"/>
-      <w:r>
-        <w:rPr>
-          <w:rFonts w:ascii="Times New Roman" w:hAnsi="Times New Roman" w:cs="Times New Roman"/>
-          <w:sz w:val="21"/>
-          <w:szCs w:val="21"/>
-        </w:rPr>
-        <w:t>}</w:t>
+        <w:t>() }}</w:t>
       </w:r>
     </w:p>
     <w:p>
@@ -757,32 +578,13 @@
           <w:szCs w:val="21"/>
         </w:rPr>
       </w:pPr>
-      <w:proofErr w:type="gramStart"/>
-      <w:r>
-        <w:rPr>
-          <w:rFonts w:ascii="Times New Roman" w:hAnsi="Times New Roman" w:cs="Times New Roman"/>
-          <w:sz w:val="21"/>
-          <w:szCs w:val="21"/>
-        </w:rPr>
-        <w:t>{{ plaintiffs</w:t>
-      </w:r>
-      <w:proofErr w:type="gramEnd"/>
-      <w:r>
-        <w:rPr>
-          <w:rFonts w:ascii="Times New Roman" w:hAnsi="Times New Roman" w:cs="Times New Roman"/>
-          <w:sz w:val="21"/>
-          <w:szCs w:val="21"/>
-        </w:rPr>
-        <w:t>[0</w:t>
-      </w:r>
-      <w:proofErr w:type="gramStart"/>
-      <w:r>
-        <w:rPr>
-          <w:rFonts w:ascii="Times New Roman" w:hAnsi="Times New Roman" w:cs="Times New Roman"/>
-          <w:sz w:val="21"/>
-          <w:szCs w:val="21"/>
-        </w:rPr>
-        <w:t>].</w:t>
+      <w:r>
+        <w:rPr>
+          <w:rFonts w:ascii="Times New Roman" w:hAnsi="Times New Roman" w:cs="Times New Roman"/>
+          <w:sz w:val="21"/>
+          <w:szCs w:val="21"/>
+        </w:rPr>
+        <w:t>{{ plaintiffs[0].</w:t>
       </w:r>
       <w:proofErr w:type="spellStart"/>
       <w:r>
@@ -791,25 +593,7 @@
           <w:sz w:val="21"/>
           <w:szCs w:val="21"/>
         </w:rPr>
-        <w:t>address</w:t>
-      </w:r>
-      <w:proofErr w:type="gramEnd"/>
-      <w:r>
-        <w:rPr>
-          <w:rFonts w:ascii="Times New Roman" w:hAnsi="Times New Roman" w:cs="Times New Roman"/>
-          <w:sz w:val="21"/>
-          <w:szCs w:val="21"/>
-        </w:rPr>
-        <w:t>.line_</w:t>
-      </w:r>
-      <w:proofErr w:type="gramStart"/>
-      <w:r>
-        <w:rPr>
-          <w:rFonts w:ascii="Times New Roman" w:hAnsi="Times New Roman" w:cs="Times New Roman"/>
-          <w:sz w:val="21"/>
-          <w:szCs w:val="21"/>
-        </w:rPr>
-        <w:t>one</w:t>
+        <w:t>address.line_one</w:t>
       </w:r>
       <w:proofErr w:type="spellEnd"/>
       <w:r>
@@ -818,16 +602,7 @@
           <w:sz w:val="21"/>
           <w:szCs w:val="21"/>
         </w:rPr>
-        <w:t>() }</w:t>
-      </w:r>
-      <w:proofErr w:type="gramEnd"/>
-      <w:r>
-        <w:rPr>
-          <w:rFonts w:ascii="Times New Roman" w:hAnsi="Times New Roman" w:cs="Times New Roman"/>
-          <w:sz w:val="21"/>
-          <w:szCs w:val="21"/>
-        </w:rPr>
-        <w:t>}</w:t>
+        <w:t>() }}</w:t>
       </w:r>
     </w:p>
     <w:p>
@@ -840,32 +615,13 @@
           <w:szCs w:val="21"/>
         </w:rPr>
       </w:pPr>
-      <w:proofErr w:type="gramStart"/>
-      <w:r>
-        <w:rPr>
-          <w:rFonts w:ascii="Times New Roman" w:hAnsi="Times New Roman" w:cs="Times New Roman"/>
-          <w:sz w:val="21"/>
-          <w:szCs w:val="21"/>
-        </w:rPr>
-        <w:t>{{ plaintiffs</w:t>
-      </w:r>
-      <w:proofErr w:type="gramEnd"/>
-      <w:r>
-        <w:rPr>
-          <w:rFonts w:ascii="Times New Roman" w:hAnsi="Times New Roman" w:cs="Times New Roman"/>
-          <w:sz w:val="21"/>
-          <w:szCs w:val="21"/>
-        </w:rPr>
-        <w:t>[0</w:t>
-      </w:r>
-      <w:proofErr w:type="gramStart"/>
-      <w:r>
-        <w:rPr>
-          <w:rFonts w:ascii="Times New Roman" w:hAnsi="Times New Roman" w:cs="Times New Roman"/>
-          <w:sz w:val="21"/>
-          <w:szCs w:val="21"/>
-        </w:rPr>
-        <w:t>].</w:t>
+      <w:r>
+        <w:rPr>
+          <w:rFonts w:ascii="Times New Roman" w:hAnsi="Times New Roman" w:cs="Times New Roman"/>
+          <w:sz w:val="21"/>
+          <w:szCs w:val="21"/>
+        </w:rPr>
+        <w:t>{{ plaintiffs[0].</w:t>
       </w:r>
       <w:proofErr w:type="spellStart"/>
       <w:r>
@@ -874,25 +630,7 @@
           <w:sz w:val="21"/>
           <w:szCs w:val="21"/>
         </w:rPr>
-        <w:t>address</w:t>
-      </w:r>
-      <w:proofErr w:type="gramEnd"/>
-      <w:r>
-        <w:rPr>
-          <w:rFonts w:ascii="Times New Roman" w:hAnsi="Times New Roman" w:cs="Times New Roman"/>
-          <w:sz w:val="21"/>
-          <w:szCs w:val="21"/>
-        </w:rPr>
-        <w:t>.line_</w:t>
-      </w:r>
-      <w:proofErr w:type="gramStart"/>
-      <w:r>
-        <w:rPr>
-          <w:rFonts w:ascii="Times New Roman" w:hAnsi="Times New Roman" w:cs="Times New Roman"/>
-          <w:sz w:val="21"/>
-          <w:szCs w:val="21"/>
-        </w:rPr>
-        <w:t>two</w:t>
+        <w:t>address.line_two</w:t>
       </w:r>
       <w:proofErr w:type="spellEnd"/>
       <w:r>
@@ -901,16 +639,7 @@
           <w:sz w:val="21"/>
           <w:szCs w:val="21"/>
         </w:rPr>
-        <w:t>() }</w:t>
-      </w:r>
-      <w:proofErr w:type="gramEnd"/>
-      <w:r>
-        <w:rPr>
-          <w:rFonts w:ascii="Times New Roman" w:hAnsi="Times New Roman" w:cs="Times New Roman"/>
-          <w:sz w:val="21"/>
-          <w:szCs w:val="21"/>
-        </w:rPr>
-        <w:t>}</w:t>
+        <w:t>() }}</w:t>
       </w:r>
     </w:p>
     <w:p>
@@ -931,23 +660,13 @@
         </w:rPr>
         <w:t xml:space="preserve">{% if </w:t>
       </w:r>
-      <w:proofErr w:type="gramStart"/>
-      <w:r>
-        <w:rPr>
-          <w:rFonts w:ascii="Times New Roman" w:hAnsi="Times New Roman" w:cs="Times New Roman"/>
-          <w:sz w:val="21"/>
-          <w:szCs w:val="21"/>
-        </w:rPr>
-        <w:t>plaintiffs[</w:t>
-      </w:r>
-      <w:proofErr w:type="gramEnd"/>
-      <w:r>
-        <w:rPr>
-          <w:rFonts w:ascii="Times New Roman" w:hAnsi="Times New Roman" w:cs="Times New Roman"/>
-          <w:sz w:val="21"/>
-          <w:szCs w:val="21"/>
-        </w:rPr>
-        <w:t>0].</w:t>
+      <w:r>
+        <w:rPr>
+          <w:rFonts w:ascii="Times New Roman" w:hAnsi="Times New Roman" w:cs="Times New Roman"/>
+          <w:sz w:val="21"/>
+          <w:szCs w:val="21"/>
+        </w:rPr>
+        <w:t>plaintiffs[0].</w:t>
       </w:r>
       <w:proofErr w:type="spellStart"/>
       <w:r>
@@ -965,33 +684,15 @@
           <w:sz w:val="21"/>
           <w:szCs w:val="21"/>
         </w:rPr>
-        <w:t xml:space="preserve"> </w:t>
-      </w:r>
-      <w:proofErr w:type="gramStart"/>
-      <w:r>
-        <w:rPr>
-          <w:rFonts w:ascii="Times New Roman" w:hAnsi="Times New Roman" w:cs="Times New Roman"/>
-          <w:sz w:val="21"/>
-          <w:szCs w:val="21"/>
-        </w:rPr>
-        <w:t>%}</w:t>
-      </w:r>
-      <w:r>
-        <w:rPr>
-          <w:rFonts w:ascii="Times New Roman" w:hAnsi="Times New Roman" w:cs="Times New Roman"/>
-          <w:sz w:val="21"/>
-          <w:szCs w:val="21"/>
-        </w:rPr>
-        <w:t>{</w:t>
-      </w:r>
-      <w:proofErr w:type="gramEnd"/>
-      <w:r>
-        <w:rPr>
-          <w:rFonts w:ascii="Times New Roman" w:hAnsi="Times New Roman" w:cs="Times New Roman"/>
-          <w:sz w:val="21"/>
-          <w:szCs w:val="21"/>
-        </w:rPr>
-        <w:t xml:space="preserve">% if </w:t>
+        <w:t xml:space="preserve"> %}</w:t>
+      </w:r>
+      <w:r>
+        <w:rPr>
+          <w:rFonts w:ascii="Times New Roman" w:hAnsi="Times New Roman" w:cs="Times New Roman"/>
+          <w:sz w:val="21"/>
+          <w:szCs w:val="21"/>
+        </w:rPr>
+        <w:t xml:space="preserve">{% if </w:t>
       </w:r>
       <w:proofErr w:type="spellStart"/>
       <w:r>
@@ -1009,106 +710,7 @@
           <w:sz w:val="21"/>
           <w:szCs w:val="21"/>
         </w:rPr>
-        <w:t xml:space="preserve"> == “plaintiff” </w:t>
-      </w:r>
-      <w:proofErr w:type="gramStart"/>
-      <w:r>
-        <w:rPr>
-          <w:rFonts w:ascii="Times New Roman" w:hAnsi="Times New Roman" w:cs="Times New Roman"/>
-          <w:sz w:val="21"/>
-          <w:szCs w:val="21"/>
-        </w:rPr>
-        <w:t>%}Does</w:t>
-      </w:r>
-      <w:proofErr w:type="gramEnd"/>
-      <w:r>
-        <w:rPr>
-          <w:rFonts w:ascii="Times New Roman" w:hAnsi="Times New Roman" w:cs="Times New Roman"/>
-          <w:sz w:val="21"/>
-          <w:szCs w:val="21"/>
-        </w:rPr>
-        <w:t xml:space="preserve"> not have </w:t>
-      </w:r>
-      <w:proofErr w:type="gramStart"/>
-      <w:r>
-        <w:rPr>
-          <w:rFonts w:ascii="Times New Roman" w:hAnsi="Times New Roman" w:cs="Times New Roman"/>
-          <w:sz w:val="21"/>
-          <w:szCs w:val="21"/>
-        </w:rPr>
-        <w:t>phone{</w:t>
-      </w:r>
-      <w:proofErr w:type="gramEnd"/>
-      <w:r>
-        <w:rPr>
-          <w:rFonts w:ascii="Times New Roman" w:hAnsi="Times New Roman" w:cs="Times New Roman"/>
-          <w:sz w:val="21"/>
-          <w:szCs w:val="21"/>
-        </w:rPr>
-        <w:t xml:space="preserve">% else </w:t>
-      </w:r>
-      <w:proofErr w:type="gramStart"/>
-      <w:r>
-        <w:rPr>
-          <w:rFonts w:ascii="Times New Roman" w:hAnsi="Times New Roman" w:cs="Times New Roman"/>
-          <w:sz w:val="21"/>
-          <w:szCs w:val="21"/>
-        </w:rPr>
-        <w:t>%}Unknown</w:t>
-      </w:r>
-      <w:proofErr w:type="gramEnd"/>
-      <w:r>
-        <w:rPr>
-          <w:rFonts w:ascii="Times New Roman" w:hAnsi="Times New Roman" w:cs="Times New Roman"/>
-          <w:sz w:val="21"/>
-          <w:szCs w:val="21"/>
-        </w:rPr>
-        <w:t xml:space="preserve"> </w:t>
-      </w:r>
-      <w:proofErr w:type="gramStart"/>
-      <w:r>
-        <w:rPr>
-          <w:rFonts w:ascii="Times New Roman" w:hAnsi="Times New Roman" w:cs="Times New Roman"/>
-          <w:sz w:val="21"/>
-          <w:szCs w:val="21"/>
-        </w:rPr>
-        <w:t>phone{</w:t>
-      </w:r>
-      <w:proofErr w:type="gramEnd"/>
-      <w:r>
-        <w:rPr>
-          <w:rFonts w:ascii="Times New Roman" w:hAnsi="Times New Roman" w:cs="Times New Roman"/>
-          <w:sz w:val="21"/>
-          <w:szCs w:val="21"/>
-        </w:rPr>
-        <w:t xml:space="preserve">% endif </w:t>
-      </w:r>
-      <w:proofErr w:type="gramStart"/>
-      <w:r>
-        <w:rPr>
-          <w:rFonts w:ascii="Times New Roman" w:hAnsi="Times New Roman" w:cs="Times New Roman"/>
-          <w:sz w:val="21"/>
-          <w:szCs w:val="21"/>
-        </w:rPr>
-        <w:t>%}{</w:t>
-      </w:r>
-      <w:proofErr w:type="gramEnd"/>
-      <w:r>
-        <w:rPr>
-          <w:rFonts w:ascii="Times New Roman" w:hAnsi="Times New Roman" w:cs="Times New Roman"/>
-          <w:sz w:val="21"/>
-          <w:szCs w:val="21"/>
-        </w:rPr>
-        <w:t>% else</w:t>
-      </w:r>
-      <w:proofErr w:type="gramStart"/>
-      <w:r>
-        <w:rPr>
-          <w:rFonts w:ascii="Times New Roman" w:hAnsi="Times New Roman" w:cs="Times New Roman"/>
-          <w:sz w:val="21"/>
-          <w:szCs w:val="21"/>
-        </w:rPr>
-        <w:t xml:space="preserve">%}{{ </w:t>
+        <w:t xml:space="preserve"> == “plaintiff” %}Does not have phone{% else %}Unknown phone{% endif %}{% else%}{{ </w:t>
       </w:r>
       <w:proofErr w:type="spellStart"/>
       <w:r>
@@ -1117,16 +719,7 @@
           <w:sz w:val="21"/>
           <w:szCs w:val="21"/>
         </w:rPr>
-        <w:t>phone</w:t>
-      </w:r>
-      <w:proofErr w:type="gramEnd"/>
-      <w:r>
-        <w:rPr>
-          <w:rFonts w:ascii="Times New Roman" w:hAnsi="Times New Roman" w:cs="Times New Roman"/>
-          <w:sz w:val="21"/>
-          <w:szCs w:val="21"/>
-        </w:rPr>
-        <w:t>_number_formatted</w:t>
+        <w:t>phone_number_formatted</w:t>
       </w:r>
       <w:proofErr w:type="spellEnd"/>
       <w:r>
@@ -1151,16 +744,7 @@
           <w:sz w:val="21"/>
           <w:szCs w:val="21"/>
         </w:rPr>
-        <w:t>[0</w:t>
-      </w:r>
-      <w:proofErr w:type="gramStart"/>
-      <w:r>
-        <w:rPr>
-          <w:rFonts w:ascii="Times New Roman" w:hAnsi="Times New Roman" w:cs="Times New Roman"/>
-          <w:sz w:val="21"/>
-          <w:szCs w:val="21"/>
-        </w:rPr>
-        <w:t>].</w:t>
+        <w:t>[0].</w:t>
       </w:r>
       <w:proofErr w:type="spellStart"/>
       <w:r>
@@ -1169,19 +753,9 @@
           <w:sz w:val="21"/>
           <w:szCs w:val="21"/>
         </w:rPr>
-        <w:t>phone</w:t>
-      </w:r>
-      <w:proofErr w:type="gramEnd"/>
-      <w:r>
-        <w:rPr>
-          <w:rFonts w:ascii="Times New Roman" w:hAnsi="Times New Roman" w:cs="Times New Roman"/>
-          <w:sz w:val="21"/>
-          <w:szCs w:val="21"/>
-        </w:rPr>
-        <w:t>_number</w:t>
+        <w:t>phone_number</w:t>
       </w:r>
       <w:proofErr w:type="spellEnd"/>
-      <w:proofErr w:type="gramStart"/>
       <w:r>
         <w:rPr>
           <w:rFonts w:ascii="Times New Roman" w:hAnsi="Times New Roman" w:cs="Times New Roman"/>
@@ -1196,16 +770,7 @@
           <w:sz w:val="21"/>
           <w:szCs w:val="21"/>
         </w:rPr>
-        <w:t>{</w:t>
-      </w:r>
-      <w:proofErr w:type="gramEnd"/>
-      <w:r>
-        <w:rPr>
-          <w:rFonts w:ascii="Times New Roman" w:hAnsi="Times New Roman" w:cs="Times New Roman"/>
-          <w:sz w:val="21"/>
-          <w:szCs w:val="21"/>
-        </w:rPr>
-        <w:t>% endif %}</w:t>
+        <w:t>{% endif %}</w:t>
       </w:r>
       <w:r>
         <w:rPr>
@@ -1214,24 +779,7 @@
           <w:szCs w:val="21"/>
         </w:rPr>
         <w:br w:type="column"/>
-      </w:r>
-      <w:proofErr w:type="gramStart"/>
-      <w:r>
-        <w:rPr>
-          <w:rFonts w:ascii="Times New Roman" w:hAnsi="Times New Roman" w:cs="Times New Roman"/>
-          <w:sz w:val="21"/>
-          <w:szCs w:val="21"/>
-        </w:rPr>
-        <w:t>{{ defendants</w:t>
-      </w:r>
-      <w:proofErr w:type="gramEnd"/>
-      <w:r>
-        <w:rPr>
-          <w:rFonts w:ascii="Times New Roman" w:hAnsi="Times New Roman" w:cs="Times New Roman"/>
-          <w:sz w:val="21"/>
-          <w:szCs w:val="21"/>
-        </w:rPr>
-        <w:t>[0].</w:t>
+        <w:t>{{ defendants[0].</w:t>
       </w:r>
       <w:proofErr w:type="spellStart"/>
       <w:r>
@@ -1240,16 +788,7 @@
           <w:sz w:val="21"/>
           <w:szCs w:val="21"/>
         </w:rPr>
-        <w:t>name_</w:t>
-      </w:r>
-      <w:proofErr w:type="gramStart"/>
-      <w:r>
-        <w:rPr>
-          <w:rFonts w:ascii="Times New Roman" w:hAnsi="Times New Roman" w:cs="Times New Roman"/>
-          <w:sz w:val="21"/>
-          <w:szCs w:val="21"/>
-        </w:rPr>
-        <w:t>full</w:t>
+        <w:t>name_full</w:t>
       </w:r>
       <w:proofErr w:type="spellEnd"/>
       <w:r>
@@ -1258,16 +797,7 @@
           <w:sz w:val="21"/>
           <w:szCs w:val="21"/>
         </w:rPr>
-        <w:t>() }</w:t>
-      </w:r>
-      <w:proofErr w:type="gramEnd"/>
-      <w:r>
-        <w:rPr>
-          <w:rFonts w:ascii="Times New Roman" w:hAnsi="Times New Roman" w:cs="Times New Roman"/>
-          <w:sz w:val="21"/>
-          <w:szCs w:val="21"/>
-        </w:rPr>
-        <w:t>}</w:t>
+        <w:t>() }}</w:t>
       </w:r>
     </w:p>
     <w:p>
@@ -1370,32 +900,13 @@
           <w:szCs w:val="21"/>
         </w:rPr>
       </w:pPr>
-      <w:proofErr w:type="gramStart"/>
-      <w:r>
-        <w:rPr>
-          <w:rFonts w:ascii="Times New Roman" w:hAnsi="Times New Roman" w:cs="Times New Roman"/>
-          <w:sz w:val="21"/>
-          <w:szCs w:val="21"/>
-        </w:rPr>
-        <w:t>{{ defendants</w:t>
-      </w:r>
-      <w:proofErr w:type="gramEnd"/>
-      <w:r>
-        <w:rPr>
-          <w:rFonts w:ascii="Times New Roman" w:hAnsi="Times New Roman" w:cs="Times New Roman"/>
-          <w:sz w:val="21"/>
-          <w:szCs w:val="21"/>
-        </w:rPr>
-        <w:t>[0</w:t>
-      </w:r>
-      <w:proofErr w:type="gramStart"/>
-      <w:r>
-        <w:rPr>
-          <w:rFonts w:ascii="Times New Roman" w:hAnsi="Times New Roman" w:cs="Times New Roman"/>
-          <w:sz w:val="21"/>
-          <w:szCs w:val="21"/>
-        </w:rPr>
-        <w:t>].</w:t>
+      <w:r>
+        <w:rPr>
+          <w:rFonts w:ascii="Times New Roman" w:hAnsi="Times New Roman" w:cs="Times New Roman"/>
+          <w:sz w:val="21"/>
+          <w:szCs w:val="21"/>
+        </w:rPr>
+        <w:t>{{ defendants[0].</w:t>
       </w:r>
       <w:proofErr w:type="spellStart"/>
       <w:r>
@@ -1404,25 +915,7 @@
           <w:sz w:val="21"/>
           <w:szCs w:val="21"/>
         </w:rPr>
-        <w:t>address</w:t>
-      </w:r>
-      <w:proofErr w:type="gramEnd"/>
-      <w:r>
-        <w:rPr>
-          <w:rFonts w:ascii="Times New Roman" w:hAnsi="Times New Roman" w:cs="Times New Roman"/>
-          <w:sz w:val="21"/>
-          <w:szCs w:val="21"/>
-        </w:rPr>
-        <w:t>.line_</w:t>
-      </w:r>
-      <w:proofErr w:type="gramStart"/>
-      <w:r>
-        <w:rPr>
-          <w:rFonts w:ascii="Times New Roman" w:hAnsi="Times New Roman" w:cs="Times New Roman"/>
-          <w:sz w:val="21"/>
-          <w:szCs w:val="21"/>
-        </w:rPr>
-        <w:t>one</w:t>
+        <w:t>address.line_one</w:t>
       </w:r>
       <w:proofErr w:type="spellEnd"/>
       <w:r>
@@ -1431,16 +924,7 @@
           <w:sz w:val="21"/>
           <w:szCs w:val="21"/>
         </w:rPr>
-        <w:t>() }</w:t>
-      </w:r>
-      <w:proofErr w:type="gramEnd"/>
-      <w:r>
-        <w:rPr>
-          <w:rFonts w:ascii="Times New Roman" w:hAnsi="Times New Roman" w:cs="Times New Roman"/>
-          <w:sz w:val="21"/>
-          <w:szCs w:val="21"/>
-        </w:rPr>
-        <w:t>}</w:t>
+        <w:t>() }}</w:t>
       </w:r>
     </w:p>
     <w:p>
@@ -1453,32 +937,13 @@
           <w:szCs w:val="21"/>
         </w:rPr>
       </w:pPr>
-      <w:proofErr w:type="gramStart"/>
-      <w:r>
-        <w:rPr>
-          <w:rFonts w:ascii="Times New Roman" w:hAnsi="Times New Roman" w:cs="Times New Roman"/>
-          <w:sz w:val="21"/>
-          <w:szCs w:val="21"/>
-        </w:rPr>
-        <w:t>{{ defendants</w:t>
-      </w:r>
-      <w:proofErr w:type="gramEnd"/>
-      <w:r>
-        <w:rPr>
-          <w:rFonts w:ascii="Times New Roman" w:hAnsi="Times New Roman" w:cs="Times New Roman"/>
-          <w:sz w:val="21"/>
-          <w:szCs w:val="21"/>
-        </w:rPr>
-        <w:t>[0</w:t>
-      </w:r>
-      <w:proofErr w:type="gramStart"/>
-      <w:r>
-        <w:rPr>
-          <w:rFonts w:ascii="Times New Roman" w:hAnsi="Times New Roman" w:cs="Times New Roman"/>
-          <w:sz w:val="21"/>
-          <w:szCs w:val="21"/>
-        </w:rPr>
-        <w:t>].</w:t>
+      <w:r>
+        <w:rPr>
+          <w:rFonts w:ascii="Times New Roman" w:hAnsi="Times New Roman" w:cs="Times New Roman"/>
+          <w:sz w:val="21"/>
+          <w:szCs w:val="21"/>
+        </w:rPr>
+        <w:t>{{ defendants[0].</w:t>
       </w:r>
       <w:proofErr w:type="spellStart"/>
       <w:r>
@@ -1487,25 +952,7 @@
           <w:sz w:val="21"/>
           <w:szCs w:val="21"/>
         </w:rPr>
-        <w:t>address</w:t>
-      </w:r>
-      <w:proofErr w:type="gramEnd"/>
-      <w:r>
-        <w:rPr>
-          <w:rFonts w:ascii="Times New Roman" w:hAnsi="Times New Roman" w:cs="Times New Roman"/>
-          <w:sz w:val="21"/>
-          <w:szCs w:val="21"/>
-        </w:rPr>
-        <w:t>.line_</w:t>
-      </w:r>
-      <w:proofErr w:type="gramStart"/>
-      <w:r>
-        <w:rPr>
-          <w:rFonts w:ascii="Times New Roman" w:hAnsi="Times New Roman" w:cs="Times New Roman"/>
-          <w:sz w:val="21"/>
-          <w:szCs w:val="21"/>
-        </w:rPr>
-        <w:t>two</w:t>
+        <w:t>address.line_two</w:t>
       </w:r>
       <w:proofErr w:type="spellEnd"/>
       <w:r>
@@ -1514,16 +961,7 @@
           <w:sz w:val="21"/>
           <w:szCs w:val="21"/>
         </w:rPr>
-        <w:t>() }</w:t>
-      </w:r>
-      <w:proofErr w:type="gramEnd"/>
-      <w:r>
-        <w:rPr>
-          <w:rFonts w:ascii="Times New Roman" w:hAnsi="Times New Roman" w:cs="Times New Roman"/>
-          <w:sz w:val="21"/>
-          <w:szCs w:val="21"/>
-        </w:rPr>
-        <w:t>}</w:t>
+        <w:t>() }}</w:t>
       </w:r>
     </w:p>
     <w:p>
@@ -1550,23 +988,13 @@
         </w:rPr>
         <w:t xml:space="preserve">{% if </w:t>
       </w:r>
-      <w:proofErr w:type="gramStart"/>
-      <w:r>
-        <w:rPr>
-          <w:rFonts w:ascii="Times New Roman" w:hAnsi="Times New Roman" w:cs="Times New Roman"/>
-          <w:sz w:val="21"/>
-          <w:szCs w:val="21"/>
-        </w:rPr>
-        <w:t>defendants[</w:t>
-      </w:r>
-      <w:proofErr w:type="gramEnd"/>
-      <w:r>
-        <w:rPr>
-          <w:rFonts w:ascii="Times New Roman" w:hAnsi="Times New Roman" w:cs="Times New Roman"/>
-          <w:sz w:val="21"/>
-          <w:szCs w:val="21"/>
-        </w:rPr>
-        <w:t>0].</w:t>
+      <w:r>
+        <w:rPr>
+          <w:rFonts w:ascii="Times New Roman" w:hAnsi="Times New Roman" w:cs="Times New Roman"/>
+          <w:sz w:val="21"/>
+          <w:szCs w:val="21"/>
+        </w:rPr>
+        <w:t>defendants[0].</w:t>
       </w:r>
       <w:proofErr w:type="spellStart"/>
       <w:r>
@@ -1584,33 +1012,15 @@
           <w:sz w:val="21"/>
           <w:szCs w:val="21"/>
         </w:rPr>
-        <w:t xml:space="preserve"> </w:t>
-      </w:r>
-      <w:proofErr w:type="gramStart"/>
-      <w:r>
-        <w:rPr>
-          <w:rFonts w:ascii="Times New Roman" w:hAnsi="Times New Roman" w:cs="Times New Roman"/>
-          <w:sz w:val="21"/>
-          <w:szCs w:val="21"/>
-        </w:rPr>
-        <w:t>%}</w:t>
-      </w:r>
-      <w:r>
-        <w:rPr>
-          <w:rFonts w:ascii="Times New Roman" w:hAnsi="Times New Roman" w:cs="Times New Roman"/>
-          <w:sz w:val="21"/>
-          <w:szCs w:val="21"/>
-        </w:rPr>
-        <w:t>{</w:t>
-      </w:r>
-      <w:proofErr w:type="gramEnd"/>
-      <w:r>
-        <w:rPr>
-          <w:rFonts w:ascii="Times New Roman" w:hAnsi="Times New Roman" w:cs="Times New Roman"/>
-          <w:sz w:val="21"/>
-          <w:szCs w:val="21"/>
-        </w:rPr>
-        <w:t xml:space="preserve">% if </w:t>
+        <w:t xml:space="preserve"> %}</w:t>
+      </w:r>
+      <w:r>
+        <w:rPr>
+          <w:rFonts w:ascii="Times New Roman" w:hAnsi="Times New Roman" w:cs="Times New Roman"/>
+          <w:sz w:val="21"/>
+          <w:szCs w:val="21"/>
+        </w:rPr>
+        <w:t xml:space="preserve">{% if </w:t>
       </w:r>
       <w:proofErr w:type="spellStart"/>
       <w:r>
@@ -1628,106 +1038,7 @@
           <w:sz w:val="21"/>
           <w:szCs w:val="21"/>
         </w:rPr>
-        <w:t xml:space="preserve"> == “defendant” </w:t>
-      </w:r>
-      <w:proofErr w:type="gramStart"/>
-      <w:r>
-        <w:rPr>
-          <w:rFonts w:ascii="Times New Roman" w:hAnsi="Times New Roman" w:cs="Times New Roman"/>
-          <w:sz w:val="21"/>
-          <w:szCs w:val="21"/>
-        </w:rPr>
-        <w:t>%}Does</w:t>
-      </w:r>
-      <w:proofErr w:type="gramEnd"/>
-      <w:r>
-        <w:rPr>
-          <w:rFonts w:ascii="Times New Roman" w:hAnsi="Times New Roman" w:cs="Times New Roman"/>
-          <w:sz w:val="21"/>
-          <w:szCs w:val="21"/>
-        </w:rPr>
-        <w:t xml:space="preserve"> not have </w:t>
-      </w:r>
-      <w:proofErr w:type="gramStart"/>
-      <w:r>
-        <w:rPr>
-          <w:rFonts w:ascii="Times New Roman" w:hAnsi="Times New Roman" w:cs="Times New Roman"/>
-          <w:sz w:val="21"/>
-          <w:szCs w:val="21"/>
-        </w:rPr>
-        <w:t>phone{</w:t>
-      </w:r>
-      <w:proofErr w:type="gramEnd"/>
-      <w:r>
-        <w:rPr>
-          <w:rFonts w:ascii="Times New Roman" w:hAnsi="Times New Roman" w:cs="Times New Roman"/>
-          <w:sz w:val="21"/>
-          <w:szCs w:val="21"/>
-        </w:rPr>
-        <w:t xml:space="preserve">% else </w:t>
-      </w:r>
-      <w:proofErr w:type="gramStart"/>
-      <w:r>
-        <w:rPr>
-          <w:rFonts w:ascii="Times New Roman" w:hAnsi="Times New Roman" w:cs="Times New Roman"/>
-          <w:sz w:val="21"/>
-          <w:szCs w:val="21"/>
-        </w:rPr>
-        <w:t>%}Unknown</w:t>
-      </w:r>
-      <w:proofErr w:type="gramEnd"/>
-      <w:r>
-        <w:rPr>
-          <w:rFonts w:ascii="Times New Roman" w:hAnsi="Times New Roman" w:cs="Times New Roman"/>
-          <w:sz w:val="21"/>
-          <w:szCs w:val="21"/>
-        </w:rPr>
-        <w:t xml:space="preserve"> </w:t>
-      </w:r>
-      <w:proofErr w:type="gramStart"/>
-      <w:r>
-        <w:rPr>
-          <w:rFonts w:ascii="Times New Roman" w:hAnsi="Times New Roman" w:cs="Times New Roman"/>
-          <w:sz w:val="21"/>
-          <w:szCs w:val="21"/>
-        </w:rPr>
-        <w:t>phone{</w:t>
-      </w:r>
-      <w:proofErr w:type="gramEnd"/>
-      <w:r>
-        <w:rPr>
-          <w:rFonts w:ascii="Times New Roman" w:hAnsi="Times New Roman" w:cs="Times New Roman"/>
-          <w:sz w:val="21"/>
-          <w:szCs w:val="21"/>
-        </w:rPr>
-        <w:t xml:space="preserve">% endif </w:t>
-      </w:r>
-      <w:proofErr w:type="gramStart"/>
-      <w:r>
-        <w:rPr>
-          <w:rFonts w:ascii="Times New Roman" w:hAnsi="Times New Roman" w:cs="Times New Roman"/>
-          <w:sz w:val="21"/>
-          <w:szCs w:val="21"/>
-        </w:rPr>
-        <w:t>%}{</w:t>
-      </w:r>
-      <w:proofErr w:type="gramEnd"/>
-      <w:r>
-        <w:rPr>
-          <w:rFonts w:ascii="Times New Roman" w:hAnsi="Times New Roman" w:cs="Times New Roman"/>
-          <w:sz w:val="21"/>
-          <w:szCs w:val="21"/>
-        </w:rPr>
-        <w:t xml:space="preserve">% else </w:t>
-      </w:r>
-      <w:proofErr w:type="gramStart"/>
-      <w:r>
-        <w:rPr>
-          <w:rFonts w:ascii="Times New Roman" w:hAnsi="Times New Roman" w:cs="Times New Roman"/>
-          <w:sz w:val="21"/>
-          <w:szCs w:val="21"/>
-        </w:rPr>
-        <w:t>%}</w:t>
+        <w:t xml:space="preserve"> == “defendant” %}Does not have phone{% else %}Unknown phone{% endif %}{% else %}</w:t>
       </w:r>
       <w:r>
         <w:rPr>
@@ -1744,16 +1055,7 @@
           <w:sz w:val="21"/>
           <w:szCs w:val="21"/>
         </w:rPr>
-        <w:t>phone</w:t>
-      </w:r>
-      <w:proofErr w:type="gramEnd"/>
-      <w:r>
-        <w:rPr>
-          <w:rFonts w:ascii="Times New Roman" w:hAnsi="Times New Roman" w:cs="Times New Roman"/>
-          <w:sz w:val="21"/>
-          <w:szCs w:val="21"/>
-        </w:rPr>
-        <w:t>_number_formatted</w:t>
+        <w:t>phone_number_formatted</w:t>
       </w:r>
       <w:proofErr w:type="spellEnd"/>
       <w:r>
@@ -1778,16 +1080,7 @@
           <w:sz w:val="21"/>
           <w:szCs w:val="21"/>
         </w:rPr>
-        <w:t>[0</w:t>
-      </w:r>
-      <w:proofErr w:type="gramStart"/>
-      <w:r>
-        <w:rPr>
-          <w:rFonts w:ascii="Times New Roman" w:hAnsi="Times New Roman" w:cs="Times New Roman"/>
-          <w:sz w:val="21"/>
-          <w:szCs w:val="21"/>
-        </w:rPr>
-        <w:t>].</w:t>
+        <w:t>[0].</w:t>
       </w:r>
       <w:proofErr w:type="spellStart"/>
       <w:r>
@@ -1796,35 +1089,16 @@
           <w:sz w:val="21"/>
           <w:szCs w:val="21"/>
         </w:rPr>
-        <w:t>phone</w:t>
-      </w:r>
-      <w:proofErr w:type="gramEnd"/>
-      <w:r>
-        <w:rPr>
-          <w:rFonts w:ascii="Times New Roman" w:hAnsi="Times New Roman" w:cs="Times New Roman"/>
-          <w:sz w:val="21"/>
-          <w:szCs w:val="21"/>
-        </w:rPr>
-        <w:t>_number</w:t>
+        <w:t>phone_number</w:t>
       </w:r>
       <w:proofErr w:type="spellEnd"/>
-      <w:proofErr w:type="gramStart"/>
-      <w:r>
-        <w:rPr>
-          <w:rFonts w:ascii="Times New Roman" w:hAnsi="Times New Roman" w:cs="Times New Roman"/>
-          <w:sz w:val="21"/>
-          <w:szCs w:val="21"/>
-        </w:rPr>
-        <w:t>) }}{</w:t>
-      </w:r>
-      <w:proofErr w:type="gramEnd"/>
-      <w:r>
-        <w:rPr>
-          <w:rFonts w:ascii="Times New Roman" w:hAnsi="Times New Roman" w:cs="Times New Roman"/>
-          <w:sz w:val="21"/>
-          <w:szCs w:val="21"/>
-        </w:rPr>
-        <w:t>% endif %}</w:t>
+      <w:r>
+        <w:rPr>
+          <w:rFonts w:ascii="Times New Roman" w:hAnsi="Times New Roman" w:cs="Times New Roman"/>
+          <w:sz w:val="21"/>
+          <w:szCs w:val="21"/>
+        </w:rPr>
+        <w:t>) }}{% endif %}</w:t>
       </w:r>
     </w:p>
     <w:p>
@@ -1953,7 +1227,199 @@
           <w:sz w:val="22"/>
           <w:szCs w:val="22"/>
         </w:rPr>
-        <w:t>Motion for Entry of Consent Judgment of Divorce</w:t>
+        <w:t xml:space="preserve">Motion for Entry of Consent </w:t>
+      </w:r>
+      <w:r>
+        <w:rPr>
+          <w:rFonts w:ascii="Times New Roman" w:hAnsi="Times New Roman" w:cs="Times New Roman"/>
+          <w:b/>
+          <w:bCs/>
+          <w:sz w:val="22"/>
+          <w:szCs w:val="22"/>
+        </w:rPr>
+        <w:t xml:space="preserve">{% if </w:t>
+      </w:r>
+      <w:proofErr w:type="spellStart"/>
+      <w:r>
+        <w:rPr>
+          <w:rFonts w:ascii="Times New Roman" w:hAnsi="Times New Roman" w:cs="Times New Roman"/>
+          <w:b/>
+          <w:bCs/>
+          <w:sz w:val="22"/>
+          <w:szCs w:val="22"/>
+        </w:rPr>
+        <w:t>tool_ID</w:t>
+      </w:r>
+      <w:proofErr w:type="spellEnd"/>
+      <w:r>
+        <w:rPr>
+          <w:rFonts w:ascii="Times New Roman" w:hAnsi="Times New Roman" w:cs="Times New Roman"/>
+          <w:b/>
+          <w:bCs/>
+          <w:sz w:val="22"/>
+          <w:szCs w:val="22"/>
+        </w:rPr>
+        <w:t xml:space="preserve"> in [“</w:t>
+      </w:r>
+      <w:proofErr w:type="spellStart"/>
+      <w:r>
+        <w:rPr>
+          <w:rFonts w:ascii="Times New Roman" w:hAnsi="Times New Roman" w:cs="Times New Roman"/>
+          <w:b/>
+          <w:bCs/>
+          <w:sz w:val="22"/>
+          <w:szCs w:val="22"/>
+        </w:rPr>
+        <w:t>divorce_complaint</w:t>
+      </w:r>
+      <w:proofErr w:type="spellEnd"/>
+      <w:r>
+        <w:rPr>
+          <w:rFonts w:ascii="Times New Roman" w:hAnsi="Times New Roman" w:cs="Times New Roman"/>
+          <w:b/>
+          <w:bCs/>
+          <w:sz w:val="22"/>
+          <w:szCs w:val="22"/>
+        </w:rPr>
+        <w:t>”, “</w:t>
+      </w:r>
+      <w:proofErr w:type="spellStart"/>
+      <w:r>
+        <w:rPr>
+          <w:rFonts w:ascii="Times New Roman" w:hAnsi="Times New Roman" w:cs="Times New Roman"/>
+          <w:b/>
+          <w:bCs/>
+          <w:sz w:val="22"/>
+          <w:szCs w:val="22"/>
+        </w:rPr>
+        <w:t>JOD_only</w:t>
+      </w:r>
+      <w:proofErr w:type="spellEnd"/>
+      <w:r>
+        <w:rPr>
+          <w:rFonts w:ascii="Times New Roman" w:hAnsi="Times New Roman" w:cs="Times New Roman"/>
+          <w:b/>
+          <w:bCs/>
+          <w:sz w:val="22"/>
+          <w:szCs w:val="22"/>
+        </w:rPr>
+        <w:t>”] %}</w:t>
+      </w:r>
+      <w:r>
+        <w:rPr>
+          <w:rFonts w:ascii="Times New Roman" w:hAnsi="Times New Roman" w:cs="Times New Roman"/>
+          <w:b/>
+          <w:bCs/>
+          <w:sz w:val="22"/>
+          <w:szCs w:val="22"/>
+        </w:rPr>
+        <w:t>Judgment of Divorce</w:t>
+      </w:r>
+      <w:r>
+        <w:rPr>
+          <w:rFonts w:ascii="Times New Roman" w:hAnsi="Times New Roman" w:cs="Times New Roman"/>
+          <w:b/>
+          <w:bCs/>
+          <w:sz w:val="22"/>
+          <w:szCs w:val="22"/>
+        </w:rPr>
+        <w:t xml:space="preserve">{% </w:t>
+      </w:r>
+      <w:proofErr w:type="spellStart"/>
+      <w:r>
+        <w:rPr>
+          <w:rFonts w:ascii="Times New Roman" w:hAnsi="Times New Roman" w:cs="Times New Roman"/>
+          <w:b/>
+          <w:bCs/>
+          <w:sz w:val="22"/>
+          <w:szCs w:val="22"/>
+        </w:rPr>
+        <w:t>elif</w:t>
+      </w:r>
+      <w:proofErr w:type="spellEnd"/>
+      <w:r>
+        <w:rPr>
+          <w:rFonts w:ascii="Times New Roman" w:hAnsi="Times New Roman" w:cs="Times New Roman"/>
+          <w:b/>
+          <w:bCs/>
+          <w:sz w:val="22"/>
+          <w:szCs w:val="22"/>
+        </w:rPr>
+        <w:t xml:space="preserve"> </w:t>
+      </w:r>
+      <w:proofErr w:type="spellStart"/>
+      <w:r>
+        <w:rPr>
+          <w:rFonts w:ascii="Times New Roman" w:hAnsi="Times New Roman" w:cs="Times New Roman"/>
+          <w:b/>
+          <w:bCs/>
+          <w:sz w:val="22"/>
+          <w:szCs w:val="22"/>
+        </w:rPr>
+        <w:t>tool_ID</w:t>
+      </w:r>
+      <w:proofErr w:type="spellEnd"/>
+      <w:r>
+        <w:rPr>
+          <w:rFonts w:ascii="Times New Roman" w:hAnsi="Times New Roman" w:cs="Times New Roman"/>
+          <w:b/>
+          <w:bCs/>
+          <w:sz w:val="22"/>
+          <w:szCs w:val="22"/>
+        </w:rPr>
+        <w:t xml:space="preserve"> == “</w:t>
+      </w:r>
+      <w:proofErr w:type="spellStart"/>
+      <w:r>
+        <w:rPr>
+          <w:rFonts w:ascii="Times New Roman" w:hAnsi="Times New Roman" w:cs="Times New Roman"/>
+          <w:b/>
+          <w:bCs/>
+          <w:sz w:val="22"/>
+          <w:szCs w:val="22"/>
+        </w:rPr>
+        <w:t>custody_complaint</w:t>
+      </w:r>
+      <w:proofErr w:type="spellEnd"/>
+      <w:r>
+        <w:rPr>
+          <w:rFonts w:ascii="Times New Roman" w:hAnsi="Times New Roman" w:cs="Times New Roman"/>
+          <w:b/>
+          <w:bCs/>
+          <w:sz w:val="22"/>
+          <w:szCs w:val="22"/>
+        </w:rPr>
+        <w:t>” %}Order Regarding</w:t>
+      </w:r>
+      <w:r>
+        <w:rPr>
+          <w:rFonts w:ascii="Times New Roman" w:hAnsi="Times New Roman" w:cs="Times New Roman"/>
+          <w:b/>
+          <w:bCs/>
+          <w:sz w:val="22"/>
+          <w:szCs w:val="22"/>
+        </w:rPr>
+        <w:t xml:space="preserve"> </w:t>
+      </w:r>
+      <w:r>
+        <w:rPr>
+          <w:rFonts w:ascii="Times New Roman" w:hAnsi="Times New Roman" w:cs="Times New Roman"/>
+          <w:b/>
+          <w:bCs/>
+          <w:sz w:val="22"/>
+          <w:szCs w:val="22"/>
+        </w:rPr>
+        <w:t>Custody, Parenting Time, and Child Support</w:t>
+      </w:r>
+      <w:r>
+        <w:rPr>
+          <w:rFonts w:ascii="Times New Roman" w:hAnsi="Times New Roman" w:cs="Times New Roman"/>
+          <w:b/>
+          <w:bCs/>
+          <w:sz w:val="22"/>
+          <w:szCs w:val="22"/>
+        </w:rPr>
+        <w:t>{% endif %}</w:t>
       </w:r>
     </w:p>
     <w:p>
@@ -2006,9 +1472,16 @@
           <w:szCs w:val="22"/>
           <w:highlight w:val="yellow"/>
         </w:rPr>
-        <w:t xml:space="preserve"> == “plaintiff” </w:t>
-      </w:r>
-      <w:proofErr w:type="gramStart"/>
+        <w:t xml:space="preserve"> == “plaintiff” %}</w:t>
+      </w:r>
+      <w:r>
+        <w:rPr>
+          <w:rFonts w:ascii="Times New Roman" w:hAnsi="Times New Roman" w:cs="Times New Roman"/>
+          <w:sz w:val="22"/>
+          <w:szCs w:val="22"/>
+        </w:rPr>
+        <w:t>Plaintiff</w:t>
+      </w:r>
       <w:r>
         <w:rPr>
           <w:rFonts w:ascii="Times New Roman" w:hAnsi="Times New Roman" w:cs="Times New Roman"/>
@@ -2016,35 +1489,7 @@
           <w:szCs w:val="22"/>
           <w:highlight w:val="yellow"/>
         </w:rPr>
-        <w:t>%}</w:t>
-      </w:r>
-      <w:r>
-        <w:rPr>
-          <w:rFonts w:ascii="Times New Roman" w:hAnsi="Times New Roman" w:cs="Times New Roman"/>
-          <w:sz w:val="22"/>
-          <w:szCs w:val="22"/>
-        </w:rPr>
-        <w:t>Plaintiff</w:t>
-      </w:r>
-      <w:proofErr w:type="gramEnd"/>
-      <w:r>
-        <w:rPr>
-          <w:rFonts w:ascii="Times New Roman" w:hAnsi="Times New Roman" w:cs="Times New Roman"/>
-          <w:sz w:val="22"/>
-          <w:szCs w:val="22"/>
-          <w:highlight w:val="yellow"/>
-        </w:rPr>
-        <w:t xml:space="preserve">{% else </w:t>
-      </w:r>
-      <w:proofErr w:type="gramStart"/>
-      <w:r>
-        <w:rPr>
-          <w:rFonts w:ascii="Times New Roman" w:hAnsi="Times New Roman" w:cs="Times New Roman"/>
-          <w:sz w:val="22"/>
-          <w:szCs w:val="22"/>
-          <w:highlight w:val="yellow"/>
-        </w:rPr>
-        <w:t>%}</w:t>
+        <w:t>{% else %}</w:t>
       </w:r>
       <w:r>
         <w:rPr>
@@ -2054,7 +1499,6 @@
         </w:rPr>
         <w:t>Defendant</w:t>
       </w:r>
-      <w:proofErr w:type="gramEnd"/>
       <w:r>
         <w:rPr>
           <w:rFonts w:ascii="Times New Roman" w:hAnsi="Times New Roman" w:cs="Times New Roman"/>
@@ -2223,25 +1667,335 @@
           <w:sz w:val="22"/>
           <w:szCs w:val="22"/>
         </w:rPr>
-        <w:t xml:space="preserve">request entry of a Consent Judgment of Divorce. The parties agree on </w:t>
-      </w:r>
-      <w:proofErr w:type="gramStart"/>
-      <w:r>
-        <w:rPr>
-          <w:rFonts w:ascii="Times New Roman" w:hAnsi="Times New Roman" w:cs="Times New Roman"/>
-          <w:sz w:val="22"/>
-          <w:szCs w:val="22"/>
-        </w:rPr>
-        <w:t>all of</w:t>
-      </w:r>
-      <w:proofErr w:type="gramEnd"/>
-      <w:r>
-        <w:rPr>
-          <w:rFonts w:ascii="Times New Roman" w:hAnsi="Times New Roman" w:cs="Times New Roman"/>
-          <w:sz w:val="22"/>
-          <w:szCs w:val="22"/>
-        </w:rPr>
-        <w:t xml:space="preserve"> the terms of the Judgment of Divorce and have signed a proposed Judgment of Divorce to indicate our agreement.</w:t>
+        <w:t xml:space="preserve">request entry of </w:t>
+      </w:r>
+      <w:r>
+        <w:rPr>
+          <w:rFonts w:ascii="Times New Roman" w:hAnsi="Times New Roman" w:cs="Times New Roman"/>
+          <w:sz w:val="22"/>
+          <w:szCs w:val="22"/>
+        </w:rPr>
+        <w:t xml:space="preserve">{% if </w:t>
+      </w:r>
+      <w:proofErr w:type="spellStart"/>
+      <w:r>
+        <w:rPr>
+          <w:rFonts w:ascii="Times New Roman" w:hAnsi="Times New Roman" w:cs="Times New Roman"/>
+          <w:sz w:val="22"/>
+          <w:szCs w:val="22"/>
+        </w:rPr>
+        <w:t>tool_ID</w:t>
+      </w:r>
+      <w:proofErr w:type="spellEnd"/>
+      <w:r>
+        <w:rPr>
+          <w:rFonts w:ascii="Times New Roman" w:hAnsi="Times New Roman" w:cs="Times New Roman"/>
+          <w:sz w:val="22"/>
+          <w:szCs w:val="22"/>
+        </w:rPr>
+        <w:t xml:space="preserve"> in [“</w:t>
+      </w:r>
+      <w:proofErr w:type="spellStart"/>
+      <w:r>
+        <w:rPr>
+          <w:rFonts w:ascii="Times New Roman" w:hAnsi="Times New Roman" w:cs="Times New Roman"/>
+          <w:sz w:val="22"/>
+          <w:szCs w:val="22"/>
+        </w:rPr>
+        <w:t>divorce_complaint</w:t>
+      </w:r>
+      <w:proofErr w:type="spellEnd"/>
+      <w:r>
+        <w:rPr>
+          <w:rFonts w:ascii="Times New Roman" w:hAnsi="Times New Roman" w:cs="Times New Roman"/>
+          <w:sz w:val="22"/>
+          <w:szCs w:val="22"/>
+        </w:rPr>
+        <w:t>”, “</w:t>
+      </w:r>
+      <w:proofErr w:type="spellStart"/>
+      <w:r>
+        <w:rPr>
+          <w:rFonts w:ascii="Times New Roman" w:hAnsi="Times New Roman" w:cs="Times New Roman"/>
+          <w:sz w:val="22"/>
+          <w:szCs w:val="22"/>
+        </w:rPr>
+        <w:t>JOD_only</w:t>
+      </w:r>
+      <w:proofErr w:type="spellEnd"/>
+      <w:r>
+        <w:rPr>
+          <w:rFonts w:ascii="Times New Roman" w:hAnsi="Times New Roman" w:cs="Times New Roman"/>
+          <w:sz w:val="22"/>
+          <w:szCs w:val="22"/>
+        </w:rPr>
+        <w:t>”] %}</w:t>
+      </w:r>
+      <w:r>
+        <w:rPr>
+          <w:rFonts w:ascii="Times New Roman" w:hAnsi="Times New Roman" w:cs="Times New Roman"/>
+          <w:sz w:val="22"/>
+          <w:szCs w:val="22"/>
+        </w:rPr>
+        <w:t xml:space="preserve">a consent </w:t>
+      </w:r>
+      <w:r>
+        <w:rPr>
+          <w:rFonts w:ascii="Times New Roman" w:hAnsi="Times New Roman" w:cs="Times New Roman"/>
+          <w:sz w:val="22"/>
+          <w:szCs w:val="22"/>
+        </w:rPr>
+        <w:t xml:space="preserve">Judgment of Divorce{% </w:t>
+      </w:r>
+      <w:proofErr w:type="spellStart"/>
+      <w:r>
+        <w:rPr>
+          <w:rFonts w:ascii="Times New Roman" w:hAnsi="Times New Roman" w:cs="Times New Roman"/>
+          <w:sz w:val="22"/>
+          <w:szCs w:val="22"/>
+        </w:rPr>
+        <w:t>elif</w:t>
+      </w:r>
+      <w:proofErr w:type="spellEnd"/>
+      <w:r>
+        <w:rPr>
+          <w:rFonts w:ascii="Times New Roman" w:hAnsi="Times New Roman" w:cs="Times New Roman"/>
+          <w:sz w:val="22"/>
+          <w:szCs w:val="22"/>
+        </w:rPr>
+        <w:t xml:space="preserve"> </w:t>
+      </w:r>
+      <w:proofErr w:type="spellStart"/>
+      <w:r>
+        <w:rPr>
+          <w:rFonts w:ascii="Times New Roman" w:hAnsi="Times New Roman" w:cs="Times New Roman"/>
+          <w:sz w:val="22"/>
+          <w:szCs w:val="22"/>
+        </w:rPr>
+        <w:t>tool_ID</w:t>
+      </w:r>
+      <w:proofErr w:type="spellEnd"/>
+      <w:r>
+        <w:rPr>
+          <w:rFonts w:ascii="Times New Roman" w:hAnsi="Times New Roman" w:cs="Times New Roman"/>
+          <w:sz w:val="22"/>
+          <w:szCs w:val="22"/>
+        </w:rPr>
+        <w:t xml:space="preserve"> == “</w:t>
+      </w:r>
+      <w:proofErr w:type="spellStart"/>
+      <w:r>
+        <w:rPr>
+          <w:rFonts w:ascii="Times New Roman" w:hAnsi="Times New Roman" w:cs="Times New Roman"/>
+          <w:sz w:val="22"/>
+          <w:szCs w:val="22"/>
+        </w:rPr>
+        <w:t>custody_complaint</w:t>
+      </w:r>
+      <w:proofErr w:type="spellEnd"/>
+      <w:r>
+        <w:rPr>
+          <w:rFonts w:ascii="Times New Roman" w:hAnsi="Times New Roman" w:cs="Times New Roman"/>
+          <w:sz w:val="22"/>
+          <w:szCs w:val="22"/>
+        </w:rPr>
+        <w:t>” %}</w:t>
+      </w:r>
+      <w:r>
+        <w:rPr>
+          <w:rFonts w:ascii="Times New Roman" w:hAnsi="Times New Roman" w:cs="Times New Roman"/>
+          <w:sz w:val="22"/>
+          <w:szCs w:val="22"/>
+        </w:rPr>
+        <w:t xml:space="preserve">an </w:t>
+      </w:r>
+      <w:r>
+        <w:rPr>
+          <w:rFonts w:ascii="Times New Roman" w:hAnsi="Times New Roman" w:cs="Times New Roman"/>
+          <w:sz w:val="22"/>
+          <w:szCs w:val="22"/>
+        </w:rPr>
+        <w:t>Order Regarding Custody, Parenting Time, and Child Support{% endif %}</w:t>
+      </w:r>
+      <w:r>
+        <w:rPr>
+          <w:rFonts w:ascii="Times New Roman" w:hAnsi="Times New Roman" w:cs="Times New Roman"/>
+          <w:sz w:val="22"/>
+          <w:szCs w:val="22"/>
+        </w:rPr>
+        <w:t xml:space="preserve">. </w:t>
+      </w:r>
+      <w:r>
+        <w:rPr>
+          <w:rFonts w:ascii="Times New Roman" w:hAnsi="Times New Roman" w:cs="Times New Roman"/>
+          <w:sz w:val="22"/>
+          <w:szCs w:val="22"/>
+        </w:rPr>
+        <w:t xml:space="preserve">{% if </w:t>
+      </w:r>
+      <w:proofErr w:type="spellStart"/>
+      <w:r>
+        <w:rPr>
+          <w:rFonts w:ascii="Times New Roman" w:hAnsi="Times New Roman" w:cs="Times New Roman"/>
+          <w:sz w:val="22"/>
+          <w:szCs w:val="22"/>
+        </w:rPr>
+        <w:t>tool_ID</w:t>
+      </w:r>
+      <w:proofErr w:type="spellEnd"/>
+      <w:r>
+        <w:rPr>
+          <w:rFonts w:ascii="Times New Roman" w:hAnsi="Times New Roman" w:cs="Times New Roman"/>
+          <w:sz w:val="22"/>
+          <w:szCs w:val="22"/>
+        </w:rPr>
+        <w:t xml:space="preserve"> in [“</w:t>
+      </w:r>
+      <w:proofErr w:type="spellStart"/>
+      <w:r>
+        <w:rPr>
+          <w:rFonts w:ascii="Times New Roman" w:hAnsi="Times New Roman" w:cs="Times New Roman"/>
+          <w:sz w:val="22"/>
+          <w:szCs w:val="22"/>
+        </w:rPr>
+        <w:t>divorce_complaint</w:t>
+      </w:r>
+      <w:proofErr w:type="spellEnd"/>
+      <w:r>
+        <w:rPr>
+          <w:rFonts w:ascii="Times New Roman" w:hAnsi="Times New Roman" w:cs="Times New Roman"/>
+          <w:sz w:val="22"/>
+          <w:szCs w:val="22"/>
+        </w:rPr>
+        <w:t>”, “</w:t>
+      </w:r>
+      <w:proofErr w:type="spellStart"/>
+      <w:r>
+        <w:rPr>
+          <w:rFonts w:ascii="Times New Roman" w:hAnsi="Times New Roman" w:cs="Times New Roman"/>
+          <w:sz w:val="22"/>
+          <w:szCs w:val="22"/>
+        </w:rPr>
+        <w:t>JOD_only</w:t>
+      </w:r>
+      <w:proofErr w:type="spellEnd"/>
+      <w:r>
+        <w:rPr>
+          <w:rFonts w:ascii="Times New Roman" w:hAnsi="Times New Roman" w:cs="Times New Roman"/>
+          <w:sz w:val="22"/>
+          <w:szCs w:val="22"/>
+        </w:rPr>
+        <w:t>”] %}</w:t>
+      </w:r>
+      <w:r>
+        <w:rPr>
+          <w:rFonts w:ascii="Times New Roman" w:hAnsi="Times New Roman" w:cs="Times New Roman"/>
+          <w:sz w:val="22"/>
+          <w:szCs w:val="22"/>
+        </w:rPr>
+        <w:t>The parties agree on all of the terms of the Judgment of Divorce and have signed a proposed Judgment of Divorce to indicate our agreement.</w:t>
+      </w:r>
+      <w:r>
+        <w:rPr>
+          <w:rFonts w:ascii="Times New Roman" w:hAnsi="Times New Roman" w:cs="Times New Roman"/>
+          <w:sz w:val="22"/>
+          <w:szCs w:val="22"/>
+        </w:rPr>
+        <w:t xml:space="preserve">{% </w:t>
+      </w:r>
+      <w:proofErr w:type="spellStart"/>
+      <w:r>
+        <w:rPr>
+          <w:rFonts w:ascii="Times New Roman" w:hAnsi="Times New Roman" w:cs="Times New Roman"/>
+          <w:sz w:val="22"/>
+          <w:szCs w:val="22"/>
+        </w:rPr>
+        <w:t>elif</w:t>
+      </w:r>
+      <w:proofErr w:type="spellEnd"/>
+      <w:r>
+        <w:rPr>
+          <w:rFonts w:ascii="Times New Roman" w:hAnsi="Times New Roman" w:cs="Times New Roman"/>
+          <w:sz w:val="22"/>
+          <w:szCs w:val="22"/>
+        </w:rPr>
+        <w:t xml:space="preserve"> </w:t>
+      </w:r>
+      <w:proofErr w:type="spellStart"/>
+      <w:r>
+        <w:rPr>
+          <w:rFonts w:ascii="Times New Roman" w:hAnsi="Times New Roman" w:cs="Times New Roman"/>
+          <w:sz w:val="22"/>
+          <w:szCs w:val="22"/>
+        </w:rPr>
+        <w:t>tool_ID</w:t>
+      </w:r>
+      <w:proofErr w:type="spellEnd"/>
+      <w:r>
+        <w:rPr>
+          <w:rFonts w:ascii="Times New Roman" w:hAnsi="Times New Roman" w:cs="Times New Roman"/>
+          <w:sz w:val="22"/>
+          <w:szCs w:val="22"/>
+        </w:rPr>
+        <w:t xml:space="preserve"> == “</w:t>
+      </w:r>
+      <w:proofErr w:type="spellStart"/>
+      <w:r>
+        <w:rPr>
+          <w:rFonts w:ascii="Times New Roman" w:hAnsi="Times New Roman" w:cs="Times New Roman"/>
+          <w:sz w:val="22"/>
+          <w:szCs w:val="22"/>
+        </w:rPr>
+        <w:t>custody_complaint</w:t>
+      </w:r>
+      <w:proofErr w:type="spellEnd"/>
+      <w:r>
+        <w:rPr>
+          <w:rFonts w:ascii="Times New Roman" w:hAnsi="Times New Roman" w:cs="Times New Roman"/>
+          <w:sz w:val="22"/>
+          <w:szCs w:val="22"/>
+        </w:rPr>
+        <w:t>” %}The</w:t>
+      </w:r>
+      <w:r>
+        <w:rPr>
+          <w:rFonts w:ascii="Times New Roman" w:hAnsi="Times New Roman" w:cs="Times New Roman"/>
+          <w:sz w:val="22"/>
+          <w:szCs w:val="22"/>
+        </w:rPr>
+        <w:t xml:space="preserve"> </w:t>
+      </w:r>
+      <w:r>
+        <w:rPr>
+          <w:rFonts w:ascii="Times New Roman" w:hAnsi="Times New Roman" w:cs="Times New Roman"/>
+          <w:sz w:val="22"/>
+          <w:szCs w:val="22"/>
+        </w:rPr>
+        <w:t>parties agree on all of the terms of the order and have signed a proposed Order Regarding</w:t>
+      </w:r>
+      <w:r>
+        <w:rPr>
+          <w:rFonts w:ascii="Times New Roman" w:hAnsi="Times New Roman" w:cs="Times New Roman"/>
+          <w:sz w:val="22"/>
+          <w:szCs w:val="22"/>
+        </w:rPr>
+        <w:t xml:space="preserve"> </w:t>
+      </w:r>
+      <w:r>
+        <w:rPr>
+          <w:rFonts w:ascii="Times New Roman" w:hAnsi="Times New Roman" w:cs="Times New Roman"/>
+          <w:sz w:val="22"/>
+          <w:szCs w:val="22"/>
+        </w:rPr>
+        <w:t>Custody, Parenting Time, and Child Support to indicate our agreement.</w:t>
+      </w:r>
+      <w:r>
+        <w:rPr>
+          <w:rFonts w:ascii="Times New Roman" w:hAnsi="Times New Roman" w:cs="Times New Roman"/>
+          <w:sz w:val="22"/>
+          <w:szCs w:val="22"/>
+        </w:rPr>
+        <w:t>{% endif %}</w:t>
       </w:r>
     </w:p>
     <w:p>

</xml_diff>

<commit_message>
Revert "update divorce answer branch with custody complaint work"
</commit_message>
<xml_diff>
--- a/docassemble/MLHDivorceAndCustody/data/templates/noh_motion_consent.docx
+++ b/docassemble/MLHDivorceAndCustody/data/templates/noh_motion_consent.docx
@@ -37,7 +37,16 @@
           <w:sz w:val="22"/>
           <w:szCs w:val="22"/>
         </w:rPr>
-        <w:t xml:space="preserve">IN THE FAMILY DIVISION FOR THE  {{ </w:t>
+        <w:t xml:space="preserve">IN THE FAMILY DIVISION FOR </w:t>
+      </w:r>
+      <w:proofErr w:type="gramStart"/>
+      <w:r>
+        <w:rPr>
+          <w:rFonts w:ascii="Times New Roman" w:hAnsi="Times New Roman" w:cs="Times New Roman"/>
+          <w:sz w:val="22"/>
+          <w:szCs w:val="22"/>
+        </w:rPr>
+        <w:t xml:space="preserve">THE  {{ </w:t>
       </w:r>
       <w:proofErr w:type="spellStart"/>
       <w:r>
@@ -46,9 +55,28 @@
           <w:sz w:val="22"/>
           <w:szCs w:val="22"/>
         </w:rPr>
-        <w:t>the_court.number</w:t>
+        <w:t>the</w:t>
+      </w:r>
+      <w:proofErr w:type="gramEnd"/>
+      <w:r>
+        <w:rPr>
+          <w:rFonts w:ascii="Times New Roman" w:hAnsi="Times New Roman" w:cs="Times New Roman"/>
+          <w:sz w:val="22"/>
+          <w:szCs w:val="22"/>
+        </w:rPr>
+        <w:t>_</w:t>
+      </w:r>
+      <w:proofErr w:type="gramStart"/>
+      <w:r>
+        <w:rPr>
+          <w:rFonts w:ascii="Times New Roman" w:hAnsi="Times New Roman" w:cs="Times New Roman"/>
+          <w:sz w:val="22"/>
+          <w:szCs w:val="22"/>
+        </w:rPr>
+        <w:t>court.number</w:t>
       </w:r>
       <w:proofErr w:type="spellEnd"/>
+      <w:proofErr w:type="gramEnd"/>
       <w:r>
         <w:rPr>
           <w:rFonts w:ascii="Times New Roman" w:hAnsi="Times New Roman" w:cs="Times New Roman"/>
@@ -74,7 +102,16 @@
           <w:sz w:val="22"/>
           <w:szCs w:val="22"/>
         </w:rPr>
-        <w:t xml:space="preserve">COUNTY OF {{ </w:t>
+        <w:t xml:space="preserve">COUNTY OF </w:t>
+      </w:r>
+      <w:proofErr w:type="gramStart"/>
+      <w:r>
+        <w:rPr>
+          <w:rFonts w:ascii="Times New Roman" w:hAnsi="Times New Roman" w:cs="Times New Roman"/>
+          <w:sz w:val="22"/>
+          <w:szCs w:val="22"/>
+        </w:rPr>
+        <w:t xml:space="preserve">{{ </w:t>
       </w:r>
       <w:proofErr w:type="spellStart"/>
       <w:r>
@@ -83,7 +120,16 @@
           <w:sz w:val="22"/>
           <w:szCs w:val="22"/>
         </w:rPr>
-        <w:t>county_choice</w:t>
+        <w:t>county</w:t>
+      </w:r>
+      <w:proofErr w:type="gramEnd"/>
+      <w:r>
+        <w:rPr>
+          <w:rFonts w:ascii="Times New Roman" w:hAnsi="Times New Roman" w:cs="Times New Roman"/>
+          <w:sz w:val="22"/>
+          <w:szCs w:val="22"/>
+        </w:rPr>
+        <w:t>_choice</w:t>
       </w:r>
       <w:proofErr w:type="spellEnd"/>
       <w:r>
@@ -92,7 +138,25 @@
           <w:sz w:val="22"/>
           <w:szCs w:val="22"/>
         </w:rPr>
-        <w:t xml:space="preserve"> | upper }}</w:t>
+        <w:t xml:space="preserve"> | </w:t>
+      </w:r>
+      <w:proofErr w:type="gramStart"/>
+      <w:r>
+        <w:rPr>
+          <w:rFonts w:ascii="Times New Roman" w:hAnsi="Times New Roman" w:cs="Times New Roman"/>
+          <w:sz w:val="22"/>
+          <w:szCs w:val="22"/>
+        </w:rPr>
+        <w:t>upper }</w:t>
+      </w:r>
+      <w:proofErr w:type="gramEnd"/>
+      <w:r>
+        <w:rPr>
+          <w:rFonts w:ascii="Times New Roman" w:hAnsi="Times New Roman" w:cs="Times New Roman"/>
+          <w:sz w:val="22"/>
+          <w:szCs w:val="22"/>
+        </w:rPr>
+        <w:t>}</w:t>
       </w:r>
     </w:p>
     <w:p>
@@ -149,13 +213,23 @@
                 <w:szCs w:val="22"/>
               </w:rPr>
             </w:pPr>
+            <w:proofErr w:type="gramStart"/>
             <w:r>
               <w:rPr>
                 <w:rFonts w:ascii="Times New Roman" w:hAnsi="Times New Roman" w:cs="Times New Roman"/>
                 <w:sz w:val="22"/>
                 <w:szCs w:val="22"/>
               </w:rPr>
-              <w:t>{{ plaintiffs[0].</w:t>
+              <w:t>{{ plaintiffs</w:t>
+            </w:r>
+            <w:proofErr w:type="gramEnd"/>
+            <w:r>
+              <w:rPr>
+                <w:rFonts w:ascii="Times New Roman" w:hAnsi="Times New Roman" w:cs="Times New Roman"/>
+                <w:sz w:val="22"/>
+                <w:szCs w:val="22"/>
+              </w:rPr>
+              <w:t>[0].</w:t>
             </w:r>
             <w:proofErr w:type="spellStart"/>
             <w:r>
@@ -164,7 +238,16 @@
                 <w:sz w:val="22"/>
                 <w:szCs w:val="22"/>
               </w:rPr>
-              <w:t>name_full</w:t>
+              <w:t>name_</w:t>
+            </w:r>
+            <w:proofErr w:type="gramStart"/>
+            <w:r>
+              <w:rPr>
+                <w:rFonts w:ascii="Times New Roman" w:hAnsi="Times New Roman" w:cs="Times New Roman"/>
+                <w:sz w:val="22"/>
+                <w:szCs w:val="22"/>
+              </w:rPr>
+              <w:t>full</w:t>
             </w:r>
             <w:proofErr w:type="spellEnd"/>
             <w:r>
@@ -173,7 +256,16 @@
                 <w:sz w:val="22"/>
                 <w:szCs w:val="22"/>
               </w:rPr>
-              <w:t>() }}</w:t>
+              <w:t>() }</w:t>
+            </w:r>
+            <w:proofErr w:type="gramEnd"/>
+            <w:r>
+              <w:rPr>
+                <w:rFonts w:ascii="Times New Roman" w:hAnsi="Times New Roman" w:cs="Times New Roman"/>
+                <w:sz w:val="22"/>
+                <w:szCs w:val="22"/>
+              </w:rPr>
+              <w:t>}</w:t>
             </w:r>
           </w:p>
           <w:p>
@@ -241,13 +333,23 @@
                 <w:szCs w:val="22"/>
               </w:rPr>
             </w:pPr>
+            <w:proofErr w:type="gramStart"/>
             <w:r>
               <w:rPr>
                 <w:rFonts w:ascii="Times New Roman" w:hAnsi="Times New Roman" w:cs="Times New Roman"/>
                 <w:sz w:val="22"/>
                 <w:szCs w:val="22"/>
               </w:rPr>
-              <w:t>{{ defendants[0].</w:t>
+              <w:t>{{ defendants</w:t>
+            </w:r>
+            <w:proofErr w:type="gramEnd"/>
+            <w:r>
+              <w:rPr>
+                <w:rFonts w:ascii="Times New Roman" w:hAnsi="Times New Roman" w:cs="Times New Roman"/>
+                <w:sz w:val="22"/>
+                <w:szCs w:val="22"/>
+              </w:rPr>
+              <w:t>[0].</w:t>
             </w:r>
             <w:proofErr w:type="spellStart"/>
             <w:r>
@@ -256,7 +358,16 @@
                 <w:sz w:val="22"/>
                 <w:szCs w:val="22"/>
               </w:rPr>
-              <w:t>name_full</w:t>
+              <w:t>name_</w:t>
+            </w:r>
+            <w:proofErr w:type="gramStart"/>
+            <w:r>
+              <w:rPr>
+                <w:rFonts w:ascii="Times New Roman" w:hAnsi="Times New Roman" w:cs="Times New Roman"/>
+                <w:sz w:val="22"/>
+                <w:szCs w:val="22"/>
+              </w:rPr>
+              <w:t>full</w:t>
             </w:r>
             <w:proofErr w:type="spellEnd"/>
             <w:r>
@@ -265,7 +376,16 @@
                 <w:sz w:val="22"/>
                 <w:szCs w:val="22"/>
               </w:rPr>
-              <w:t>() }}</w:t>
+              <w:t>() }</w:t>
+            </w:r>
+            <w:proofErr w:type="gramEnd"/>
+            <w:r>
+              <w:rPr>
+                <w:rFonts w:ascii="Times New Roman" w:hAnsi="Times New Roman" w:cs="Times New Roman"/>
+                <w:sz w:val="22"/>
+                <w:szCs w:val="22"/>
+              </w:rPr>
+              <w:t>}</w:t>
             </w:r>
           </w:p>
           <w:p>
@@ -364,6 +484,7 @@
               </w:rPr>
               <w:t xml:space="preserve"> </w:t>
             </w:r>
+            <w:proofErr w:type="gramStart"/>
             <w:r>
               <w:rPr>
                 <w:rFonts w:ascii="Times New Roman" w:hAnsi="Times New Roman" w:cs="Times New Roman"/>
@@ -381,7 +502,27 @@
                 <w:szCs w:val="22"/>
                 <w:u w:val="single"/>
               </w:rPr>
-              <w:t>docket_number</w:t>
+              <w:t>docket</w:t>
+            </w:r>
+            <w:proofErr w:type="gramEnd"/>
+            <w:r>
+              <w:rPr>
+                <w:rFonts w:ascii="Times New Roman" w:hAnsi="Times New Roman" w:cs="Times New Roman"/>
+                <w:sz w:val="22"/>
+                <w:szCs w:val="22"/>
+                <w:u w:val="single"/>
+              </w:rPr>
+              <w:t>_</w:t>
+            </w:r>
+            <w:proofErr w:type="gramStart"/>
+            <w:r>
+              <w:rPr>
+                <w:rFonts w:ascii="Times New Roman" w:hAnsi="Times New Roman" w:cs="Times New Roman"/>
+                <w:sz w:val="22"/>
+                <w:szCs w:val="22"/>
+                <w:u w:val="single"/>
+              </w:rPr>
+              <w:t>number</w:t>
             </w:r>
             <w:proofErr w:type="spellEnd"/>
             <w:r>
@@ -391,7 +532,17 @@
                 <w:szCs w:val="22"/>
                 <w:u w:val="single"/>
               </w:rPr>
-              <w:t xml:space="preserve"> }}</w:t>
+              <w:t xml:space="preserve"> }</w:t>
+            </w:r>
+            <w:proofErr w:type="gramEnd"/>
+            <w:r>
+              <w:rPr>
+                <w:rFonts w:ascii="Times New Roman" w:hAnsi="Times New Roman" w:cs="Times New Roman"/>
+                <w:sz w:val="22"/>
+                <w:szCs w:val="22"/>
+                <w:u w:val="single"/>
+              </w:rPr>
+              <w:t>}</w:t>
             </w:r>
           </w:p>
           <w:p>
@@ -451,13 +602,23 @@
           <w:szCs w:val="21"/>
         </w:rPr>
       </w:pPr>
-      <w:r>
-        <w:rPr>
-          <w:rFonts w:ascii="Times New Roman" w:hAnsi="Times New Roman" w:cs="Times New Roman"/>
-          <w:sz w:val="21"/>
-          <w:szCs w:val="21"/>
-        </w:rPr>
-        <w:t>{{ plaintiffs[0].</w:t>
+      <w:proofErr w:type="gramStart"/>
+      <w:r>
+        <w:rPr>
+          <w:rFonts w:ascii="Times New Roman" w:hAnsi="Times New Roman" w:cs="Times New Roman"/>
+          <w:sz w:val="21"/>
+          <w:szCs w:val="21"/>
+        </w:rPr>
+        <w:t>{{ plaintiffs</w:t>
+      </w:r>
+      <w:proofErr w:type="gramEnd"/>
+      <w:r>
+        <w:rPr>
+          <w:rFonts w:ascii="Times New Roman" w:hAnsi="Times New Roman" w:cs="Times New Roman"/>
+          <w:sz w:val="21"/>
+          <w:szCs w:val="21"/>
+        </w:rPr>
+        <w:t>[0].</w:t>
       </w:r>
       <w:proofErr w:type="spellStart"/>
       <w:r>
@@ -466,7 +627,16 @@
           <w:sz w:val="21"/>
           <w:szCs w:val="21"/>
         </w:rPr>
-        <w:t>name_full</w:t>
+        <w:t>name_</w:t>
+      </w:r>
+      <w:proofErr w:type="gramStart"/>
+      <w:r>
+        <w:rPr>
+          <w:rFonts w:ascii="Times New Roman" w:hAnsi="Times New Roman" w:cs="Times New Roman"/>
+          <w:sz w:val="21"/>
+          <w:szCs w:val="21"/>
+        </w:rPr>
+        <w:t>full</w:t>
       </w:r>
       <w:proofErr w:type="spellEnd"/>
       <w:r>
@@ -475,7 +645,16 @@
           <w:sz w:val="21"/>
           <w:szCs w:val="21"/>
         </w:rPr>
-        <w:t>() }}</w:t>
+        <w:t>() }</w:t>
+      </w:r>
+      <w:proofErr w:type="gramEnd"/>
+      <w:r>
+        <w:rPr>
+          <w:rFonts w:ascii="Times New Roman" w:hAnsi="Times New Roman" w:cs="Times New Roman"/>
+          <w:sz w:val="21"/>
+          <w:szCs w:val="21"/>
+        </w:rPr>
+        <w:t>}</w:t>
       </w:r>
     </w:p>
     <w:p>
@@ -578,13 +757,32 @@
           <w:szCs w:val="21"/>
         </w:rPr>
       </w:pPr>
-      <w:r>
-        <w:rPr>
-          <w:rFonts w:ascii="Times New Roman" w:hAnsi="Times New Roman" w:cs="Times New Roman"/>
-          <w:sz w:val="21"/>
-          <w:szCs w:val="21"/>
-        </w:rPr>
-        <w:t>{{ plaintiffs[0].</w:t>
+      <w:proofErr w:type="gramStart"/>
+      <w:r>
+        <w:rPr>
+          <w:rFonts w:ascii="Times New Roman" w:hAnsi="Times New Roman" w:cs="Times New Roman"/>
+          <w:sz w:val="21"/>
+          <w:szCs w:val="21"/>
+        </w:rPr>
+        <w:t>{{ plaintiffs</w:t>
+      </w:r>
+      <w:proofErr w:type="gramEnd"/>
+      <w:r>
+        <w:rPr>
+          <w:rFonts w:ascii="Times New Roman" w:hAnsi="Times New Roman" w:cs="Times New Roman"/>
+          <w:sz w:val="21"/>
+          <w:szCs w:val="21"/>
+        </w:rPr>
+        <w:t>[0</w:t>
+      </w:r>
+      <w:proofErr w:type="gramStart"/>
+      <w:r>
+        <w:rPr>
+          <w:rFonts w:ascii="Times New Roman" w:hAnsi="Times New Roman" w:cs="Times New Roman"/>
+          <w:sz w:val="21"/>
+          <w:szCs w:val="21"/>
+        </w:rPr>
+        <w:t>].</w:t>
       </w:r>
       <w:proofErr w:type="spellStart"/>
       <w:r>
@@ -593,7 +791,25 @@
           <w:sz w:val="21"/>
           <w:szCs w:val="21"/>
         </w:rPr>
-        <w:t>address.line_one</w:t>
+        <w:t>address</w:t>
+      </w:r>
+      <w:proofErr w:type="gramEnd"/>
+      <w:r>
+        <w:rPr>
+          <w:rFonts w:ascii="Times New Roman" w:hAnsi="Times New Roman" w:cs="Times New Roman"/>
+          <w:sz w:val="21"/>
+          <w:szCs w:val="21"/>
+        </w:rPr>
+        <w:t>.line_</w:t>
+      </w:r>
+      <w:proofErr w:type="gramStart"/>
+      <w:r>
+        <w:rPr>
+          <w:rFonts w:ascii="Times New Roman" w:hAnsi="Times New Roman" w:cs="Times New Roman"/>
+          <w:sz w:val="21"/>
+          <w:szCs w:val="21"/>
+        </w:rPr>
+        <w:t>one</w:t>
       </w:r>
       <w:proofErr w:type="spellEnd"/>
       <w:r>
@@ -602,7 +818,16 @@
           <w:sz w:val="21"/>
           <w:szCs w:val="21"/>
         </w:rPr>
-        <w:t>() }}</w:t>
+        <w:t>() }</w:t>
+      </w:r>
+      <w:proofErr w:type="gramEnd"/>
+      <w:r>
+        <w:rPr>
+          <w:rFonts w:ascii="Times New Roman" w:hAnsi="Times New Roman" w:cs="Times New Roman"/>
+          <w:sz w:val="21"/>
+          <w:szCs w:val="21"/>
+        </w:rPr>
+        <w:t>}</w:t>
       </w:r>
     </w:p>
     <w:p>
@@ -615,13 +840,32 @@
           <w:szCs w:val="21"/>
         </w:rPr>
       </w:pPr>
-      <w:r>
-        <w:rPr>
-          <w:rFonts w:ascii="Times New Roman" w:hAnsi="Times New Roman" w:cs="Times New Roman"/>
-          <w:sz w:val="21"/>
-          <w:szCs w:val="21"/>
-        </w:rPr>
-        <w:t>{{ plaintiffs[0].</w:t>
+      <w:proofErr w:type="gramStart"/>
+      <w:r>
+        <w:rPr>
+          <w:rFonts w:ascii="Times New Roman" w:hAnsi="Times New Roman" w:cs="Times New Roman"/>
+          <w:sz w:val="21"/>
+          <w:szCs w:val="21"/>
+        </w:rPr>
+        <w:t>{{ plaintiffs</w:t>
+      </w:r>
+      <w:proofErr w:type="gramEnd"/>
+      <w:r>
+        <w:rPr>
+          <w:rFonts w:ascii="Times New Roman" w:hAnsi="Times New Roman" w:cs="Times New Roman"/>
+          <w:sz w:val="21"/>
+          <w:szCs w:val="21"/>
+        </w:rPr>
+        <w:t>[0</w:t>
+      </w:r>
+      <w:proofErr w:type="gramStart"/>
+      <w:r>
+        <w:rPr>
+          <w:rFonts w:ascii="Times New Roman" w:hAnsi="Times New Roman" w:cs="Times New Roman"/>
+          <w:sz w:val="21"/>
+          <w:szCs w:val="21"/>
+        </w:rPr>
+        <w:t>].</w:t>
       </w:r>
       <w:proofErr w:type="spellStart"/>
       <w:r>
@@ -630,7 +874,25 @@
           <w:sz w:val="21"/>
           <w:szCs w:val="21"/>
         </w:rPr>
-        <w:t>address.line_two</w:t>
+        <w:t>address</w:t>
+      </w:r>
+      <w:proofErr w:type="gramEnd"/>
+      <w:r>
+        <w:rPr>
+          <w:rFonts w:ascii="Times New Roman" w:hAnsi="Times New Roman" w:cs="Times New Roman"/>
+          <w:sz w:val="21"/>
+          <w:szCs w:val="21"/>
+        </w:rPr>
+        <w:t>.line_</w:t>
+      </w:r>
+      <w:proofErr w:type="gramStart"/>
+      <w:r>
+        <w:rPr>
+          <w:rFonts w:ascii="Times New Roman" w:hAnsi="Times New Roman" w:cs="Times New Roman"/>
+          <w:sz w:val="21"/>
+          <w:szCs w:val="21"/>
+        </w:rPr>
+        <w:t>two</w:t>
       </w:r>
       <w:proofErr w:type="spellEnd"/>
       <w:r>
@@ -639,7 +901,16 @@
           <w:sz w:val="21"/>
           <w:szCs w:val="21"/>
         </w:rPr>
-        <w:t>() }}</w:t>
+        <w:t>() }</w:t>
+      </w:r>
+      <w:proofErr w:type="gramEnd"/>
+      <w:r>
+        <w:rPr>
+          <w:rFonts w:ascii="Times New Roman" w:hAnsi="Times New Roman" w:cs="Times New Roman"/>
+          <w:sz w:val="21"/>
+          <w:szCs w:val="21"/>
+        </w:rPr>
+        <w:t>}</w:t>
       </w:r>
     </w:p>
     <w:p>
@@ -660,13 +931,23 @@
         </w:rPr>
         <w:t xml:space="preserve">{% if </w:t>
       </w:r>
-      <w:r>
-        <w:rPr>
-          <w:rFonts w:ascii="Times New Roman" w:hAnsi="Times New Roman" w:cs="Times New Roman"/>
-          <w:sz w:val="21"/>
-          <w:szCs w:val="21"/>
-        </w:rPr>
-        <w:t>plaintiffs[0].</w:t>
+      <w:proofErr w:type="gramStart"/>
+      <w:r>
+        <w:rPr>
+          <w:rFonts w:ascii="Times New Roman" w:hAnsi="Times New Roman" w:cs="Times New Roman"/>
+          <w:sz w:val="21"/>
+          <w:szCs w:val="21"/>
+        </w:rPr>
+        <w:t>plaintiffs[</w:t>
+      </w:r>
+      <w:proofErr w:type="gramEnd"/>
+      <w:r>
+        <w:rPr>
+          <w:rFonts w:ascii="Times New Roman" w:hAnsi="Times New Roman" w:cs="Times New Roman"/>
+          <w:sz w:val="21"/>
+          <w:szCs w:val="21"/>
+        </w:rPr>
+        <w:t>0].</w:t>
       </w:r>
       <w:proofErr w:type="spellStart"/>
       <w:r>
@@ -684,15 +965,33 @@
           <w:sz w:val="21"/>
           <w:szCs w:val="21"/>
         </w:rPr>
-        <w:t xml:space="preserve"> %}</w:t>
-      </w:r>
-      <w:r>
-        <w:rPr>
-          <w:rFonts w:ascii="Times New Roman" w:hAnsi="Times New Roman" w:cs="Times New Roman"/>
-          <w:sz w:val="21"/>
-          <w:szCs w:val="21"/>
-        </w:rPr>
-        <w:t xml:space="preserve">{% if </w:t>
+        <w:t xml:space="preserve"> </w:t>
+      </w:r>
+      <w:proofErr w:type="gramStart"/>
+      <w:r>
+        <w:rPr>
+          <w:rFonts w:ascii="Times New Roman" w:hAnsi="Times New Roman" w:cs="Times New Roman"/>
+          <w:sz w:val="21"/>
+          <w:szCs w:val="21"/>
+        </w:rPr>
+        <w:t>%}</w:t>
+      </w:r>
+      <w:r>
+        <w:rPr>
+          <w:rFonts w:ascii="Times New Roman" w:hAnsi="Times New Roman" w:cs="Times New Roman"/>
+          <w:sz w:val="21"/>
+          <w:szCs w:val="21"/>
+        </w:rPr>
+        <w:t>{</w:t>
+      </w:r>
+      <w:proofErr w:type="gramEnd"/>
+      <w:r>
+        <w:rPr>
+          <w:rFonts w:ascii="Times New Roman" w:hAnsi="Times New Roman" w:cs="Times New Roman"/>
+          <w:sz w:val="21"/>
+          <w:szCs w:val="21"/>
+        </w:rPr>
+        <w:t xml:space="preserve">% if </w:t>
       </w:r>
       <w:proofErr w:type="spellStart"/>
       <w:r>
@@ -710,7 +1009,106 @@
           <w:sz w:val="21"/>
           <w:szCs w:val="21"/>
         </w:rPr>
-        <w:t xml:space="preserve"> == “plaintiff” %}Does not have phone{% else %}Unknown phone{% endif %}{% else%}{{ </w:t>
+        <w:t xml:space="preserve"> == “plaintiff” </w:t>
+      </w:r>
+      <w:proofErr w:type="gramStart"/>
+      <w:r>
+        <w:rPr>
+          <w:rFonts w:ascii="Times New Roman" w:hAnsi="Times New Roman" w:cs="Times New Roman"/>
+          <w:sz w:val="21"/>
+          <w:szCs w:val="21"/>
+        </w:rPr>
+        <w:t>%}Does</w:t>
+      </w:r>
+      <w:proofErr w:type="gramEnd"/>
+      <w:r>
+        <w:rPr>
+          <w:rFonts w:ascii="Times New Roman" w:hAnsi="Times New Roman" w:cs="Times New Roman"/>
+          <w:sz w:val="21"/>
+          <w:szCs w:val="21"/>
+        </w:rPr>
+        <w:t xml:space="preserve"> not have </w:t>
+      </w:r>
+      <w:proofErr w:type="gramStart"/>
+      <w:r>
+        <w:rPr>
+          <w:rFonts w:ascii="Times New Roman" w:hAnsi="Times New Roman" w:cs="Times New Roman"/>
+          <w:sz w:val="21"/>
+          <w:szCs w:val="21"/>
+        </w:rPr>
+        <w:t>phone{</w:t>
+      </w:r>
+      <w:proofErr w:type="gramEnd"/>
+      <w:r>
+        <w:rPr>
+          <w:rFonts w:ascii="Times New Roman" w:hAnsi="Times New Roman" w:cs="Times New Roman"/>
+          <w:sz w:val="21"/>
+          <w:szCs w:val="21"/>
+        </w:rPr>
+        <w:t xml:space="preserve">% else </w:t>
+      </w:r>
+      <w:proofErr w:type="gramStart"/>
+      <w:r>
+        <w:rPr>
+          <w:rFonts w:ascii="Times New Roman" w:hAnsi="Times New Roman" w:cs="Times New Roman"/>
+          <w:sz w:val="21"/>
+          <w:szCs w:val="21"/>
+        </w:rPr>
+        <w:t>%}Unknown</w:t>
+      </w:r>
+      <w:proofErr w:type="gramEnd"/>
+      <w:r>
+        <w:rPr>
+          <w:rFonts w:ascii="Times New Roman" w:hAnsi="Times New Roman" w:cs="Times New Roman"/>
+          <w:sz w:val="21"/>
+          <w:szCs w:val="21"/>
+        </w:rPr>
+        <w:t xml:space="preserve"> </w:t>
+      </w:r>
+      <w:proofErr w:type="gramStart"/>
+      <w:r>
+        <w:rPr>
+          <w:rFonts w:ascii="Times New Roman" w:hAnsi="Times New Roman" w:cs="Times New Roman"/>
+          <w:sz w:val="21"/>
+          <w:szCs w:val="21"/>
+        </w:rPr>
+        <w:t>phone{</w:t>
+      </w:r>
+      <w:proofErr w:type="gramEnd"/>
+      <w:r>
+        <w:rPr>
+          <w:rFonts w:ascii="Times New Roman" w:hAnsi="Times New Roman" w:cs="Times New Roman"/>
+          <w:sz w:val="21"/>
+          <w:szCs w:val="21"/>
+        </w:rPr>
+        <w:t xml:space="preserve">% endif </w:t>
+      </w:r>
+      <w:proofErr w:type="gramStart"/>
+      <w:r>
+        <w:rPr>
+          <w:rFonts w:ascii="Times New Roman" w:hAnsi="Times New Roman" w:cs="Times New Roman"/>
+          <w:sz w:val="21"/>
+          <w:szCs w:val="21"/>
+        </w:rPr>
+        <w:t>%}{</w:t>
+      </w:r>
+      <w:proofErr w:type="gramEnd"/>
+      <w:r>
+        <w:rPr>
+          <w:rFonts w:ascii="Times New Roman" w:hAnsi="Times New Roman" w:cs="Times New Roman"/>
+          <w:sz w:val="21"/>
+          <w:szCs w:val="21"/>
+        </w:rPr>
+        <w:t>% else</w:t>
+      </w:r>
+      <w:proofErr w:type="gramStart"/>
+      <w:r>
+        <w:rPr>
+          <w:rFonts w:ascii="Times New Roman" w:hAnsi="Times New Roman" w:cs="Times New Roman"/>
+          <w:sz w:val="21"/>
+          <w:szCs w:val="21"/>
+        </w:rPr>
+        <w:t xml:space="preserve">%}{{ </w:t>
       </w:r>
       <w:proofErr w:type="spellStart"/>
       <w:r>
@@ -719,7 +1117,16 @@
           <w:sz w:val="21"/>
           <w:szCs w:val="21"/>
         </w:rPr>
-        <w:t>phone_number_formatted</w:t>
+        <w:t>phone</w:t>
+      </w:r>
+      <w:proofErr w:type="gramEnd"/>
+      <w:r>
+        <w:rPr>
+          <w:rFonts w:ascii="Times New Roman" w:hAnsi="Times New Roman" w:cs="Times New Roman"/>
+          <w:sz w:val="21"/>
+          <w:szCs w:val="21"/>
+        </w:rPr>
+        <w:t>_number_formatted</w:t>
       </w:r>
       <w:proofErr w:type="spellEnd"/>
       <w:r>
@@ -744,6 +1151,86 @@
           <w:sz w:val="21"/>
           <w:szCs w:val="21"/>
         </w:rPr>
+        <w:t>[0</w:t>
+      </w:r>
+      <w:proofErr w:type="gramStart"/>
+      <w:r>
+        <w:rPr>
+          <w:rFonts w:ascii="Times New Roman" w:hAnsi="Times New Roman" w:cs="Times New Roman"/>
+          <w:sz w:val="21"/>
+          <w:szCs w:val="21"/>
+        </w:rPr>
+        <w:t>].</w:t>
+      </w:r>
+      <w:proofErr w:type="spellStart"/>
+      <w:r>
+        <w:rPr>
+          <w:rFonts w:ascii="Times New Roman" w:hAnsi="Times New Roman" w:cs="Times New Roman"/>
+          <w:sz w:val="21"/>
+          <w:szCs w:val="21"/>
+        </w:rPr>
+        <w:t>phone</w:t>
+      </w:r>
+      <w:proofErr w:type="gramEnd"/>
+      <w:r>
+        <w:rPr>
+          <w:rFonts w:ascii="Times New Roman" w:hAnsi="Times New Roman" w:cs="Times New Roman"/>
+          <w:sz w:val="21"/>
+          <w:szCs w:val="21"/>
+        </w:rPr>
+        <w:t>_number</w:t>
+      </w:r>
+      <w:proofErr w:type="spellEnd"/>
+      <w:proofErr w:type="gramStart"/>
+      <w:r>
+        <w:rPr>
+          <w:rFonts w:ascii="Times New Roman" w:hAnsi="Times New Roman" w:cs="Times New Roman"/>
+          <w:sz w:val="21"/>
+          <w:szCs w:val="21"/>
+        </w:rPr>
+        <w:t>) }}</w:t>
+      </w:r>
+      <w:r>
+        <w:rPr>
+          <w:rFonts w:ascii="Times New Roman" w:hAnsi="Times New Roman" w:cs="Times New Roman"/>
+          <w:sz w:val="21"/>
+          <w:szCs w:val="21"/>
+        </w:rPr>
+        <w:t>{</w:t>
+      </w:r>
+      <w:proofErr w:type="gramEnd"/>
+      <w:r>
+        <w:rPr>
+          <w:rFonts w:ascii="Times New Roman" w:hAnsi="Times New Roman" w:cs="Times New Roman"/>
+          <w:sz w:val="21"/>
+          <w:szCs w:val="21"/>
+        </w:rPr>
+        <w:t>% endif %}</w:t>
+      </w:r>
+      <w:r>
+        <w:rPr>
+          <w:rFonts w:ascii="Times New Roman" w:hAnsi="Times New Roman" w:cs="Times New Roman"/>
+          <w:sz w:val="21"/>
+          <w:szCs w:val="21"/>
+        </w:rPr>
+        <w:br w:type="column"/>
+      </w:r>
+      <w:proofErr w:type="gramStart"/>
+      <w:r>
+        <w:rPr>
+          <w:rFonts w:ascii="Times New Roman" w:hAnsi="Times New Roman" w:cs="Times New Roman"/>
+          <w:sz w:val="21"/>
+          <w:szCs w:val="21"/>
+        </w:rPr>
+        <w:t>{{ defendants</w:t>
+      </w:r>
+      <w:proofErr w:type="gramEnd"/>
+      <w:r>
+        <w:rPr>
+          <w:rFonts w:ascii="Times New Roman" w:hAnsi="Times New Roman" w:cs="Times New Roman"/>
+          <w:sz w:val="21"/>
+          <w:szCs w:val="21"/>
+        </w:rPr>
         <w:t>[0].</w:t>
       </w:r>
       <w:proofErr w:type="spellStart"/>
@@ -753,7 +1240,16 @@
           <w:sz w:val="21"/>
           <w:szCs w:val="21"/>
         </w:rPr>
-        <w:t>phone_number</w:t>
+        <w:t>name_</w:t>
+      </w:r>
+      <w:proofErr w:type="gramStart"/>
+      <w:r>
+        <w:rPr>
+          <w:rFonts w:ascii="Times New Roman" w:hAnsi="Times New Roman" w:cs="Times New Roman"/>
+          <w:sz w:val="21"/>
+          <w:szCs w:val="21"/>
+        </w:rPr>
+        <w:t>full</w:t>
       </w:r>
       <w:proofErr w:type="spellEnd"/>
       <w:r>
@@ -762,42 +1258,16 @@
           <w:sz w:val="21"/>
           <w:szCs w:val="21"/>
         </w:rPr>
-        <w:t>) }}</w:t>
-      </w:r>
-      <w:r>
-        <w:rPr>
-          <w:rFonts w:ascii="Times New Roman" w:hAnsi="Times New Roman" w:cs="Times New Roman"/>
-          <w:sz w:val="21"/>
-          <w:szCs w:val="21"/>
-        </w:rPr>
-        <w:t>{% endif %}</w:t>
-      </w:r>
-      <w:r>
-        <w:rPr>
-          <w:rFonts w:ascii="Times New Roman" w:hAnsi="Times New Roman" w:cs="Times New Roman"/>
-          <w:sz w:val="21"/>
-          <w:szCs w:val="21"/>
-        </w:rPr>
-        <w:br w:type="column"/>
-        <w:t>{{ defendants[0].</w:t>
-      </w:r>
-      <w:proofErr w:type="spellStart"/>
-      <w:r>
-        <w:rPr>
-          <w:rFonts w:ascii="Times New Roman" w:hAnsi="Times New Roman" w:cs="Times New Roman"/>
-          <w:sz w:val="21"/>
-          <w:szCs w:val="21"/>
-        </w:rPr>
-        <w:t>name_full</w:t>
-      </w:r>
-      <w:proofErr w:type="spellEnd"/>
-      <w:r>
-        <w:rPr>
-          <w:rFonts w:ascii="Times New Roman" w:hAnsi="Times New Roman" w:cs="Times New Roman"/>
-          <w:sz w:val="21"/>
-          <w:szCs w:val="21"/>
-        </w:rPr>
-        <w:t>() }}</w:t>
+        <w:t>() }</w:t>
+      </w:r>
+      <w:proofErr w:type="gramEnd"/>
+      <w:r>
+        <w:rPr>
+          <w:rFonts w:ascii="Times New Roman" w:hAnsi="Times New Roman" w:cs="Times New Roman"/>
+          <w:sz w:val="21"/>
+          <w:szCs w:val="21"/>
+        </w:rPr>
+        <w:t>}</w:t>
       </w:r>
     </w:p>
     <w:p>
@@ -900,13 +1370,32 @@
           <w:szCs w:val="21"/>
         </w:rPr>
       </w:pPr>
-      <w:r>
-        <w:rPr>
-          <w:rFonts w:ascii="Times New Roman" w:hAnsi="Times New Roman" w:cs="Times New Roman"/>
-          <w:sz w:val="21"/>
-          <w:szCs w:val="21"/>
-        </w:rPr>
-        <w:t>{{ defendants[0].</w:t>
+      <w:proofErr w:type="gramStart"/>
+      <w:r>
+        <w:rPr>
+          <w:rFonts w:ascii="Times New Roman" w:hAnsi="Times New Roman" w:cs="Times New Roman"/>
+          <w:sz w:val="21"/>
+          <w:szCs w:val="21"/>
+        </w:rPr>
+        <w:t>{{ defendants</w:t>
+      </w:r>
+      <w:proofErr w:type="gramEnd"/>
+      <w:r>
+        <w:rPr>
+          <w:rFonts w:ascii="Times New Roman" w:hAnsi="Times New Roman" w:cs="Times New Roman"/>
+          <w:sz w:val="21"/>
+          <w:szCs w:val="21"/>
+        </w:rPr>
+        <w:t>[0</w:t>
+      </w:r>
+      <w:proofErr w:type="gramStart"/>
+      <w:r>
+        <w:rPr>
+          <w:rFonts w:ascii="Times New Roman" w:hAnsi="Times New Roman" w:cs="Times New Roman"/>
+          <w:sz w:val="21"/>
+          <w:szCs w:val="21"/>
+        </w:rPr>
+        <w:t>].</w:t>
       </w:r>
       <w:proofErr w:type="spellStart"/>
       <w:r>
@@ -915,7 +1404,25 @@
           <w:sz w:val="21"/>
           <w:szCs w:val="21"/>
         </w:rPr>
-        <w:t>address.line_one</w:t>
+        <w:t>address</w:t>
+      </w:r>
+      <w:proofErr w:type="gramEnd"/>
+      <w:r>
+        <w:rPr>
+          <w:rFonts w:ascii="Times New Roman" w:hAnsi="Times New Roman" w:cs="Times New Roman"/>
+          <w:sz w:val="21"/>
+          <w:szCs w:val="21"/>
+        </w:rPr>
+        <w:t>.line_</w:t>
+      </w:r>
+      <w:proofErr w:type="gramStart"/>
+      <w:r>
+        <w:rPr>
+          <w:rFonts w:ascii="Times New Roman" w:hAnsi="Times New Roman" w:cs="Times New Roman"/>
+          <w:sz w:val="21"/>
+          <w:szCs w:val="21"/>
+        </w:rPr>
+        <w:t>one</w:t>
       </w:r>
       <w:proofErr w:type="spellEnd"/>
       <w:r>
@@ -924,7 +1431,16 @@
           <w:sz w:val="21"/>
           <w:szCs w:val="21"/>
         </w:rPr>
-        <w:t>() }}</w:t>
+        <w:t>() }</w:t>
+      </w:r>
+      <w:proofErr w:type="gramEnd"/>
+      <w:r>
+        <w:rPr>
+          <w:rFonts w:ascii="Times New Roman" w:hAnsi="Times New Roman" w:cs="Times New Roman"/>
+          <w:sz w:val="21"/>
+          <w:szCs w:val="21"/>
+        </w:rPr>
+        <w:t>}</w:t>
       </w:r>
     </w:p>
     <w:p>
@@ -937,13 +1453,32 @@
           <w:szCs w:val="21"/>
         </w:rPr>
       </w:pPr>
-      <w:r>
-        <w:rPr>
-          <w:rFonts w:ascii="Times New Roman" w:hAnsi="Times New Roman" w:cs="Times New Roman"/>
-          <w:sz w:val="21"/>
-          <w:szCs w:val="21"/>
-        </w:rPr>
-        <w:t>{{ defendants[0].</w:t>
+      <w:proofErr w:type="gramStart"/>
+      <w:r>
+        <w:rPr>
+          <w:rFonts w:ascii="Times New Roman" w:hAnsi="Times New Roman" w:cs="Times New Roman"/>
+          <w:sz w:val="21"/>
+          <w:szCs w:val="21"/>
+        </w:rPr>
+        <w:t>{{ defendants</w:t>
+      </w:r>
+      <w:proofErr w:type="gramEnd"/>
+      <w:r>
+        <w:rPr>
+          <w:rFonts w:ascii="Times New Roman" w:hAnsi="Times New Roman" w:cs="Times New Roman"/>
+          <w:sz w:val="21"/>
+          <w:szCs w:val="21"/>
+        </w:rPr>
+        <w:t>[0</w:t>
+      </w:r>
+      <w:proofErr w:type="gramStart"/>
+      <w:r>
+        <w:rPr>
+          <w:rFonts w:ascii="Times New Roman" w:hAnsi="Times New Roman" w:cs="Times New Roman"/>
+          <w:sz w:val="21"/>
+          <w:szCs w:val="21"/>
+        </w:rPr>
+        <w:t>].</w:t>
       </w:r>
       <w:proofErr w:type="spellStart"/>
       <w:r>
@@ -952,7 +1487,25 @@
           <w:sz w:val="21"/>
           <w:szCs w:val="21"/>
         </w:rPr>
-        <w:t>address.line_two</w:t>
+        <w:t>address</w:t>
+      </w:r>
+      <w:proofErr w:type="gramEnd"/>
+      <w:r>
+        <w:rPr>
+          <w:rFonts w:ascii="Times New Roman" w:hAnsi="Times New Roman" w:cs="Times New Roman"/>
+          <w:sz w:val="21"/>
+          <w:szCs w:val="21"/>
+        </w:rPr>
+        <w:t>.line_</w:t>
+      </w:r>
+      <w:proofErr w:type="gramStart"/>
+      <w:r>
+        <w:rPr>
+          <w:rFonts w:ascii="Times New Roman" w:hAnsi="Times New Roman" w:cs="Times New Roman"/>
+          <w:sz w:val="21"/>
+          <w:szCs w:val="21"/>
+        </w:rPr>
+        <w:t>two</w:t>
       </w:r>
       <w:proofErr w:type="spellEnd"/>
       <w:r>
@@ -961,7 +1514,16 @@
           <w:sz w:val="21"/>
           <w:szCs w:val="21"/>
         </w:rPr>
-        <w:t>() }}</w:t>
+        <w:t>() }</w:t>
+      </w:r>
+      <w:proofErr w:type="gramEnd"/>
+      <w:r>
+        <w:rPr>
+          <w:rFonts w:ascii="Times New Roman" w:hAnsi="Times New Roman" w:cs="Times New Roman"/>
+          <w:sz w:val="21"/>
+          <w:szCs w:val="21"/>
+        </w:rPr>
+        <w:t>}</w:t>
       </w:r>
     </w:p>
     <w:p>
@@ -988,13 +1550,23 @@
         </w:rPr>
         <w:t xml:space="preserve">{% if </w:t>
       </w:r>
-      <w:r>
-        <w:rPr>
-          <w:rFonts w:ascii="Times New Roman" w:hAnsi="Times New Roman" w:cs="Times New Roman"/>
-          <w:sz w:val="21"/>
-          <w:szCs w:val="21"/>
-        </w:rPr>
-        <w:t>defendants[0].</w:t>
+      <w:proofErr w:type="gramStart"/>
+      <w:r>
+        <w:rPr>
+          <w:rFonts w:ascii="Times New Roman" w:hAnsi="Times New Roman" w:cs="Times New Roman"/>
+          <w:sz w:val="21"/>
+          <w:szCs w:val="21"/>
+        </w:rPr>
+        <w:t>defendants[</w:t>
+      </w:r>
+      <w:proofErr w:type="gramEnd"/>
+      <w:r>
+        <w:rPr>
+          <w:rFonts w:ascii="Times New Roman" w:hAnsi="Times New Roman" w:cs="Times New Roman"/>
+          <w:sz w:val="21"/>
+          <w:szCs w:val="21"/>
+        </w:rPr>
+        <w:t>0].</w:t>
       </w:r>
       <w:proofErr w:type="spellStart"/>
       <w:r>
@@ -1012,15 +1584,33 @@
           <w:sz w:val="21"/>
           <w:szCs w:val="21"/>
         </w:rPr>
-        <w:t xml:space="preserve"> %}</w:t>
-      </w:r>
-      <w:r>
-        <w:rPr>
-          <w:rFonts w:ascii="Times New Roman" w:hAnsi="Times New Roman" w:cs="Times New Roman"/>
-          <w:sz w:val="21"/>
-          <w:szCs w:val="21"/>
-        </w:rPr>
-        <w:t xml:space="preserve">{% if </w:t>
+        <w:t xml:space="preserve"> </w:t>
+      </w:r>
+      <w:proofErr w:type="gramStart"/>
+      <w:r>
+        <w:rPr>
+          <w:rFonts w:ascii="Times New Roman" w:hAnsi="Times New Roman" w:cs="Times New Roman"/>
+          <w:sz w:val="21"/>
+          <w:szCs w:val="21"/>
+        </w:rPr>
+        <w:t>%}</w:t>
+      </w:r>
+      <w:r>
+        <w:rPr>
+          <w:rFonts w:ascii="Times New Roman" w:hAnsi="Times New Roman" w:cs="Times New Roman"/>
+          <w:sz w:val="21"/>
+          <w:szCs w:val="21"/>
+        </w:rPr>
+        <w:t>{</w:t>
+      </w:r>
+      <w:proofErr w:type="gramEnd"/>
+      <w:r>
+        <w:rPr>
+          <w:rFonts w:ascii="Times New Roman" w:hAnsi="Times New Roman" w:cs="Times New Roman"/>
+          <w:sz w:val="21"/>
+          <w:szCs w:val="21"/>
+        </w:rPr>
+        <w:t xml:space="preserve">% if </w:t>
       </w:r>
       <w:proofErr w:type="spellStart"/>
       <w:r>
@@ -1038,7 +1628,106 @@
           <w:sz w:val="21"/>
           <w:szCs w:val="21"/>
         </w:rPr>
-        <w:t xml:space="preserve"> == “defendant” %}Does not have phone{% else %}Unknown phone{% endif %}{% else %}</w:t>
+        <w:t xml:space="preserve"> == “defendant” </w:t>
+      </w:r>
+      <w:proofErr w:type="gramStart"/>
+      <w:r>
+        <w:rPr>
+          <w:rFonts w:ascii="Times New Roman" w:hAnsi="Times New Roman" w:cs="Times New Roman"/>
+          <w:sz w:val="21"/>
+          <w:szCs w:val="21"/>
+        </w:rPr>
+        <w:t>%}Does</w:t>
+      </w:r>
+      <w:proofErr w:type="gramEnd"/>
+      <w:r>
+        <w:rPr>
+          <w:rFonts w:ascii="Times New Roman" w:hAnsi="Times New Roman" w:cs="Times New Roman"/>
+          <w:sz w:val="21"/>
+          <w:szCs w:val="21"/>
+        </w:rPr>
+        <w:t xml:space="preserve"> not have </w:t>
+      </w:r>
+      <w:proofErr w:type="gramStart"/>
+      <w:r>
+        <w:rPr>
+          <w:rFonts w:ascii="Times New Roman" w:hAnsi="Times New Roman" w:cs="Times New Roman"/>
+          <w:sz w:val="21"/>
+          <w:szCs w:val="21"/>
+        </w:rPr>
+        <w:t>phone{</w:t>
+      </w:r>
+      <w:proofErr w:type="gramEnd"/>
+      <w:r>
+        <w:rPr>
+          <w:rFonts w:ascii="Times New Roman" w:hAnsi="Times New Roman" w:cs="Times New Roman"/>
+          <w:sz w:val="21"/>
+          <w:szCs w:val="21"/>
+        </w:rPr>
+        <w:t xml:space="preserve">% else </w:t>
+      </w:r>
+      <w:proofErr w:type="gramStart"/>
+      <w:r>
+        <w:rPr>
+          <w:rFonts w:ascii="Times New Roman" w:hAnsi="Times New Roman" w:cs="Times New Roman"/>
+          <w:sz w:val="21"/>
+          <w:szCs w:val="21"/>
+        </w:rPr>
+        <w:t>%}Unknown</w:t>
+      </w:r>
+      <w:proofErr w:type="gramEnd"/>
+      <w:r>
+        <w:rPr>
+          <w:rFonts w:ascii="Times New Roman" w:hAnsi="Times New Roman" w:cs="Times New Roman"/>
+          <w:sz w:val="21"/>
+          <w:szCs w:val="21"/>
+        </w:rPr>
+        <w:t xml:space="preserve"> </w:t>
+      </w:r>
+      <w:proofErr w:type="gramStart"/>
+      <w:r>
+        <w:rPr>
+          <w:rFonts w:ascii="Times New Roman" w:hAnsi="Times New Roman" w:cs="Times New Roman"/>
+          <w:sz w:val="21"/>
+          <w:szCs w:val="21"/>
+        </w:rPr>
+        <w:t>phone{</w:t>
+      </w:r>
+      <w:proofErr w:type="gramEnd"/>
+      <w:r>
+        <w:rPr>
+          <w:rFonts w:ascii="Times New Roman" w:hAnsi="Times New Roman" w:cs="Times New Roman"/>
+          <w:sz w:val="21"/>
+          <w:szCs w:val="21"/>
+        </w:rPr>
+        <w:t xml:space="preserve">% endif </w:t>
+      </w:r>
+      <w:proofErr w:type="gramStart"/>
+      <w:r>
+        <w:rPr>
+          <w:rFonts w:ascii="Times New Roman" w:hAnsi="Times New Roman" w:cs="Times New Roman"/>
+          <w:sz w:val="21"/>
+          <w:szCs w:val="21"/>
+        </w:rPr>
+        <w:t>%}{</w:t>
+      </w:r>
+      <w:proofErr w:type="gramEnd"/>
+      <w:r>
+        <w:rPr>
+          <w:rFonts w:ascii="Times New Roman" w:hAnsi="Times New Roman" w:cs="Times New Roman"/>
+          <w:sz w:val="21"/>
+          <w:szCs w:val="21"/>
+        </w:rPr>
+        <w:t xml:space="preserve">% else </w:t>
+      </w:r>
+      <w:proofErr w:type="gramStart"/>
+      <w:r>
+        <w:rPr>
+          <w:rFonts w:ascii="Times New Roman" w:hAnsi="Times New Roman" w:cs="Times New Roman"/>
+          <w:sz w:val="21"/>
+          <w:szCs w:val="21"/>
+        </w:rPr>
+        <w:t>%}</w:t>
       </w:r>
       <w:r>
         <w:rPr>
@@ -1055,7 +1744,16 @@
           <w:sz w:val="21"/>
           <w:szCs w:val="21"/>
         </w:rPr>
-        <w:t>phone_number_formatted</w:t>
+        <w:t>phone</w:t>
+      </w:r>
+      <w:proofErr w:type="gramEnd"/>
+      <w:r>
+        <w:rPr>
+          <w:rFonts w:ascii="Times New Roman" w:hAnsi="Times New Roman" w:cs="Times New Roman"/>
+          <w:sz w:val="21"/>
+          <w:szCs w:val="21"/>
+        </w:rPr>
+        <w:t>_number_formatted</w:t>
       </w:r>
       <w:proofErr w:type="spellEnd"/>
       <w:r>
@@ -1080,7 +1778,16 @@
           <w:sz w:val="21"/>
           <w:szCs w:val="21"/>
         </w:rPr>
-        <w:t>[0].</w:t>
+        <w:t>[0</w:t>
+      </w:r>
+      <w:proofErr w:type="gramStart"/>
+      <w:r>
+        <w:rPr>
+          <w:rFonts w:ascii="Times New Roman" w:hAnsi="Times New Roman" w:cs="Times New Roman"/>
+          <w:sz w:val="21"/>
+          <w:szCs w:val="21"/>
+        </w:rPr>
+        <w:t>].</w:t>
       </w:r>
       <w:proofErr w:type="spellStart"/>
       <w:r>
@@ -1089,16 +1796,35 @@
           <w:sz w:val="21"/>
           <w:szCs w:val="21"/>
         </w:rPr>
-        <w:t>phone_number</w:t>
+        <w:t>phone</w:t>
+      </w:r>
+      <w:proofErr w:type="gramEnd"/>
+      <w:r>
+        <w:rPr>
+          <w:rFonts w:ascii="Times New Roman" w:hAnsi="Times New Roman" w:cs="Times New Roman"/>
+          <w:sz w:val="21"/>
+          <w:szCs w:val="21"/>
+        </w:rPr>
+        <w:t>_number</w:t>
       </w:r>
       <w:proofErr w:type="spellEnd"/>
-      <w:r>
-        <w:rPr>
-          <w:rFonts w:ascii="Times New Roman" w:hAnsi="Times New Roman" w:cs="Times New Roman"/>
-          <w:sz w:val="21"/>
-          <w:szCs w:val="21"/>
-        </w:rPr>
-        <w:t>) }}{% endif %}</w:t>
+      <w:proofErr w:type="gramStart"/>
+      <w:r>
+        <w:rPr>
+          <w:rFonts w:ascii="Times New Roman" w:hAnsi="Times New Roman" w:cs="Times New Roman"/>
+          <w:sz w:val="21"/>
+          <w:szCs w:val="21"/>
+        </w:rPr>
+        <w:t>) }}{</w:t>
+      </w:r>
+      <w:proofErr w:type="gramEnd"/>
+      <w:r>
+        <w:rPr>
+          <w:rFonts w:ascii="Times New Roman" w:hAnsi="Times New Roman" w:cs="Times New Roman"/>
+          <w:sz w:val="21"/>
+          <w:szCs w:val="21"/>
+        </w:rPr>
+        <w:t>% endif %}</w:t>
       </w:r>
     </w:p>
     <w:p>
@@ -1227,199 +1953,7 @@
           <w:sz w:val="22"/>
           <w:szCs w:val="22"/>
         </w:rPr>
-        <w:t xml:space="preserve">Motion for Entry of Consent </w:t>
-      </w:r>
-      <w:r>
-        <w:rPr>
-          <w:rFonts w:ascii="Times New Roman" w:hAnsi="Times New Roman" w:cs="Times New Roman"/>
-          <w:b/>
-          <w:bCs/>
-          <w:sz w:val="22"/>
-          <w:szCs w:val="22"/>
-        </w:rPr>
-        <w:t xml:space="preserve">{% if </w:t>
-      </w:r>
-      <w:proofErr w:type="spellStart"/>
-      <w:r>
-        <w:rPr>
-          <w:rFonts w:ascii="Times New Roman" w:hAnsi="Times New Roman" w:cs="Times New Roman"/>
-          <w:b/>
-          <w:bCs/>
-          <w:sz w:val="22"/>
-          <w:szCs w:val="22"/>
-        </w:rPr>
-        <w:t>tool_ID</w:t>
-      </w:r>
-      <w:proofErr w:type="spellEnd"/>
-      <w:r>
-        <w:rPr>
-          <w:rFonts w:ascii="Times New Roman" w:hAnsi="Times New Roman" w:cs="Times New Roman"/>
-          <w:b/>
-          <w:bCs/>
-          <w:sz w:val="22"/>
-          <w:szCs w:val="22"/>
-        </w:rPr>
-        <w:t xml:space="preserve"> in [“</w:t>
-      </w:r>
-      <w:proofErr w:type="spellStart"/>
-      <w:r>
-        <w:rPr>
-          <w:rFonts w:ascii="Times New Roman" w:hAnsi="Times New Roman" w:cs="Times New Roman"/>
-          <w:b/>
-          <w:bCs/>
-          <w:sz w:val="22"/>
-          <w:szCs w:val="22"/>
-        </w:rPr>
-        <w:t>divorce_complaint</w:t>
-      </w:r>
-      <w:proofErr w:type="spellEnd"/>
-      <w:r>
-        <w:rPr>
-          <w:rFonts w:ascii="Times New Roman" w:hAnsi="Times New Roman" w:cs="Times New Roman"/>
-          <w:b/>
-          <w:bCs/>
-          <w:sz w:val="22"/>
-          <w:szCs w:val="22"/>
-        </w:rPr>
-        <w:t>”, “</w:t>
-      </w:r>
-      <w:proofErr w:type="spellStart"/>
-      <w:r>
-        <w:rPr>
-          <w:rFonts w:ascii="Times New Roman" w:hAnsi="Times New Roman" w:cs="Times New Roman"/>
-          <w:b/>
-          <w:bCs/>
-          <w:sz w:val="22"/>
-          <w:szCs w:val="22"/>
-        </w:rPr>
-        <w:t>JOD_only</w:t>
-      </w:r>
-      <w:proofErr w:type="spellEnd"/>
-      <w:r>
-        <w:rPr>
-          <w:rFonts w:ascii="Times New Roman" w:hAnsi="Times New Roman" w:cs="Times New Roman"/>
-          <w:b/>
-          <w:bCs/>
-          <w:sz w:val="22"/>
-          <w:szCs w:val="22"/>
-        </w:rPr>
-        <w:t>”] %}</w:t>
-      </w:r>
-      <w:r>
-        <w:rPr>
-          <w:rFonts w:ascii="Times New Roman" w:hAnsi="Times New Roman" w:cs="Times New Roman"/>
-          <w:b/>
-          <w:bCs/>
-          <w:sz w:val="22"/>
-          <w:szCs w:val="22"/>
-        </w:rPr>
-        <w:t>Judgment of Divorce</w:t>
-      </w:r>
-      <w:r>
-        <w:rPr>
-          <w:rFonts w:ascii="Times New Roman" w:hAnsi="Times New Roman" w:cs="Times New Roman"/>
-          <w:b/>
-          <w:bCs/>
-          <w:sz w:val="22"/>
-          <w:szCs w:val="22"/>
-        </w:rPr>
-        <w:t xml:space="preserve">{% </w:t>
-      </w:r>
-      <w:proofErr w:type="spellStart"/>
-      <w:r>
-        <w:rPr>
-          <w:rFonts w:ascii="Times New Roman" w:hAnsi="Times New Roman" w:cs="Times New Roman"/>
-          <w:b/>
-          <w:bCs/>
-          <w:sz w:val="22"/>
-          <w:szCs w:val="22"/>
-        </w:rPr>
-        <w:t>elif</w:t>
-      </w:r>
-      <w:proofErr w:type="spellEnd"/>
-      <w:r>
-        <w:rPr>
-          <w:rFonts w:ascii="Times New Roman" w:hAnsi="Times New Roman" w:cs="Times New Roman"/>
-          <w:b/>
-          <w:bCs/>
-          <w:sz w:val="22"/>
-          <w:szCs w:val="22"/>
-        </w:rPr>
-        <w:t xml:space="preserve"> </w:t>
-      </w:r>
-      <w:proofErr w:type="spellStart"/>
-      <w:r>
-        <w:rPr>
-          <w:rFonts w:ascii="Times New Roman" w:hAnsi="Times New Roman" w:cs="Times New Roman"/>
-          <w:b/>
-          <w:bCs/>
-          <w:sz w:val="22"/>
-          <w:szCs w:val="22"/>
-        </w:rPr>
-        <w:t>tool_ID</w:t>
-      </w:r>
-      <w:proofErr w:type="spellEnd"/>
-      <w:r>
-        <w:rPr>
-          <w:rFonts w:ascii="Times New Roman" w:hAnsi="Times New Roman" w:cs="Times New Roman"/>
-          <w:b/>
-          <w:bCs/>
-          <w:sz w:val="22"/>
-          <w:szCs w:val="22"/>
-        </w:rPr>
-        <w:t xml:space="preserve"> == “</w:t>
-      </w:r>
-      <w:proofErr w:type="spellStart"/>
-      <w:r>
-        <w:rPr>
-          <w:rFonts w:ascii="Times New Roman" w:hAnsi="Times New Roman" w:cs="Times New Roman"/>
-          <w:b/>
-          <w:bCs/>
-          <w:sz w:val="22"/>
-          <w:szCs w:val="22"/>
-        </w:rPr>
-        <w:t>custody_complaint</w:t>
-      </w:r>
-      <w:proofErr w:type="spellEnd"/>
-      <w:r>
-        <w:rPr>
-          <w:rFonts w:ascii="Times New Roman" w:hAnsi="Times New Roman" w:cs="Times New Roman"/>
-          <w:b/>
-          <w:bCs/>
-          <w:sz w:val="22"/>
-          <w:szCs w:val="22"/>
-        </w:rPr>
-        <w:t>” %}Order Regarding</w:t>
-      </w:r>
-      <w:r>
-        <w:rPr>
-          <w:rFonts w:ascii="Times New Roman" w:hAnsi="Times New Roman" w:cs="Times New Roman"/>
-          <w:b/>
-          <w:bCs/>
-          <w:sz w:val="22"/>
-          <w:szCs w:val="22"/>
-        </w:rPr>
-        <w:t xml:space="preserve"> </w:t>
-      </w:r>
-      <w:r>
-        <w:rPr>
-          <w:rFonts w:ascii="Times New Roman" w:hAnsi="Times New Roman" w:cs="Times New Roman"/>
-          <w:b/>
-          <w:bCs/>
-          <w:sz w:val="22"/>
-          <w:szCs w:val="22"/>
-        </w:rPr>
-        <w:t>Custody, Parenting Time, and Child Support</w:t>
-      </w:r>
-      <w:r>
-        <w:rPr>
-          <w:rFonts w:ascii="Times New Roman" w:hAnsi="Times New Roman" w:cs="Times New Roman"/>
-          <w:b/>
-          <w:bCs/>
-          <w:sz w:val="22"/>
-          <w:szCs w:val="22"/>
-        </w:rPr>
-        <w:t>{% endif %}</w:t>
+        <w:t>Motion for Entry of Consent Judgment of Divorce</w:t>
       </w:r>
     </w:p>
     <w:p>
@@ -1472,7 +2006,17 @@
           <w:szCs w:val="22"/>
           <w:highlight w:val="yellow"/>
         </w:rPr>
-        <w:t xml:space="preserve"> == “plaintiff” %}</w:t>
+        <w:t xml:space="preserve"> == “plaintiff” </w:t>
+      </w:r>
+      <w:proofErr w:type="gramStart"/>
+      <w:r>
+        <w:rPr>
+          <w:rFonts w:ascii="Times New Roman" w:hAnsi="Times New Roman" w:cs="Times New Roman"/>
+          <w:sz w:val="22"/>
+          <w:szCs w:val="22"/>
+          <w:highlight w:val="yellow"/>
+        </w:rPr>
+        <w:t>%}</w:t>
       </w:r>
       <w:r>
         <w:rPr>
@@ -1482,6 +2026,7 @@
         </w:rPr>
         <w:t>Plaintiff</w:t>
       </w:r>
+      <w:proofErr w:type="gramEnd"/>
       <w:r>
         <w:rPr>
           <w:rFonts w:ascii="Times New Roman" w:hAnsi="Times New Roman" w:cs="Times New Roman"/>
@@ -1489,7 +2034,17 @@
           <w:szCs w:val="22"/>
           <w:highlight w:val="yellow"/>
         </w:rPr>
-        <w:t>{% else %}</w:t>
+        <w:t xml:space="preserve">{% else </w:t>
+      </w:r>
+      <w:proofErr w:type="gramStart"/>
+      <w:r>
+        <w:rPr>
+          <w:rFonts w:ascii="Times New Roman" w:hAnsi="Times New Roman" w:cs="Times New Roman"/>
+          <w:sz w:val="22"/>
+          <w:szCs w:val="22"/>
+          <w:highlight w:val="yellow"/>
+        </w:rPr>
+        <w:t>%}</w:t>
       </w:r>
       <w:r>
         <w:rPr>
@@ -1499,6 +2054,7 @@
         </w:rPr>
         <w:t>Defendant</w:t>
       </w:r>
+      <w:proofErr w:type="gramEnd"/>
       <w:r>
         <w:rPr>
           <w:rFonts w:ascii="Times New Roman" w:hAnsi="Times New Roman" w:cs="Times New Roman"/>
@@ -1667,335 +2223,25 @@
           <w:sz w:val="22"/>
           <w:szCs w:val="22"/>
         </w:rPr>
-        <w:t xml:space="preserve">request entry of </w:t>
-      </w:r>
-      <w:r>
-        <w:rPr>
-          <w:rFonts w:ascii="Times New Roman" w:hAnsi="Times New Roman" w:cs="Times New Roman"/>
-          <w:sz w:val="22"/>
-          <w:szCs w:val="22"/>
-        </w:rPr>
-        <w:t xml:space="preserve">{% if </w:t>
-      </w:r>
-      <w:proofErr w:type="spellStart"/>
-      <w:r>
-        <w:rPr>
-          <w:rFonts w:ascii="Times New Roman" w:hAnsi="Times New Roman" w:cs="Times New Roman"/>
-          <w:sz w:val="22"/>
-          <w:szCs w:val="22"/>
-        </w:rPr>
-        <w:t>tool_ID</w:t>
-      </w:r>
-      <w:proofErr w:type="spellEnd"/>
-      <w:r>
-        <w:rPr>
-          <w:rFonts w:ascii="Times New Roman" w:hAnsi="Times New Roman" w:cs="Times New Roman"/>
-          <w:sz w:val="22"/>
-          <w:szCs w:val="22"/>
-        </w:rPr>
-        <w:t xml:space="preserve"> in [“</w:t>
-      </w:r>
-      <w:proofErr w:type="spellStart"/>
-      <w:r>
-        <w:rPr>
-          <w:rFonts w:ascii="Times New Roman" w:hAnsi="Times New Roman" w:cs="Times New Roman"/>
-          <w:sz w:val="22"/>
-          <w:szCs w:val="22"/>
-        </w:rPr>
-        <w:t>divorce_complaint</w:t>
-      </w:r>
-      <w:proofErr w:type="spellEnd"/>
-      <w:r>
-        <w:rPr>
-          <w:rFonts w:ascii="Times New Roman" w:hAnsi="Times New Roman" w:cs="Times New Roman"/>
-          <w:sz w:val="22"/>
-          <w:szCs w:val="22"/>
-        </w:rPr>
-        <w:t>”, “</w:t>
-      </w:r>
-      <w:proofErr w:type="spellStart"/>
-      <w:r>
-        <w:rPr>
-          <w:rFonts w:ascii="Times New Roman" w:hAnsi="Times New Roman" w:cs="Times New Roman"/>
-          <w:sz w:val="22"/>
-          <w:szCs w:val="22"/>
-        </w:rPr>
-        <w:t>JOD_only</w:t>
-      </w:r>
-      <w:proofErr w:type="spellEnd"/>
-      <w:r>
-        <w:rPr>
-          <w:rFonts w:ascii="Times New Roman" w:hAnsi="Times New Roman" w:cs="Times New Roman"/>
-          <w:sz w:val="22"/>
-          <w:szCs w:val="22"/>
-        </w:rPr>
-        <w:t>”] %}</w:t>
-      </w:r>
-      <w:r>
-        <w:rPr>
-          <w:rFonts w:ascii="Times New Roman" w:hAnsi="Times New Roman" w:cs="Times New Roman"/>
-          <w:sz w:val="22"/>
-          <w:szCs w:val="22"/>
-        </w:rPr>
-        <w:t xml:space="preserve">a consent </w:t>
-      </w:r>
-      <w:r>
-        <w:rPr>
-          <w:rFonts w:ascii="Times New Roman" w:hAnsi="Times New Roman" w:cs="Times New Roman"/>
-          <w:sz w:val="22"/>
-          <w:szCs w:val="22"/>
-        </w:rPr>
-        <w:t xml:space="preserve">Judgment of Divorce{% </w:t>
-      </w:r>
-      <w:proofErr w:type="spellStart"/>
-      <w:r>
-        <w:rPr>
-          <w:rFonts w:ascii="Times New Roman" w:hAnsi="Times New Roman" w:cs="Times New Roman"/>
-          <w:sz w:val="22"/>
-          <w:szCs w:val="22"/>
-        </w:rPr>
-        <w:t>elif</w:t>
-      </w:r>
-      <w:proofErr w:type="spellEnd"/>
-      <w:r>
-        <w:rPr>
-          <w:rFonts w:ascii="Times New Roman" w:hAnsi="Times New Roman" w:cs="Times New Roman"/>
-          <w:sz w:val="22"/>
-          <w:szCs w:val="22"/>
-        </w:rPr>
-        <w:t xml:space="preserve"> </w:t>
-      </w:r>
-      <w:proofErr w:type="spellStart"/>
-      <w:r>
-        <w:rPr>
-          <w:rFonts w:ascii="Times New Roman" w:hAnsi="Times New Roman" w:cs="Times New Roman"/>
-          <w:sz w:val="22"/>
-          <w:szCs w:val="22"/>
-        </w:rPr>
-        <w:t>tool_ID</w:t>
-      </w:r>
-      <w:proofErr w:type="spellEnd"/>
-      <w:r>
-        <w:rPr>
-          <w:rFonts w:ascii="Times New Roman" w:hAnsi="Times New Roman" w:cs="Times New Roman"/>
-          <w:sz w:val="22"/>
-          <w:szCs w:val="22"/>
-        </w:rPr>
-        <w:t xml:space="preserve"> == “</w:t>
-      </w:r>
-      <w:proofErr w:type="spellStart"/>
-      <w:r>
-        <w:rPr>
-          <w:rFonts w:ascii="Times New Roman" w:hAnsi="Times New Roman" w:cs="Times New Roman"/>
-          <w:sz w:val="22"/>
-          <w:szCs w:val="22"/>
-        </w:rPr>
-        <w:t>custody_complaint</w:t>
-      </w:r>
-      <w:proofErr w:type="spellEnd"/>
-      <w:r>
-        <w:rPr>
-          <w:rFonts w:ascii="Times New Roman" w:hAnsi="Times New Roman" w:cs="Times New Roman"/>
-          <w:sz w:val="22"/>
-          <w:szCs w:val="22"/>
-        </w:rPr>
-        <w:t>” %}</w:t>
-      </w:r>
-      <w:r>
-        <w:rPr>
-          <w:rFonts w:ascii="Times New Roman" w:hAnsi="Times New Roman" w:cs="Times New Roman"/>
-          <w:sz w:val="22"/>
-          <w:szCs w:val="22"/>
-        </w:rPr>
-        <w:t xml:space="preserve">an </w:t>
-      </w:r>
-      <w:r>
-        <w:rPr>
-          <w:rFonts w:ascii="Times New Roman" w:hAnsi="Times New Roman" w:cs="Times New Roman"/>
-          <w:sz w:val="22"/>
-          <w:szCs w:val="22"/>
-        </w:rPr>
-        <w:t>Order Regarding Custody, Parenting Time, and Child Support{% endif %}</w:t>
-      </w:r>
-      <w:r>
-        <w:rPr>
-          <w:rFonts w:ascii="Times New Roman" w:hAnsi="Times New Roman" w:cs="Times New Roman"/>
-          <w:sz w:val="22"/>
-          <w:szCs w:val="22"/>
-        </w:rPr>
-        <w:t xml:space="preserve">. </w:t>
-      </w:r>
-      <w:r>
-        <w:rPr>
-          <w:rFonts w:ascii="Times New Roman" w:hAnsi="Times New Roman" w:cs="Times New Roman"/>
-          <w:sz w:val="22"/>
-          <w:szCs w:val="22"/>
-        </w:rPr>
-        <w:t xml:space="preserve">{% if </w:t>
-      </w:r>
-      <w:proofErr w:type="spellStart"/>
-      <w:r>
-        <w:rPr>
-          <w:rFonts w:ascii="Times New Roman" w:hAnsi="Times New Roman" w:cs="Times New Roman"/>
-          <w:sz w:val="22"/>
-          <w:szCs w:val="22"/>
-        </w:rPr>
-        <w:t>tool_ID</w:t>
-      </w:r>
-      <w:proofErr w:type="spellEnd"/>
-      <w:r>
-        <w:rPr>
-          <w:rFonts w:ascii="Times New Roman" w:hAnsi="Times New Roman" w:cs="Times New Roman"/>
-          <w:sz w:val="22"/>
-          <w:szCs w:val="22"/>
-        </w:rPr>
-        <w:t xml:space="preserve"> in [“</w:t>
-      </w:r>
-      <w:proofErr w:type="spellStart"/>
-      <w:r>
-        <w:rPr>
-          <w:rFonts w:ascii="Times New Roman" w:hAnsi="Times New Roman" w:cs="Times New Roman"/>
-          <w:sz w:val="22"/>
-          <w:szCs w:val="22"/>
-        </w:rPr>
-        <w:t>divorce_complaint</w:t>
-      </w:r>
-      <w:proofErr w:type="spellEnd"/>
-      <w:r>
-        <w:rPr>
-          <w:rFonts w:ascii="Times New Roman" w:hAnsi="Times New Roman" w:cs="Times New Roman"/>
-          <w:sz w:val="22"/>
-          <w:szCs w:val="22"/>
-        </w:rPr>
-        <w:t>”, “</w:t>
-      </w:r>
-      <w:proofErr w:type="spellStart"/>
-      <w:r>
-        <w:rPr>
-          <w:rFonts w:ascii="Times New Roman" w:hAnsi="Times New Roman" w:cs="Times New Roman"/>
-          <w:sz w:val="22"/>
-          <w:szCs w:val="22"/>
-        </w:rPr>
-        <w:t>JOD_only</w:t>
-      </w:r>
-      <w:proofErr w:type="spellEnd"/>
-      <w:r>
-        <w:rPr>
-          <w:rFonts w:ascii="Times New Roman" w:hAnsi="Times New Roman" w:cs="Times New Roman"/>
-          <w:sz w:val="22"/>
-          <w:szCs w:val="22"/>
-        </w:rPr>
-        <w:t>”] %}</w:t>
-      </w:r>
-      <w:r>
-        <w:rPr>
-          <w:rFonts w:ascii="Times New Roman" w:hAnsi="Times New Roman" w:cs="Times New Roman"/>
-          <w:sz w:val="22"/>
-          <w:szCs w:val="22"/>
-        </w:rPr>
-        <w:t>The parties agree on all of the terms of the Judgment of Divorce and have signed a proposed Judgment of Divorce to indicate our agreement.</w:t>
-      </w:r>
-      <w:r>
-        <w:rPr>
-          <w:rFonts w:ascii="Times New Roman" w:hAnsi="Times New Roman" w:cs="Times New Roman"/>
-          <w:sz w:val="22"/>
-          <w:szCs w:val="22"/>
-        </w:rPr>
-        <w:t xml:space="preserve">{% </w:t>
-      </w:r>
-      <w:proofErr w:type="spellStart"/>
-      <w:r>
-        <w:rPr>
-          <w:rFonts w:ascii="Times New Roman" w:hAnsi="Times New Roman" w:cs="Times New Roman"/>
-          <w:sz w:val="22"/>
-          <w:szCs w:val="22"/>
-        </w:rPr>
-        <w:t>elif</w:t>
-      </w:r>
-      <w:proofErr w:type="spellEnd"/>
-      <w:r>
-        <w:rPr>
-          <w:rFonts w:ascii="Times New Roman" w:hAnsi="Times New Roman" w:cs="Times New Roman"/>
-          <w:sz w:val="22"/>
-          <w:szCs w:val="22"/>
-        </w:rPr>
-        <w:t xml:space="preserve"> </w:t>
-      </w:r>
-      <w:proofErr w:type="spellStart"/>
-      <w:r>
-        <w:rPr>
-          <w:rFonts w:ascii="Times New Roman" w:hAnsi="Times New Roman" w:cs="Times New Roman"/>
-          <w:sz w:val="22"/>
-          <w:szCs w:val="22"/>
-        </w:rPr>
-        <w:t>tool_ID</w:t>
-      </w:r>
-      <w:proofErr w:type="spellEnd"/>
-      <w:r>
-        <w:rPr>
-          <w:rFonts w:ascii="Times New Roman" w:hAnsi="Times New Roman" w:cs="Times New Roman"/>
-          <w:sz w:val="22"/>
-          <w:szCs w:val="22"/>
-        </w:rPr>
-        <w:t xml:space="preserve"> == “</w:t>
-      </w:r>
-      <w:proofErr w:type="spellStart"/>
-      <w:r>
-        <w:rPr>
-          <w:rFonts w:ascii="Times New Roman" w:hAnsi="Times New Roman" w:cs="Times New Roman"/>
-          <w:sz w:val="22"/>
-          <w:szCs w:val="22"/>
-        </w:rPr>
-        <w:t>custody_complaint</w:t>
-      </w:r>
-      <w:proofErr w:type="spellEnd"/>
-      <w:r>
-        <w:rPr>
-          <w:rFonts w:ascii="Times New Roman" w:hAnsi="Times New Roman" w:cs="Times New Roman"/>
-          <w:sz w:val="22"/>
-          <w:szCs w:val="22"/>
-        </w:rPr>
-        <w:t>” %}The</w:t>
-      </w:r>
-      <w:r>
-        <w:rPr>
-          <w:rFonts w:ascii="Times New Roman" w:hAnsi="Times New Roman" w:cs="Times New Roman"/>
-          <w:sz w:val="22"/>
-          <w:szCs w:val="22"/>
-        </w:rPr>
-        <w:t xml:space="preserve"> </w:t>
-      </w:r>
-      <w:r>
-        <w:rPr>
-          <w:rFonts w:ascii="Times New Roman" w:hAnsi="Times New Roman" w:cs="Times New Roman"/>
-          <w:sz w:val="22"/>
-          <w:szCs w:val="22"/>
-        </w:rPr>
-        <w:t>parties agree on all of the terms of the order and have signed a proposed Order Regarding</w:t>
-      </w:r>
-      <w:r>
-        <w:rPr>
-          <w:rFonts w:ascii="Times New Roman" w:hAnsi="Times New Roman" w:cs="Times New Roman"/>
-          <w:sz w:val="22"/>
-          <w:szCs w:val="22"/>
-        </w:rPr>
-        <w:t xml:space="preserve"> </w:t>
-      </w:r>
-      <w:r>
-        <w:rPr>
-          <w:rFonts w:ascii="Times New Roman" w:hAnsi="Times New Roman" w:cs="Times New Roman"/>
-          <w:sz w:val="22"/>
-          <w:szCs w:val="22"/>
-        </w:rPr>
-        <w:t>Custody, Parenting Time, and Child Support to indicate our agreement.</w:t>
-      </w:r>
-      <w:r>
-        <w:rPr>
-          <w:rFonts w:ascii="Times New Roman" w:hAnsi="Times New Roman" w:cs="Times New Roman"/>
-          <w:sz w:val="22"/>
-          <w:szCs w:val="22"/>
-        </w:rPr>
-        <w:t>{% endif %}</w:t>
+        <w:t xml:space="preserve">request entry of a Consent Judgment of Divorce. The parties agree on </w:t>
+      </w:r>
+      <w:proofErr w:type="gramStart"/>
+      <w:r>
+        <w:rPr>
+          <w:rFonts w:ascii="Times New Roman" w:hAnsi="Times New Roman" w:cs="Times New Roman"/>
+          <w:sz w:val="22"/>
+          <w:szCs w:val="22"/>
+        </w:rPr>
+        <w:t>all of</w:t>
+      </w:r>
+      <w:proofErr w:type="gramEnd"/>
+      <w:r>
+        <w:rPr>
+          <w:rFonts w:ascii="Times New Roman" w:hAnsi="Times New Roman" w:cs="Times New Roman"/>
+          <w:sz w:val="22"/>
+          <w:szCs w:val="22"/>
+        </w:rPr>
+        <w:t xml:space="preserve"> the terms of the Judgment of Divorce and have signed a proposed Judgment of Divorce to indicate our agreement.</w:t>
       </w:r>
     </w:p>
     <w:p>

</xml_diff>

<commit_message>
Revert "Revert "update divorce answer branch with custody complaint work""
</commit_message>
<xml_diff>
--- a/docassemble/MLHDivorceAndCustody/data/templates/noh_motion_consent.docx
+++ b/docassemble/MLHDivorceAndCustody/data/templates/noh_motion_consent.docx
@@ -37,16 +37,7 @@
           <w:sz w:val="22"/>
           <w:szCs w:val="22"/>
         </w:rPr>
-        <w:t xml:space="preserve">IN THE FAMILY DIVISION FOR </w:t>
-      </w:r>
-      <w:proofErr w:type="gramStart"/>
-      <w:r>
-        <w:rPr>
-          <w:rFonts w:ascii="Times New Roman" w:hAnsi="Times New Roman" w:cs="Times New Roman"/>
-          <w:sz w:val="22"/>
-          <w:szCs w:val="22"/>
-        </w:rPr>
-        <w:t xml:space="preserve">THE  {{ </w:t>
+        <w:t xml:space="preserve">IN THE FAMILY DIVISION FOR THE  {{ </w:t>
       </w:r>
       <w:proofErr w:type="spellStart"/>
       <w:r>
@@ -55,28 +46,9 @@
           <w:sz w:val="22"/>
           <w:szCs w:val="22"/>
         </w:rPr>
-        <w:t>the</w:t>
-      </w:r>
-      <w:proofErr w:type="gramEnd"/>
-      <w:r>
-        <w:rPr>
-          <w:rFonts w:ascii="Times New Roman" w:hAnsi="Times New Roman" w:cs="Times New Roman"/>
-          <w:sz w:val="22"/>
-          <w:szCs w:val="22"/>
-        </w:rPr>
-        <w:t>_</w:t>
-      </w:r>
-      <w:proofErr w:type="gramStart"/>
-      <w:r>
-        <w:rPr>
-          <w:rFonts w:ascii="Times New Roman" w:hAnsi="Times New Roman" w:cs="Times New Roman"/>
-          <w:sz w:val="22"/>
-          <w:szCs w:val="22"/>
-        </w:rPr>
-        <w:t>court.number</w:t>
+        <w:t>the_court.number</w:t>
       </w:r>
       <w:proofErr w:type="spellEnd"/>
-      <w:proofErr w:type="gramEnd"/>
       <w:r>
         <w:rPr>
           <w:rFonts w:ascii="Times New Roman" w:hAnsi="Times New Roman" w:cs="Times New Roman"/>
@@ -102,16 +74,7 @@
           <w:sz w:val="22"/>
           <w:szCs w:val="22"/>
         </w:rPr>
-        <w:t xml:space="preserve">COUNTY OF </w:t>
-      </w:r>
-      <w:proofErr w:type="gramStart"/>
-      <w:r>
-        <w:rPr>
-          <w:rFonts w:ascii="Times New Roman" w:hAnsi="Times New Roman" w:cs="Times New Roman"/>
-          <w:sz w:val="22"/>
-          <w:szCs w:val="22"/>
-        </w:rPr>
-        <w:t xml:space="preserve">{{ </w:t>
+        <w:t xml:space="preserve">COUNTY OF {{ </w:t>
       </w:r>
       <w:proofErr w:type="spellStart"/>
       <w:r>
@@ -120,16 +83,7 @@
           <w:sz w:val="22"/>
           <w:szCs w:val="22"/>
         </w:rPr>
-        <w:t>county</w:t>
-      </w:r>
-      <w:proofErr w:type="gramEnd"/>
-      <w:r>
-        <w:rPr>
-          <w:rFonts w:ascii="Times New Roman" w:hAnsi="Times New Roman" w:cs="Times New Roman"/>
-          <w:sz w:val="22"/>
-          <w:szCs w:val="22"/>
-        </w:rPr>
-        <w:t>_choice</w:t>
+        <w:t>county_choice</w:t>
       </w:r>
       <w:proofErr w:type="spellEnd"/>
       <w:r>
@@ -138,25 +92,7 @@
           <w:sz w:val="22"/>
           <w:szCs w:val="22"/>
         </w:rPr>
-        <w:t xml:space="preserve"> | </w:t>
-      </w:r>
-      <w:proofErr w:type="gramStart"/>
-      <w:r>
-        <w:rPr>
-          <w:rFonts w:ascii="Times New Roman" w:hAnsi="Times New Roman" w:cs="Times New Roman"/>
-          <w:sz w:val="22"/>
-          <w:szCs w:val="22"/>
-        </w:rPr>
-        <w:t>upper }</w:t>
-      </w:r>
-      <w:proofErr w:type="gramEnd"/>
-      <w:r>
-        <w:rPr>
-          <w:rFonts w:ascii="Times New Roman" w:hAnsi="Times New Roman" w:cs="Times New Roman"/>
-          <w:sz w:val="22"/>
-          <w:szCs w:val="22"/>
-        </w:rPr>
-        <w:t>}</w:t>
+        <w:t xml:space="preserve"> | upper }}</w:t>
       </w:r>
     </w:p>
     <w:p>
@@ -213,23 +149,13 @@
                 <w:szCs w:val="22"/>
               </w:rPr>
             </w:pPr>
-            <w:proofErr w:type="gramStart"/>
             <w:r>
               <w:rPr>
                 <w:rFonts w:ascii="Times New Roman" w:hAnsi="Times New Roman" w:cs="Times New Roman"/>
                 <w:sz w:val="22"/>
                 <w:szCs w:val="22"/>
               </w:rPr>
-              <w:t>{{ plaintiffs</w:t>
-            </w:r>
-            <w:proofErr w:type="gramEnd"/>
-            <w:r>
-              <w:rPr>
-                <w:rFonts w:ascii="Times New Roman" w:hAnsi="Times New Roman" w:cs="Times New Roman"/>
-                <w:sz w:val="22"/>
-                <w:szCs w:val="22"/>
-              </w:rPr>
-              <w:t>[0].</w:t>
+              <w:t>{{ plaintiffs[0].</w:t>
             </w:r>
             <w:proofErr w:type="spellStart"/>
             <w:r>
@@ -238,16 +164,7 @@
                 <w:sz w:val="22"/>
                 <w:szCs w:val="22"/>
               </w:rPr>
-              <w:t>name_</w:t>
-            </w:r>
-            <w:proofErr w:type="gramStart"/>
-            <w:r>
-              <w:rPr>
-                <w:rFonts w:ascii="Times New Roman" w:hAnsi="Times New Roman" w:cs="Times New Roman"/>
-                <w:sz w:val="22"/>
-                <w:szCs w:val="22"/>
-              </w:rPr>
-              <w:t>full</w:t>
+              <w:t>name_full</w:t>
             </w:r>
             <w:proofErr w:type="spellEnd"/>
             <w:r>
@@ -256,16 +173,7 @@
                 <w:sz w:val="22"/>
                 <w:szCs w:val="22"/>
               </w:rPr>
-              <w:t>() }</w:t>
-            </w:r>
-            <w:proofErr w:type="gramEnd"/>
-            <w:r>
-              <w:rPr>
-                <w:rFonts w:ascii="Times New Roman" w:hAnsi="Times New Roman" w:cs="Times New Roman"/>
-                <w:sz w:val="22"/>
-                <w:szCs w:val="22"/>
-              </w:rPr>
-              <w:t>}</w:t>
+              <w:t>() }}</w:t>
             </w:r>
           </w:p>
           <w:p>
@@ -333,23 +241,13 @@
                 <w:szCs w:val="22"/>
               </w:rPr>
             </w:pPr>
-            <w:proofErr w:type="gramStart"/>
             <w:r>
               <w:rPr>
                 <w:rFonts w:ascii="Times New Roman" w:hAnsi="Times New Roman" w:cs="Times New Roman"/>
                 <w:sz w:val="22"/>
                 <w:szCs w:val="22"/>
               </w:rPr>
-              <w:t>{{ defendants</w:t>
-            </w:r>
-            <w:proofErr w:type="gramEnd"/>
-            <w:r>
-              <w:rPr>
-                <w:rFonts w:ascii="Times New Roman" w:hAnsi="Times New Roman" w:cs="Times New Roman"/>
-                <w:sz w:val="22"/>
-                <w:szCs w:val="22"/>
-              </w:rPr>
-              <w:t>[0].</w:t>
+              <w:t>{{ defendants[0].</w:t>
             </w:r>
             <w:proofErr w:type="spellStart"/>
             <w:r>
@@ -358,16 +256,7 @@
                 <w:sz w:val="22"/>
                 <w:szCs w:val="22"/>
               </w:rPr>
-              <w:t>name_</w:t>
-            </w:r>
-            <w:proofErr w:type="gramStart"/>
-            <w:r>
-              <w:rPr>
-                <w:rFonts w:ascii="Times New Roman" w:hAnsi="Times New Roman" w:cs="Times New Roman"/>
-                <w:sz w:val="22"/>
-                <w:szCs w:val="22"/>
-              </w:rPr>
-              <w:t>full</w:t>
+              <w:t>name_full</w:t>
             </w:r>
             <w:proofErr w:type="spellEnd"/>
             <w:r>
@@ -376,16 +265,7 @@
                 <w:sz w:val="22"/>
                 <w:szCs w:val="22"/>
               </w:rPr>
-              <w:t>() }</w:t>
-            </w:r>
-            <w:proofErr w:type="gramEnd"/>
-            <w:r>
-              <w:rPr>
-                <w:rFonts w:ascii="Times New Roman" w:hAnsi="Times New Roman" w:cs="Times New Roman"/>
-                <w:sz w:val="22"/>
-                <w:szCs w:val="22"/>
-              </w:rPr>
-              <w:t>}</w:t>
+              <w:t>() }}</w:t>
             </w:r>
           </w:p>
           <w:p>
@@ -484,7 +364,6 @@
               </w:rPr>
               <w:t xml:space="preserve"> </w:t>
             </w:r>
-            <w:proofErr w:type="gramStart"/>
             <w:r>
               <w:rPr>
                 <w:rFonts w:ascii="Times New Roman" w:hAnsi="Times New Roman" w:cs="Times New Roman"/>
@@ -502,27 +381,7 @@
                 <w:szCs w:val="22"/>
                 <w:u w:val="single"/>
               </w:rPr>
-              <w:t>docket</w:t>
-            </w:r>
-            <w:proofErr w:type="gramEnd"/>
-            <w:r>
-              <w:rPr>
-                <w:rFonts w:ascii="Times New Roman" w:hAnsi="Times New Roman" w:cs="Times New Roman"/>
-                <w:sz w:val="22"/>
-                <w:szCs w:val="22"/>
-                <w:u w:val="single"/>
-              </w:rPr>
-              <w:t>_</w:t>
-            </w:r>
-            <w:proofErr w:type="gramStart"/>
-            <w:r>
-              <w:rPr>
-                <w:rFonts w:ascii="Times New Roman" w:hAnsi="Times New Roman" w:cs="Times New Roman"/>
-                <w:sz w:val="22"/>
-                <w:szCs w:val="22"/>
-                <w:u w:val="single"/>
-              </w:rPr>
-              <w:t>number</w:t>
+              <w:t>docket_number</w:t>
             </w:r>
             <w:proofErr w:type="spellEnd"/>
             <w:r>
@@ -532,17 +391,7 @@
                 <w:szCs w:val="22"/>
                 <w:u w:val="single"/>
               </w:rPr>
-              <w:t xml:space="preserve"> }</w:t>
-            </w:r>
-            <w:proofErr w:type="gramEnd"/>
-            <w:r>
-              <w:rPr>
-                <w:rFonts w:ascii="Times New Roman" w:hAnsi="Times New Roman" w:cs="Times New Roman"/>
-                <w:sz w:val="22"/>
-                <w:szCs w:val="22"/>
-                <w:u w:val="single"/>
-              </w:rPr>
-              <w:t>}</w:t>
+              <w:t xml:space="preserve"> }}</w:t>
             </w:r>
           </w:p>
           <w:p>
@@ -602,23 +451,13 @@
           <w:szCs w:val="21"/>
         </w:rPr>
       </w:pPr>
-      <w:proofErr w:type="gramStart"/>
-      <w:r>
-        <w:rPr>
-          <w:rFonts w:ascii="Times New Roman" w:hAnsi="Times New Roman" w:cs="Times New Roman"/>
-          <w:sz w:val="21"/>
-          <w:szCs w:val="21"/>
-        </w:rPr>
-        <w:t>{{ plaintiffs</w:t>
-      </w:r>
-      <w:proofErr w:type="gramEnd"/>
-      <w:r>
-        <w:rPr>
-          <w:rFonts w:ascii="Times New Roman" w:hAnsi="Times New Roman" w:cs="Times New Roman"/>
-          <w:sz w:val="21"/>
-          <w:szCs w:val="21"/>
-        </w:rPr>
-        <w:t>[0].</w:t>
+      <w:r>
+        <w:rPr>
+          <w:rFonts w:ascii="Times New Roman" w:hAnsi="Times New Roman" w:cs="Times New Roman"/>
+          <w:sz w:val="21"/>
+          <w:szCs w:val="21"/>
+        </w:rPr>
+        <w:t>{{ plaintiffs[0].</w:t>
       </w:r>
       <w:proofErr w:type="spellStart"/>
       <w:r>
@@ -627,16 +466,7 @@
           <w:sz w:val="21"/>
           <w:szCs w:val="21"/>
         </w:rPr>
-        <w:t>name_</w:t>
-      </w:r>
-      <w:proofErr w:type="gramStart"/>
-      <w:r>
-        <w:rPr>
-          <w:rFonts w:ascii="Times New Roman" w:hAnsi="Times New Roman" w:cs="Times New Roman"/>
-          <w:sz w:val="21"/>
-          <w:szCs w:val="21"/>
-        </w:rPr>
-        <w:t>full</w:t>
+        <w:t>name_full</w:t>
       </w:r>
       <w:proofErr w:type="spellEnd"/>
       <w:r>
@@ -645,16 +475,7 @@
           <w:sz w:val="21"/>
           <w:szCs w:val="21"/>
         </w:rPr>
-        <w:t>() }</w:t>
-      </w:r>
-      <w:proofErr w:type="gramEnd"/>
-      <w:r>
-        <w:rPr>
-          <w:rFonts w:ascii="Times New Roman" w:hAnsi="Times New Roman" w:cs="Times New Roman"/>
-          <w:sz w:val="21"/>
-          <w:szCs w:val="21"/>
-        </w:rPr>
-        <w:t>}</w:t>
+        <w:t>() }}</w:t>
       </w:r>
     </w:p>
     <w:p>
@@ -757,32 +578,13 @@
           <w:szCs w:val="21"/>
         </w:rPr>
       </w:pPr>
-      <w:proofErr w:type="gramStart"/>
-      <w:r>
-        <w:rPr>
-          <w:rFonts w:ascii="Times New Roman" w:hAnsi="Times New Roman" w:cs="Times New Roman"/>
-          <w:sz w:val="21"/>
-          <w:szCs w:val="21"/>
-        </w:rPr>
-        <w:t>{{ plaintiffs</w:t>
-      </w:r>
-      <w:proofErr w:type="gramEnd"/>
-      <w:r>
-        <w:rPr>
-          <w:rFonts w:ascii="Times New Roman" w:hAnsi="Times New Roman" w:cs="Times New Roman"/>
-          <w:sz w:val="21"/>
-          <w:szCs w:val="21"/>
-        </w:rPr>
-        <w:t>[0</w:t>
-      </w:r>
-      <w:proofErr w:type="gramStart"/>
-      <w:r>
-        <w:rPr>
-          <w:rFonts w:ascii="Times New Roman" w:hAnsi="Times New Roman" w:cs="Times New Roman"/>
-          <w:sz w:val="21"/>
-          <w:szCs w:val="21"/>
-        </w:rPr>
-        <w:t>].</w:t>
+      <w:r>
+        <w:rPr>
+          <w:rFonts w:ascii="Times New Roman" w:hAnsi="Times New Roman" w:cs="Times New Roman"/>
+          <w:sz w:val="21"/>
+          <w:szCs w:val="21"/>
+        </w:rPr>
+        <w:t>{{ plaintiffs[0].</w:t>
       </w:r>
       <w:proofErr w:type="spellStart"/>
       <w:r>
@@ -791,25 +593,7 @@
           <w:sz w:val="21"/>
           <w:szCs w:val="21"/>
         </w:rPr>
-        <w:t>address</w:t>
-      </w:r>
-      <w:proofErr w:type="gramEnd"/>
-      <w:r>
-        <w:rPr>
-          <w:rFonts w:ascii="Times New Roman" w:hAnsi="Times New Roman" w:cs="Times New Roman"/>
-          <w:sz w:val="21"/>
-          <w:szCs w:val="21"/>
-        </w:rPr>
-        <w:t>.line_</w:t>
-      </w:r>
-      <w:proofErr w:type="gramStart"/>
-      <w:r>
-        <w:rPr>
-          <w:rFonts w:ascii="Times New Roman" w:hAnsi="Times New Roman" w:cs="Times New Roman"/>
-          <w:sz w:val="21"/>
-          <w:szCs w:val="21"/>
-        </w:rPr>
-        <w:t>one</w:t>
+        <w:t>address.line_one</w:t>
       </w:r>
       <w:proofErr w:type="spellEnd"/>
       <w:r>
@@ -818,16 +602,7 @@
           <w:sz w:val="21"/>
           <w:szCs w:val="21"/>
         </w:rPr>
-        <w:t>() }</w:t>
-      </w:r>
-      <w:proofErr w:type="gramEnd"/>
-      <w:r>
-        <w:rPr>
-          <w:rFonts w:ascii="Times New Roman" w:hAnsi="Times New Roman" w:cs="Times New Roman"/>
-          <w:sz w:val="21"/>
-          <w:szCs w:val="21"/>
-        </w:rPr>
-        <w:t>}</w:t>
+        <w:t>() }}</w:t>
       </w:r>
     </w:p>
     <w:p>
@@ -840,32 +615,13 @@
           <w:szCs w:val="21"/>
         </w:rPr>
       </w:pPr>
-      <w:proofErr w:type="gramStart"/>
-      <w:r>
-        <w:rPr>
-          <w:rFonts w:ascii="Times New Roman" w:hAnsi="Times New Roman" w:cs="Times New Roman"/>
-          <w:sz w:val="21"/>
-          <w:szCs w:val="21"/>
-        </w:rPr>
-        <w:t>{{ plaintiffs</w:t>
-      </w:r>
-      <w:proofErr w:type="gramEnd"/>
-      <w:r>
-        <w:rPr>
-          <w:rFonts w:ascii="Times New Roman" w:hAnsi="Times New Roman" w:cs="Times New Roman"/>
-          <w:sz w:val="21"/>
-          <w:szCs w:val="21"/>
-        </w:rPr>
-        <w:t>[0</w:t>
-      </w:r>
-      <w:proofErr w:type="gramStart"/>
-      <w:r>
-        <w:rPr>
-          <w:rFonts w:ascii="Times New Roman" w:hAnsi="Times New Roman" w:cs="Times New Roman"/>
-          <w:sz w:val="21"/>
-          <w:szCs w:val="21"/>
-        </w:rPr>
-        <w:t>].</w:t>
+      <w:r>
+        <w:rPr>
+          <w:rFonts w:ascii="Times New Roman" w:hAnsi="Times New Roman" w:cs="Times New Roman"/>
+          <w:sz w:val="21"/>
+          <w:szCs w:val="21"/>
+        </w:rPr>
+        <w:t>{{ plaintiffs[0].</w:t>
       </w:r>
       <w:proofErr w:type="spellStart"/>
       <w:r>
@@ -874,25 +630,7 @@
           <w:sz w:val="21"/>
           <w:szCs w:val="21"/>
         </w:rPr>
-        <w:t>address</w:t>
-      </w:r>
-      <w:proofErr w:type="gramEnd"/>
-      <w:r>
-        <w:rPr>
-          <w:rFonts w:ascii="Times New Roman" w:hAnsi="Times New Roman" w:cs="Times New Roman"/>
-          <w:sz w:val="21"/>
-          <w:szCs w:val="21"/>
-        </w:rPr>
-        <w:t>.line_</w:t>
-      </w:r>
-      <w:proofErr w:type="gramStart"/>
-      <w:r>
-        <w:rPr>
-          <w:rFonts w:ascii="Times New Roman" w:hAnsi="Times New Roman" w:cs="Times New Roman"/>
-          <w:sz w:val="21"/>
-          <w:szCs w:val="21"/>
-        </w:rPr>
-        <w:t>two</w:t>
+        <w:t>address.line_two</w:t>
       </w:r>
       <w:proofErr w:type="spellEnd"/>
       <w:r>
@@ -901,16 +639,7 @@
           <w:sz w:val="21"/>
           <w:szCs w:val="21"/>
         </w:rPr>
-        <w:t>() }</w:t>
-      </w:r>
-      <w:proofErr w:type="gramEnd"/>
-      <w:r>
-        <w:rPr>
-          <w:rFonts w:ascii="Times New Roman" w:hAnsi="Times New Roman" w:cs="Times New Roman"/>
-          <w:sz w:val="21"/>
-          <w:szCs w:val="21"/>
-        </w:rPr>
-        <w:t>}</w:t>
+        <w:t>() }}</w:t>
       </w:r>
     </w:p>
     <w:p>
@@ -931,23 +660,13 @@
         </w:rPr>
         <w:t xml:space="preserve">{% if </w:t>
       </w:r>
-      <w:proofErr w:type="gramStart"/>
-      <w:r>
-        <w:rPr>
-          <w:rFonts w:ascii="Times New Roman" w:hAnsi="Times New Roman" w:cs="Times New Roman"/>
-          <w:sz w:val="21"/>
-          <w:szCs w:val="21"/>
-        </w:rPr>
-        <w:t>plaintiffs[</w:t>
-      </w:r>
-      <w:proofErr w:type="gramEnd"/>
-      <w:r>
-        <w:rPr>
-          <w:rFonts w:ascii="Times New Roman" w:hAnsi="Times New Roman" w:cs="Times New Roman"/>
-          <w:sz w:val="21"/>
-          <w:szCs w:val="21"/>
-        </w:rPr>
-        <w:t>0].</w:t>
+      <w:r>
+        <w:rPr>
+          <w:rFonts w:ascii="Times New Roman" w:hAnsi="Times New Roman" w:cs="Times New Roman"/>
+          <w:sz w:val="21"/>
+          <w:szCs w:val="21"/>
+        </w:rPr>
+        <w:t>plaintiffs[0].</w:t>
       </w:r>
       <w:proofErr w:type="spellStart"/>
       <w:r>
@@ -965,33 +684,15 @@
           <w:sz w:val="21"/>
           <w:szCs w:val="21"/>
         </w:rPr>
-        <w:t xml:space="preserve"> </w:t>
-      </w:r>
-      <w:proofErr w:type="gramStart"/>
-      <w:r>
-        <w:rPr>
-          <w:rFonts w:ascii="Times New Roman" w:hAnsi="Times New Roman" w:cs="Times New Roman"/>
-          <w:sz w:val="21"/>
-          <w:szCs w:val="21"/>
-        </w:rPr>
-        <w:t>%}</w:t>
-      </w:r>
-      <w:r>
-        <w:rPr>
-          <w:rFonts w:ascii="Times New Roman" w:hAnsi="Times New Roman" w:cs="Times New Roman"/>
-          <w:sz w:val="21"/>
-          <w:szCs w:val="21"/>
-        </w:rPr>
-        <w:t>{</w:t>
-      </w:r>
-      <w:proofErr w:type="gramEnd"/>
-      <w:r>
-        <w:rPr>
-          <w:rFonts w:ascii="Times New Roman" w:hAnsi="Times New Roman" w:cs="Times New Roman"/>
-          <w:sz w:val="21"/>
-          <w:szCs w:val="21"/>
-        </w:rPr>
-        <w:t xml:space="preserve">% if </w:t>
+        <w:t xml:space="preserve"> %}</w:t>
+      </w:r>
+      <w:r>
+        <w:rPr>
+          <w:rFonts w:ascii="Times New Roman" w:hAnsi="Times New Roman" w:cs="Times New Roman"/>
+          <w:sz w:val="21"/>
+          <w:szCs w:val="21"/>
+        </w:rPr>
+        <w:t xml:space="preserve">{% if </w:t>
       </w:r>
       <w:proofErr w:type="spellStart"/>
       <w:r>
@@ -1009,106 +710,7 @@
           <w:sz w:val="21"/>
           <w:szCs w:val="21"/>
         </w:rPr>
-        <w:t xml:space="preserve"> == “plaintiff” </w:t>
-      </w:r>
-      <w:proofErr w:type="gramStart"/>
-      <w:r>
-        <w:rPr>
-          <w:rFonts w:ascii="Times New Roman" w:hAnsi="Times New Roman" w:cs="Times New Roman"/>
-          <w:sz w:val="21"/>
-          <w:szCs w:val="21"/>
-        </w:rPr>
-        <w:t>%}Does</w:t>
-      </w:r>
-      <w:proofErr w:type="gramEnd"/>
-      <w:r>
-        <w:rPr>
-          <w:rFonts w:ascii="Times New Roman" w:hAnsi="Times New Roman" w:cs="Times New Roman"/>
-          <w:sz w:val="21"/>
-          <w:szCs w:val="21"/>
-        </w:rPr>
-        <w:t xml:space="preserve"> not have </w:t>
-      </w:r>
-      <w:proofErr w:type="gramStart"/>
-      <w:r>
-        <w:rPr>
-          <w:rFonts w:ascii="Times New Roman" w:hAnsi="Times New Roman" w:cs="Times New Roman"/>
-          <w:sz w:val="21"/>
-          <w:szCs w:val="21"/>
-        </w:rPr>
-        <w:t>phone{</w:t>
-      </w:r>
-      <w:proofErr w:type="gramEnd"/>
-      <w:r>
-        <w:rPr>
-          <w:rFonts w:ascii="Times New Roman" w:hAnsi="Times New Roman" w:cs="Times New Roman"/>
-          <w:sz w:val="21"/>
-          <w:szCs w:val="21"/>
-        </w:rPr>
-        <w:t xml:space="preserve">% else </w:t>
-      </w:r>
-      <w:proofErr w:type="gramStart"/>
-      <w:r>
-        <w:rPr>
-          <w:rFonts w:ascii="Times New Roman" w:hAnsi="Times New Roman" w:cs="Times New Roman"/>
-          <w:sz w:val="21"/>
-          <w:szCs w:val="21"/>
-        </w:rPr>
-        <w:t>%}Unknown</w:t>
-      </w:r>
-      <w:proofErr w:type="gramEnd"/>
-      <w:r>
-        <w:rPr>
-          <w:rFonts w:ascii="Times New Roman" w:hAnsi="Times New Roman" w:cs="Times New Roman"/>
-          <w:sz w:val="21"/>
-          <w:szCs w:val="21"/>
-        </w:rPr>
-        <w:t xml:space="preserve"> </w:t>
-      </w:r>
-      <w:proofErr w:type="gramStart"/>
-      <w:r>
-        <w:rPr>
-          <w:rFonts w:ascii="Times New Roman" w:hAnsi="Times New Roman" w:cs="Times New Roman"/>
-          <w:sz w:val="21"/>
-          <w:szCs w:val="21"/>
-        </w:rPr>
-        <w:t>phone{</w:t>
-      </w:r>
-      <w:proofErr w:type="gramEnd"/>
-      <w:r>
-        <w:rPr>
-          <w:rFonts w:ascii="Times New Roman" w:hAnsi="Times New Roman" w:cs="Times New Roman"/>
-          <w:sz w:val="21"/>
-          <w:szCs w:val="21"/>
-        </w:rPr>
-        <w:t xml:space="preserve">% endif </w:t>
-      </w:r>
-      <w:proofErr w:type="gramStart"/>
-      <w:r>
-        <w:rPr>
-          <w:rFonts w:ascii="Times New Roman" w:hAnsi="Times New Roman" w:cs="Times New Roman"/>
-          <w:sz w:val="21"/>
-          <w:szCs w:val="21"/>
-        </w:rPr>
-        <w:t>%}{</w:t>
-      </w:r>
-      <w:proofErr w:type="gramEnd"/>
-      <w:r>
-        <w:rPr>
-          <w:rFonts w:ascii="Times New Roman" w:hAnsi="Times New Roman" w:cs="Times New Roman"/>
-          <w:sz w:val="21"/>
-          <w:szCs w:val="21"/>
-        </w:rPr>
-        <w:t>% else</w:t>
-      </w:r>
-      <w:proofErr w:type="gramStart"/>
-      <w:r>
-        <w:rPr>
-          <w:rFonts w:ascii="Times New Roman" w:hAnsi="Times New Roman" w:cs="Times New Roman"/>
-          <w:sz w:val="21"/>
-          <w:szCs w:val="21"/>
-        </w:rPr>
-        <w:t xml:space="preserve">%}{{ </w:t>
+        <w:t xml:space="preserve"> == “plaintiff” %}Does not have phone{% else %}Unknown phone{% endif %}{% else%}{{ </w:t>
       </w:r>
       <w:proofErr w:type="spellStart"/>
       <w:r>
@@ -1117,16 +719,7 @@
           <w:sz w:val="21"/>
           <w:szCs w:val="21"/>
         </w:rPr>
-        <w:t>phone</w:t>
-      </w:r>
-      <w:proofErr w:type="gramEnd"/>
-      <w:r>
-        <w:rPr>
-          <w:rFonts w:ascii="Times New Roman" w:hAnsi="Times New Roman" w:cs="Times New Roman"/>
-          <w:sz w:val="21"/>
-          <w:szCs w:val="21"/>
-        </w:rPr>
-        <w:t>_number_formatted</w:t>
+        <w:t>phone_number_formatted</w:t>
       </w:r>
       <w:proofErr w:type="spellEnd"/>
       <w:r>
@@ -1151,16 +744,7 @@
           <w:sz w:val="21"/>
           <w:szCs w:val="21"/>
         </w:rPr>
-        <w:t>[0</w:t>
-      </w:r>
-      <w:proofErr w:type="gramStart"/>
-      <w:r>
-        <w:rPr>
-          <w:rFonts w:ascii="Times New Roman" w:hAnsi="Times New Roman" w:cs="Times New Roman"/>
-          <w:sz w:val="21"/>
-          <w:szCs w:val="21"/>
-        </w:rPr>
-        <w:t>].</w:t>
+        <w:t>[0].</w:t>
       </w:r>
       <w:proofErr w:type="spellStart"/>
       <w:r>
@@ -1169,19 +753,9 @@
           <w:sz w:val="21"/>
           <w:szCs w:val="21"/>
         </w:rPr>
-        <w:t>phone</w:t>
-      </w:r>
-      <w:proofErr w:type="gramEnd"/>
-      <w:r>
-        <w:rPr>
-          <w:rFonts w:ascii="Times New Roman" w:hAnsi="Times New Roman" w:cs="Times New Roman"/>
-          <w:sz w:val="21"/>
-          <w:szCs w:val="21"/>
-        </w:rPr>
-        <w:t>_number</w:t>
+        <w:t>phone_number</w:t>
       </w:r>
       <w:proofErr w:type="spellEnd"/>
-      <w:proofErr w:type="gramStart"/>
       <w:r>
         <w:rPr>
           <w:rFonts w:ascii="Times New Roman" w:hAnsi="Times New Roman" w:cs="Times New Roman"/>
@@ -1196,16 +770,7 @@
           <w:sz w:val="21"/>
           <w:szCs w:val="21"/>
         </w:rPr>
-        <w:t>{</w:t>
-      </w:r>
-      <w:proofErr w:type="gramEnd"/>
-      <w:r>
-        <w:rPr>
-          <w:rFonts w:ascii="Times New Roman" w:hAnsi="Times New Roman" w:cs="Times New Roman"/>
-          <w:sz w:val="21"/>
-          <w:szCs w:val="21"/>
-        </w:rPr>
-        <w:t>% endif %}</w:t>
+        <w:t>{% endif %}</w:t>
       </w:r>
       <w:r>
         <w:rPr>
@@ -1214,24 +779,7 @@
           <w:szCs w:val="21"/>
         </w:rPr>
         <w:br w:type="column"/>
-      </w:r>
-      <w:proofErr w:type="gramStart"/>
-      <w:r>
-        <w:rPr>
-          <w:rFonts w:ascii="Times New Roman" w:hAnsi="Times New Roman" w:cs="Times New Roman"/>
-          <w:sz w:val="21"/>
-          <w:szCs w:val="21"/>
-        </w:rPr>
-        <w:t>{{ defendants</w:t>
-      </w:r>
-      <w:proofErr w:type="gramEnd"/>
-      <w:r>
-        <w:rPr>
-          <w:rFonts w:ascii="Times New Roman" w:hAnsi="Times New Roman" w:cs="Times New Roman"/>
-          <w:sz w:val="21"/>
-          <w:szCs w:val="21"/>
-        </w:rPr>
-        <w:t>[0].</w:t>
+        <w:t>{{ defendants[0].</w:t>
       </w:r>
       <w:proofErr w:type="spellStart"/>
       <w:r>
@@ -1240,16 +788,7 @@
           <w:sz w:val="21"/>
           <w:szCs w:val="21"/>
         </w:rPr>
-        <w:t>name_</w:t>
-      </w:r>
-      <w:proofErr w:type="gramStart"/>
-      <w:r>
-        <w:rPr>
-          <w:rFonts w:ascii="Times New Roman" w:hAnsi="Times New Roman" w:cs="Times New Roman"/>
-          <w:sz w:val="21"/>
-          <w:szCs w:val="21"/>
-        </w:rPr>
-        <w:t>full</w:t>
+        <w:t>name_full</w:t>
       </w:r>
       <w:proofErr w:type="spellEnd"/>
       <w:r>
@@ -1258,16 +797,7 @@
           <w:sz w:val="21"/>
           <w:szCs w:val="21"/>
         </w:rPr>
-        <w:t>() }</w:t>
-      </w:r>
-      <w:proofErr w:type="gramEnd"/>
-      <w:r>
-        <w:rPr>
-          <w:rFonts w:ascii="Times New Roman" w:hAnsi="Times New Roman" w:cs="Times New Roman"/>
-          <w:sz w:val="21"/>
-          <w:szCs w:val="21"/>
-        </w:rPr>
-        <w:t>}</w:t>
+        <w:t>() }}</w:t>
       </w:r>
     </w:p>
     <w:p>
@@ -1370,32 +900,13 @@
           <w:szCs w:val="21"/>
         </w:rPr>
       </w:pPr>
-      <w:proofErr w:type="gramStart"/>
-      <w:r>
-        <w:rPr>
-          <w:rFonts w:ascii="Times New Roman" w:hAnsi="Times New Roman" w:cs="Times New Roman"/>
-          <w:sz w:val="21"/>
-          <w:szCs w:val="21"/>
-        </w:rPr>
-        <w:t>{{ defendants</w:t>
-      </w:r>
-      <w:proofErr w:type="gramEnd"/>
-      <w:r>
-        <w:rPr>
-          <w:rFonts w:ascii="Times New Roman" w:hAnsi="Times New Roman" w:cs="Times New Roman"/>
-          <w:sz w:val="21"/>
-          <w:szCs w:val="21"/>
-        </w:rPr>
-        <w:t>[0</w:t>
-      </w:r>
-      <w:proofErr w:type="gramStart"/>
-      <w:r>
-        <w:rPr>
-          <w:rFonts w:ascii="Times New Roman" w:hAnsi="Times New Roman" w:cs="Times New Roman"/>
-          <w:sz w:val="21"/>
-          <w:szCs w:val="21"/>
-        </w:rPr>
-        <w:t>].</w:t>
+      <w:r>
+        <w:rPr>
+          <w:rFonts w:ascii="Times New Roman" w:hAnsi="Times New Roman" w:cs="Times New Roman"/>
+          <w:sz w:val="21"/>
+          <w:szCs w:val="21"/>
+        </w:rPr>
+        <w:t>{{ defendants[0].</w:t>
       </w:r>
       <w:proofErr w:type="spellStart"/>
       <w:r>
@@ -1404,25 +915,7 @@
           <w:sz w:val="21"/>
           <w:szCs w:val="21"/>
         </w:rPr>
-        <w:t>address</w:t>
-      </w:r>
-      <w:proofErr w:type="gramEnd"/>
-      <w:r>
-        <w:rPr>
-          <w:rFonts w:ascii="Times New Roman" w:hAnsi="Times New Roman" w:cs="Times New Roman"/>
-          <w:sz w:val="21"/>
-          <w:szCs w:val="21"/>
-        </w:rPr>
-        <w:t>.line_</w:t>
-      </w:r>
-      <w:proofErr w:type="gramStart"/>
-      <w:r>
-        <w:rPr>
-          <w:rFonts w:ascii="Times New Roman" w:hAnsi="Times New Roman" w:cs="Times New Roman"/>
-          <w:sz w:val="21"/>
-          <w:szCs w:val="21"/>
-        </w:rPr>
-        <w:t>one</w:t>
+        <w:t>address.line_one</w:t>
       </w:r>
       <w:proofErr w:type="spellEnd"/>
       <w:r>
@@ -1431,16 +924,7 @@
           <w:sz w:val="21"/>
           <w:szCs w:val="21"/>
         </w:rPr>
-        <w:t>() }</w:t>
-      </w:r>
-      <w:proofErr w:type="gramEnd"/>
-      <w:r>
-        <w:rPr>
-          <w:rFonts w:ascii="Times New Roman" w:hAnsi="Times New Roman" w:cs="Times New Roman"/>
-          <w:sz w:val="21"/>
-          <w:szCs w:val="21"/>
-        </w:rPr>
-        <w:t>}</w:t>
+        <w:t>() }}</w:t>
       </w:r>
     </w:p>
     <w:p>
@@ -1453,32 +937,13 @@
           <w:szCs w:val="21"/>
         </w:rPr>
       </w:pPr>
-      <w:proofErr w:type="gramStart"/>
-      <w:r>
-        <w:rPr>
-          <w:rFonts w:ascii="Times New Roman" w:hAnsi="Times New Roman" w:cs="Times New Roman"/>
-          <w:sz w:val="21"/>
-          <w:szCs w:val="21"/>
-        </w:rPr>
-        <w:t>{{ defendants</w:t>
-      </w:r>
-      <w:proofErr w:type="gramEnd"/>
-      <w:r>
-        <w:rPr>
-          <w:rFonts w:ascii="Times New Roman" w:hAnsi="Times New Roman" w:cs="Times New Roman"/>
-          <w:sz w:val="21"/>
-          <w:szCs w:val="21"/>
-        </w:rPr>
-        <w:t>[0</w:t>
-      </w:r>
-      <w:proofErr w:type="gramStart"/>
-      <w:r>
-        <w:rPr>
-          <w:rFonts w:ascii="Times New Roman" w:hAnsi="Times New Roman" w:cs="Times New Roman"/>
-          <w:sz w:val="21"/>
-          <w:szCs w:val="21"/>
-        </w:rPr>
-        <w:t>].</w:t>
+      <w:r>
+        <w:rPr>
+          <w:rFonts w:ascii="Times New Roman" w:hAnsi="Times New Roman" w:cs="Times New Roman"/>
+          <w:sz w:val="21"/>
+          <w:szCs w:val="21"/>
+        </w:rPr>
+        <w:t>{{ defendants[0].</w:t>
       </w:r>
       <w:proofErr w:type="spellStart"/>
       <w:r>
@@ -1487,25 +952,7 @@
           <w:sz w:val="21"/>
           <w:szCs w:val="21"/>
         </w:rPr>
-        <w:t>address</w:t>
-      </w:r>
-      <w:proofErr w:type="gramEnd"/>
-      <w:r>
-        <w:rPr>
-          <w:rFonts w:ascii="Times New Roman" w:hAnsi="Times New Roman" w:cs="Times New Roman"/>
-          <w:sz w:val="21"/>
-          <w:szCs w:val="21"/>
-        </w:rPr>
-        <w:t>.line_</w:t>
-      </w:r>
-      <w:proofErr w:type="gramStart"/>
-      <w:r>
-        <w:rPr>
-          <w:rFonts w:ascii="Times New Roman" w:hAnsi="Times New Roman" w:cs="Times New Roman"/>
-          <w:sz w:val="21"/>
-          <w:szCs w:val="21"/>
-        </w:rPr>
-        <w:t>two</w:t>
+        <w:t>address.line_two</w:t>
       </w:r>
       <w:proofErr w:type="spellEnd"/>
       <w:r>
@@ -1514,16 +961,7 @@
           <w:sz w:val="21"/>
           <w:szCs w:val="21"/>
         </w:rPr>
-        <w:t>() }</w:t>
-      </w:r>
-      <w:proofErr w:type="gramEnd"/>
-      <w:r>
-        <w:rPr>
-          <w:rFonts w:ascii="Times New Roman" w:hAnsi="Times New Roman" w:cs="Times New Roman"/>
-          <w:sz w:val="21"/>
-          <w:szCs w:val="21"/>
-        </w:rPr>
-        <w:t>}</w:t>
+        <w:t>() }}</w:t>
       </w:r>
     </w:p>
     <w:p>
@@ -1550,23 +988,13 @@
         </w:rPr>
         <w:t xml:space="preserve">{% if </w:t>
       </w:r>
-      <w:proofErr w:type="gramStart"/>
-      <w:r>
-        <w:rPr>
-          <w:rFonts w:ascii="Times New Roman" w:hAnsi="Times New Roman" w:cs="Times New Roman"/>
-          <w:sz w:val="21"/>
-          <w:szCs w:val="21"/>
-        </w:rPr>
-        <w:t>defendants[</w:t>
-      </w:r>
-      <w:proofErr w:type="gramEnd"/>
-      <w:r>
-        <w:rPr>
-          <w:rFonts w:ascii="Times New Roman" w:hAnsi="Times New Roman" w:cs="Times New Roman"/>
-          <w:sz w:val="21"/>
-          <w:szCs w:val="21"/>
-        </w:rPr>
-        <w:t>0].</w:t>
+      <w:r>
+        <w:rPr>
+          <w:rFonts w:ascii="Times New Roman" w:hAnsi="Times New Roman" w:cs="Times New Roman"/>
+          <w:sz w:val="21"/>
+          <w:szCs w:val="21"/>
+        </w:rPr>
+        <w:t>defendants[0].</w:t>
       </w:r>
       <w:proofErr w:type="spellStart"/>
       <w:r>
@@ -1584,33 +1012,15 @@
           <w:sz w:val="21"/>
           <w:szCs w:val="21"/>
         </w:rPr>
-        <w:t xml:space="preserve"> </w:t>
-      </w:r>
-      <w:proofErr w:type="gramStart"/>
-      <w:r>
-        <w:rPr>
-          <w:rFonts w:ascii="Times New Roman" w:hAnsi="Times New Roman" w:cs="Times New Roman"/>
-          <w:sz w:val="21"/>
-          <w:szCs w:val="21"/>
-        </w:rPr>
-        <w:t>%}</w:t>
-      </w:r>
-      <w:r>
-        <w:rPr>
-          <w:rFonts w:ascii="Times New Roman" w:hAnsi="Times New Roman" w:cs="Times New Roman"/>
-          <w:sz w:val="21"/>
-          <w:szCs w:val="21"/>
-        </w:rPr>
-        <w:t>{</w:t>
-      </w:r>
-      <w:proofErr w:type="gramEnd"/>
-      <w:r>
-        <w:rPr>
-          <w:rFonts w:ascii="Times New Roman" w:hAnsi="Times New Roman" w:cs="Times New Roman"/>
-          <w:sz w:val="21"/>
-          <w:szCs w:val="21"/>
-        </w:rPr>
-        <w:t xml:space="preserve">% if </w:t>
+        <w:t xml:space="preserve"> %}</w:t>
+      </w:r>
+      <w:r>
+        <w:rPr>
+          <w:rFonts w:ascii="Times New Roman" w:hAnsi="Times New Roman" w:cs="Times New Roman"/>
+          <w:sz w:val="21"/>
+          <w:szCs w:val="21"/>
+        </w:rPr>
+        <w:t xml:space="preserve">{% if </w:t>
       </w:r>
       <w:proofErr w:type="spellStart"/>
       <w:r>
@@ -1628,106 +1038,7 @@
           <w:sz w:val="21"/>
           <w:szCs w:val="21"/>
         </w:rPr>
-        <w:t xml:space="preserve"> == “defendant” </w:t>
-      </w:r>
-      <w:proofErr w:type="gramStart"/>
-      <w:r>
-        <w:rPr>
-          <w:rFonts w:ascii="Times New Roman" w:hAnsi="Times New Roman" w:cs="Times New Roman"/>
-          <w:sz w:val="21"/>
-          <w:szCs w:val="21"/>
-        </w:rPr>
-        <w:t>%}Does</w:t>
-      </w:r>
-      <w:proofErr w:type="gramEnd"/>
-      <w:r>
-        <w:rPr>
-          <w:rFonts w:ascii="Times New Roman" w:hAnsi="Times New Roman" w:cs="Times New Roman"/>
-          <w:sz w:val="21"/>
-          <w:szCs w:val="21"/>
-        </w:rPr>
-        <w:t xml:space="preserve"> not have </w:t>
-      </w:r>
-      <w:proofErr w:type="gramStart"/>
-      <w:r>
-        <w:rPr>
-          <w:rFonts w:ascii="Times New Roman" w:hAnsi="Times New Roman" w:cs="Times New Roman"/>
-          <w:sz w:val="21"/>
-          <w:szCs w:val="21"/>
-        </w:rPr>
-        <w:t>phone{</w:t>
-      </w:r>
-      <w:proofErr w:type="gramEnd"/>
-      <w:r>
-        <w:rPr>
-          <w:rFonts w:ascii="Times New Roman" w:hAnsi="Times New Roman" w:cs="Times New Roman"/>
-          <w:sz w:val="21"/>
-          <w:szCs w:val="21"/>
-        </w:rPr>
-        <w:t xml:space="preserve">% else </w:t>
-      </w:r>
-      <w:proofErr w:type="gramStart"/>
-      <w:r>
-        <w:rPr>
-          <w:rFonts w:ascii="Times New Roman" w:hAnsi="Times New Roman" w:cs="Times New Roman"/>
-          <w:sz w:val="21"/>
-          <w:szCs w:val="21"/>
-        </w:rPr>
-        <w:t>%}Unknown</w:t>
-      </w:r>
-      <w:proofErr w:type="gramEnd"/>
-      <w:r>
-        <w:rPr>
-          <w:rFonts w:ascii="Times New Roman" w:hAnsi="Times New Roman" w:cs="Times New Roman"/>
-          <w:sz w:val="21"/>
-          <w:szCs w:val="21"/>
-        </w:rPr>
-        <w:t xml:space="preserve"> </w:t>
-      </w:r>
-      <w:proofErr w:type="gramStart"/>
-      <w:r>
-        <w:rPr>
-          <w:rFonts w:ascii="Times New Roman" w:hAnsi="Times New Roman" w:cs="Times New Roman"/>
-          <w:sz w:val="21"/>
-          <w:szCs w:val="21"/>
-        </w:rPr>
-        <w:t>phone{</w:t>
-      </w:r>
-      <w:proofErr w:type="gramEnd"/>
-      <w:r>
-        <w:rPr>
-          <w:rFonts w:ascii="Times New Roman" w:hAnsi="Times New Roman" w:cs="Times New Roman"/>
-          <w:sz w:val="21"/>
-          <w:szCs w:val="21"/>
-        </w:rPr>
-        <w:t xml:space="preserve">% endif </w:t>
-      </w:r>
-      <w:proofErr w:type="gramStart"/>
-      <w:r>
-        <w:rPr>
-          <w:rFonts w:ascii="Times New Roman" w:hAnsi="Times New Roman" w:cs="Times New Roman"/>
-          <w:sz w:val="21"/>
-          <w:szCs w:val="21"/>
-        </w:rPr>
-        <w:t>%}{</w:t>
-      </w:r>
-      <w:proofErr w:type="gramEnd"/>
-      <w:r>
-        <w:rPr>
-          <w:rFonts w:ascii="Times New Roman" w:hAnsi="Times New Roman" w:cs="Times New Roman"/>
-          <w:sz w:val="21"/>
-          <w:szCs w:val="21"/>
-        </w:rPr>
-        <w:t xml:space="preserve">% else </w:t>
-      </w:r>
-      <w:proofErr w:type="gramStart"/>
-      <w:r>
-        <w:rPr>
-          <w:rFonts w:ascii="Times New Roman" w:hAnsi="Times New Roman" w:cs="Times New Roman"/>
-          <w:sz w:val="21"/>
-          <w:szCs w:val="21"/>
-        </w:rPr>
-        <w:t>%}</w:t>
+        <w:t xml:space="preserve"> == “defendant” %}Does not have phone{% else %}Unknown phone{% endif %}{% else %}</w:t>
       </w:r>
       <w:r>
         <w:rPr>
@@ -1744,16 +1055,7 @@
           <w:sz w:val="21"/>
           <w:szCs w:val="21"/>
         </w:rPr>
-        <w:t>phone</w:t>
-      </w:r>
-      <w:proofErr w:type="gramEnd"/>
-      <w:r>
-        <w:rPr>
-          <w:rFonts w:ascii="Times New Roman" w:hAnsi="Times New Roman" w:cs="Times New Roman"/>
-          <w:sz w:val="21"/>
-          <w:szCs w:val="21"/>
-        </w:rPr>
-        <w:t>_number_formatted</w:t>
+        <w:t>phone_number_formatted</w:t>
       </w:r>
       <w:proofErr w:type="spellEnd"/>
       <w:r>
@@ -1778,16 +1080,7 @@
           <w:sz w:val="21"/>
           <w:szCs w:val="21"/>
         </w:rPr>
-        <w:t>[0</w:t>
-      </w:r>
-      <w:proofErr w:type="gramStart"/>
-      <w:r>
-        <w:rPr>
-          <w:rFonts w:ascii="Times New Roman" w:hAnsi="Times New Roman" w:cs="Times New Roman"/>
-          <w:sz w:val="21"/>
-          <w:szCs w:val="21"/>
-        </w:rPr>
-        <w:t>].</w:t>
+        <w:t>[0].</w:t>
       </w:r>
       <w:proofErr w:type="spellStart"/>
       <w:r>
@@ -1796,35 +1089,16 @@
           <w:sz w:val="21"/>
           <w:szCs w:val="21"/>
         </w:rPr>
-        <w:t>phone</w:t>
-      </w:r>
-      <w:proofErr w:type="gramEnd"/>
-      <w:r>
-        <w:rPr>
-          <w:rFonts w:ascii="Times New Roman" w:hAnsi="Times New Roman" w:cs="Times New Roman"/>
-          <w:sz w:val="21"/>
-          <w:szCs w:val="21"/>
-        </w:rPr>
-        <w:t>_number</w:t>
+        <w:t>phone_number</w:t>
       </w:r>
       <w:proofErr w:type="spellEnd"/>
-      <w:proofErr w:type="gramStart"/>
-      <w:r>
-        <w:rPr>
-          <w:rFonts w:ascii="Times New Roman" w:hAnsi="Times New Roman" w:cs="Times New Roman"/>
-          <w:sz w:val="21"/>
-          <w:szCs w:val="21"/>
-        </w:rPr>
-        <w:t>) }}{</w:t>
-      </w:r>
-      <w:proofErr w:type="gramEnd"/>
-      <w:r>
-        <w:rPr>
-          <w:rFonts w:ascii="Times New Roman" w:hAnsi="Times New Roman" w:cs="Times New Roman"/>
-          <w:sz w:val="21"/>
-          <w:szCs w:val="21"/>
-        </w:rPr>
-        <w:t>% endif %}</w:t>
+      <w:r>
+        <w:rPr>
+          <w:rFonts w:ascii="Times New Roman" w:hAnsi="Times New Roman" w:cs="Times New Roman"/>
+          <w:sz w:val="21"/>
+          <w:szCs w:val="21"/>
+        </w:rPr>
+        <w:t>) }}{% endif %}</w:t>
       </w:r>
     </w:p>
     <w:p>
@@ -1953,7 +1227,199 @@
           <w:sz w:val="22"/>
           <w:szCs w:val="22"/>
         </w:rPr>
-        <w:t>Motion for Entry of Consent Judgment of Divorce</w:t>
+        <w:t xml:space="preserve">Motion for Entry of Consent </w:t>
+      </w:r>
+      <w:r>
+        <w:rPr>
+          <w:rFonts w:ascii="Times New Roman" w:hAnsi="Times New Roman" w:cs="Times New Roman"/>
+          <w:b/>
+          <w:bCs/>
+          <w:sz w:val="22"/>
+          <w:szCs w:val="22"/>
+        </w:rPr>
+        <w:t xml:space="preserve">{% if </w:t>
+      </w:r>
+      <w:proofErr w:type="spellStart"/>
+      <w:r>
+        <w:rPr>
+          <w:rFonts w:ascii="Times New Roman" w:hAnsi="Times New Roman" w:cs="Times New Roman"/>
+          <w:b/>
+          <w:bCs/>
+          <w:sz w:val="22"/>
+          <w:szCs w:val="22"/>
+        </w:rPr>
+        <w:t>tool_ID</w:t>
+      </w:r>
+      <w:proofErr w:type="spellEnd"/>
+      <w:r>
+        <w:rPr>
+          <w:rFonts w:ascii="Times New Roman" w:hAnsi="Times New Roman" w:cs="Times New Roman"/>
+          <w:b/>
+          <w:bCs/>
+          <w:sz w:val="22"/>
+          <w:szCs w:val="22"/>
+        </w:rPr>
+        <w:t xml:space="preserve"> in [“</w:t>
+      </w:r>
+      <w:proofErr w:type="spellStart"/>
+      <w:r>
+        <w:rPr>
+          <w:rFonts w:ascii="Times New Roman" w:hAnsi="Times New Roman" w:cs="Times New Roman"/>
+          <w:b/>
+          <w:bCs/>
+          <w:sz w:val="22"/>
+          <w:szCs w:val="22"/>
+        </w:rPr>
+        <w:t>divorce_complaint</w:t>
+      </w:r>
+      <w:proofErr w:type="spellEnd"/>
+      <w:r>
+        <w:rPr>
+          <w:rFonts w:ascii="Times New Roman" w:hAnsi="Times New Roman" w:cs="Times New Roman"/>
+          <w:b/>
+          <w:bCs/>
+          <w:sz w:val="22"/>
+          <w:szCs w:val="22"/>
+        </w:rPr>
+        <w:t>”, “</w:t>
+      </w:r>
+      <w:proofErr w:type="spellStart"/>
+      <w:r>
+        <w:rPr>
+          <w:rFonts w:ascii="Times New Roman" w:hAnsi="Times New Roman" w:cs="Times New Roman"/>
+          <w:b/>
+          <w:bCs/>
+          <w:sz w:val="22"/>
+          <w:szCs w:val="22"/>
+        </w:rPr>
+        <w:t>JOD_only</w:t>
+      </w:r>
+      <w:proofErr w:type="spellEnd"/>
+      <w:r>
+        <w:rPr>
+          <w:rFonts w:ascii="Times New Roman" w:hAnsi="Times New Roman" w:cs="Times New Roman"/>
+          <w:b/>
+          <w:bCs/>
+          <w:sz w:val="22"/>
+          <w:szCs w:val="22"/>
+        </w:rPr>
+        <w:t>”] %}</w:t>
+      </w:r>
+      <w:r>
+        <w:rPr>
+          <w:rFonts w:ascii="Times New Roman" w:hAnsi="Times New Roman" w:cs="Times New Roman"/>
+          <w:b/>
+          <w:bCs/>
+          <w:sz w:val="22"/>
+          <w:szCs w:val="22"/>
+        </w:rPr>
+        <w:t>Judgment of Divorce</w:t>
+      </w:r>
+      <w:r>
+        <w:rPr>
+          <w:rFonts w:ascii="Times New Roman" w:hAnsi="Times New Roman" w:cs="Times New Roman"/>
+          <w:b/>
+          <w:bCs/>
+          <w:sz w:val="22"/>
+          <w:szCs w:val="22"/>
+        </w:rPr>
+        <w:t xml:space="preserve">{% </w:t>
+      </w:r>
+      <w:proofErr w:type="spellStart"/>
+      <w:r>
+        <w:rPr>
+          <w:rFonts w:ascii="Times New Roman" w:hAnsi="Times New Roman" w:cs="Times New Roman"/>
+          <w:b/>
+          <w:bCs/>
+          <w:sz w:val="22"/>
+          <w:szCs w:val="22"/>
+        </w:rPr>
+        <w:t>elif</w:t>
+      </w:r>
+      <w:proofErr w:type="spellEnd"/>
+      <w:r>
+        <w:rPr>
+          <w:rFonts w:ascii="Times New Roman" w:hAnsi="Times New Roman" w:cs="Times New Roman"/>
+          <w:b/>
+          <w:bCs/>
+          <w:sz w:val="22"/>
+          <w:szCs w:val="22"/>
+        </w:rPr>
+        <w:t xml:space="preserve"> </w:t>
+      </w:r>
+      <w:proofErr w:type="spellStart"/>
+      <w:r>
+        <w:rPr>
+          <w:rFonts w:ascii="Times New Roman" w:hAnsi="Times New Roman" w:cs="Times New Roman"/>
+          <w:b/>
+          <w:bCs/>
+          <w:sz w:val="22"/>
+          <w:szCs w:val="22"/>
+        </w:rPr>
+        <w:t>tool_ID</w:t>
+      </w:r>
+      <w:proofErr w:type="spellEnd"/>
+      <w:r>
+        <w:rPr>
+          <w:rFonts w:ascii="Times New Roman" w:hAnsi="Times New Roman" w:cs="Times New Roman"/>
+          <w:b/>
+          <w:bCs/>
+          <w:sz w:val="22"/>
+          <w:szCs w:val="22"/>
+        </w:rPr>
+        <w:t xml:space="preserve"> == “</w:t>
+      </w:r>
+      <w:proofErr w:type="spellStart"/>
+      <w:r>
+        <w:rPr>
+          <w:rFonts w:ascii="Times New Roman" w:hAnsi="Times New Roman" w:cs="Times New Roman"/>
+          <w:b/>
+          <w:bCs/>
+          <w:sz w:val="22"/>
+          <w:szCs w:val="22"/>
+        </w:rPr>
+        <w:t>custody_complaint</w:t>
+      </w:r>
+      <w:proofErr w:type="spellEnd"/>
+      <w:r>
+        <w:rPr>
+          <w:rFonts w:ascii="Times New Roman" w:hAnsi="Times New Roman" w:cs="Times New Roman"/>
+          <w:b/>
+          <w:bCs/>
+          <w:sz w:val="22"/>
+          <w:szCs w:val="22"/>
+        </w:rPr>
+        <w:t>” %}Order Regarding</w:t>
+      </w:r>
+      <w:r>
+        <w:rPr>
+          <w:rFonts w:ascii="Times New Roman" w:hAnsi="Times New Roman" w:cs="Times New Roman"/>
+          <w:b/>
+          <w:bCs/>
+          <w:sz w:val="22"/>
+          <w:szCs w:val="22"/>
+        </w:rPr>
+        <w:t xml:space="preserve"> </w:t>
+      </w:r>
+      <w:r>
+        <w:rPr>
+          <w:rFonts w:ascii="Times New Roman" w:hAnsi="Times New Roman" w:cs="Times New Roman"/>
+          <w:b/>
+          <w:bCs/>
+          <w:sz w:val="22"/>
+          <w:szCs w:val="22"/>
+        </w:rPr>
+        <w:t>Custody, Parenting Time, and Child Support</w:t>
+      </w:r>
+      <w:r>
+        <w:rPr>
+          <w:rFonts w:ascii="Times New Roman" w:hAnsi="Times New Roman" w:cs="Times New Roman"/>
+          <w:b/>
+          <w:bCs/>
+          <w:sz w:val="22"/>
+          <w:szCs w:val="22"/>
+        </w:rPr>
+        <w:t>{% endif %}</w:t>
       </w:r>
     </w:p>
     <w:p>
@@ -2006,9 +1472,16 @@
           <w:szCs w:val="22"/>
           <w:highlight w:val="yellow"/>
         </w:rPr>
-        <w:t xml:space="preserve"> == “plaintiff” </w:t>
-      </w:r>
-      <w:proofErr w:type="gramStart"/>
+        <w:t xml:space="preserve"> == “plaintiff” %}</w:t>
+      </w:r>
+      <w:r>
+        <w:rPr>
+          <w:rFonts w:ascii="Times New Roman" w:hAnsi="Times New Roman" w:cs="Times New Roman"/>
+          <w:sz w:val="22"/>
+          <w:szCs w:val="22"/>
+        </w:rPr>
+        <w:t>Plaintiff</w:t>
+      </w:r>
       <w:r>
         <w:rPr>
           <w:rFonts w:ascii="Times New Roman" w:hAnsi="Times New Roman" w:cs="Times New Roman"/>
@@ -2016,35 +1489,7 @@
           <w:szCs w:val="22"/>
           <w:highlight w:val="yellow"/>
         </w:rPr>
-        <w:t>%}</w:t>
-      </w:r>
-      <w:r>
-        <w:rPr>
-          <w:rFonts w:ascii="Times New Roman" w:hAnsi="Times New Roman" w:cs="Times New Roman"/>
-          <w:sz w:val="22"/>
-          <w:szCs w:val="22"/>
-        </w:rPr>
-        <w:t>Plaintiff</w:t>
-      </w:r>
-      <w:proofErr w:type="gramEnd"/>
-      <w:r>
-        <w:rPr>
-          <w:rFonts w:ascii="Times New Roman" w:hAnsi="Times New Roman" w:cs="Times New Roman"/>
-          <w:sz w:val="22"/>
-          <w:szCs w:val="22"/>
-          <w:highlight w:val="yellow"/>
-        </w:rPr>
-        <w:t xml:space="preserve">{% else </w:t>
-      </w:r>
-      <w:proofErr w:type="gramStart"/>
-      <w:r>
-        <w:rPr>
-          <w:rFonts w:ascii="Times New Roman" w:hAnsi="Times New Roman" w:cs="Times New Roman"/>
-          <w:sz w:val="22"/>
-          <w:szCs w:val="22"/>
-          <w:highlight w:val="yellow"/>
-        </w:rPr>
-        <w:t>%}</w:t>
+        <w:t>{% else %}</w:t>
       </w:r>
       <w:r>
         <w:rPr>
@@ -2054,7 +1499,6 @@
         </w:rPr>
         <w:t>Defendant</w:t>
       </w:r>
-      <w:proofErr w:type="gramEnd"/>
       <w:r>
         <w:rPr>
           <w:rFonts w:ascii="Times New Roman" w:hAnsi="Times New Roman" w:cs="Times New Roman"/>
@@ -2223,25 +1667,335 @@
           <w:sz w:val="22"/>
           <w:szCs w:val="22"/>
         </w:rPr>
-        <w:t xml:space="preserve">request entry of a Consent Judgment of Divorce. The parties agree on </w:t>
-      </w:r>
-      <w:proofErr w:type="gramStart"/>
-      <w:r>
-        <w:rPr>
-          <w:rFonts w:ascii="Times New Roman" w:hAnsi="Times New Roman" w:cs="Times New Roman"/>
-          <w:sz w:val="22"/>
-          <w:szCs w:val="22"/>
-        </w:rPr>
-        <w:t>all of</w:t>
-      </w:r>
-      <w:proofErr w:type="gramEnd"/>
-      <w:r>
-        <w:rPr>
-          <w:rFonts w:ascii="Times New Roman" w:hAnsi="Times New Roman" w:cs="Times New Roman"/>
-          <w:sz w:val="22"/>
-          <w:szCs w:val="22"/>
-        </w:rPr>
-        <w:t xml:space="preserve"> the terms of the Judgment of Divorce and have signed a proposed Judgment of Divorce to indicate our agreement.</w:t>
+        <w:t xml:space="preserve">request entry of </w:t>
+      </w:r>
+      <w:r>
+        <w:rPr>
+          <w:rFonts w:ascii="Times New Roman" w:hAnsi="Times New Roman" w:cs="Times New Roman"/>
+          <w:sz w:val="22"/>
+          <w:szCs w:val="22"/>
+        </w:rPr>
+        <w:t xml:space="preserve">{% if </w:t>
+      </w:r>
+      <w:proofErr w:type="spellStart"/>
+      <w:r>
+        <w:rPr>
+          <w:rFonts w:ascii="Times New Roman" w:hAnsi="Times New Roman" w:cs="Times New Roman"/>
+          <w:sz w:val="22"/>
+          <w:szCs w:val="22"/>
+        </w:rPr>
+        <w:t>tool_ID</w:t>
+      </w:r>
+      <w:proofErr w:type="spellEnd"/>
+      <w:r>
+        <w:rPr>
+          <w:rFonts w:ascii="Times New Roman" w:hAnsi="Times New Roman" w:cs="Times New Roman"/>
+          <w:sz w:val="22"/>
+          <w:szCs w:val="22"/>
+        </w:rPr>
+        <w:t xml:space="preserve"> in [“</w:t>
+      </w:r>
+      <w:proofErr w:type="spellStart"/>
+      <w:r>
+        <w:rPr>
+          <w:rFonts w:ascii="Times New Roman" w:hAnsi="Times New Roman" w:cs="Times New Roman"/>
+          <w:sz w:val="22"/>
+          <w:szCs w:val="22"/>
+        </w:rPr>
+        <w:t>divorce_complaint</w:t>
+      </w:r>
+      <w:proofErr w:type="spellEnd"/>
+      <w:r>
+        <w:rPr>
+          <w:rFonts w:ascii="Times New Roman" w:hAnsi="Times New Roman" w:cs="Times New Roman"/>
+          <w:sz w:val="22"/>
+          <w:szCs w:val="22"/>
+        </w:rPr>
+        <w:t>”, “</w:t>
+      </w:r>
+      <w:proofErr w:type="spellStart"/>
+      <w:r>
+        <w:rPr>
+          <w:rFonts w:ascii="Times New Roman" w:hAnsi="Times New Roman" w:cs="Times New Roman"/>
+          <w:sz w:val="22"/>
+          <w:szCs w:val="22"/>
+        </w:rPr>
+        <w:t>JOD_only</w:t>
+      </w:r>
+      <w:proofErr w:type="spellEnd"/>
+      <w:r>
+        <w:rPr>
+          <w:rFonts w:ascii="Times New Roman" w:hAnsi="Times New Roman" w:cs="Times New Roman"/>
+          <w:sz w:val="22"/>
+          <w:szCs w:val="22"/>
+        </w:rPr>
+        <w:t>”] %}</w:t>
+      </w:r>
+      <w:r>
+        <w:rPr>
+          <w:rFonts w:ascii="Times New Roman" w:hAnsi="Times New Roman" w:cs="Times New Roman"/>
+          <w:sz w:val="22"/>
+          <w:szCs w:val="22"/>
+        </w:rPr>
+        <w:t xml:space="preserve">a consent </w:t>
+      </w:r>
+      <w:r>
+        <w:rPr>
+          <w:rFonts w:ascii="Times New Roman" w:hAnsi="Times New Roman" w:cs="Times New Roman"/>
+          <w:sz w:val="22"/>
+          <w:szCs w:val="22"/>
+        </w:rPr>
+        <w:t xml:space="preserve">Judgment of Divorce{% </w:t>
+      </w:r>
+      <w:proofErr w:type="spellStart"/>
+      <w:r>
+        <w:rPr>
+          <w:rFonts w:ascii="Times New Roman" w:hAnsi="Times New Roman" w:cs="Times New Roman"/>
+          <w:sz w:val="22"/>
+          <w:szCs w:val="22"/>
+        </w:rPr>
+        <w:t>elif</w:t>
+      </w:r>
+      <w:proofErr w:type="spellEnd"/>
+      <w:r>
+        <w:rPr>
+          <w:rFonts w:ascii="Times New Roman" w:hAnsi="Times New Roman" w:cs="Times New Roman"/>
+          <w:sz w:val="22"/>
+          <w:szCs w:val="22"/>
+        </w:rPr>
+        <w:t xml:space="preserve"> </w:t>
+      </w:r>
+      <w:proofErr w:type="spellStart"/>
+      <w:r>
+        <w:rPr>
+          <w:rFonts w:ascii="Times New Roman" w:hAnsi="Times New Roman" w:cs="Times New Roman"/>
+          <w:sz w:val="22"/>
+          <w:szCs w:val="22"/>
+        </w:rPr>
+        <w:t>tool_ID</w:t>
+      </w:r>
+      <w:proofErr w:type="spellEnd"/>
+      <w:r>
+        <w:rPr>
+          <w:rFonts w:ascii="Times New Roman" w:hAnsi="Times New Roman" w:cs="Times New Roman"/>
+          <w:sz w:val="22"/>
+          <w:szCs w:val="22"/>
+        </w:rPr>
+        <w:t xml:space="preserve"> == “</w:t>
+      </w:r>
+      <w:proofErr w:type="spellStart"/>
+      <w:r>
+        <w:rPr>
+          <w:rFonts w:ascii="Times New Roman" w:hAnsi="Times New Roman" w:cs="Times New Roman"/>
+          <w:sz w:val="22"/>
+          <w:szCs w:val="22"/>
+        </w:rPr>
+        <w:t>custody_complaint</w:t>
+      </w:r>
+      <w:proofErr w:type="spellEnd"/>
+      <w:r>
+        <w:rPr>
+          <w:rFonts w:ascii="Times New Roman" w:hAnsi="Times New Roman" w:cs="Times New Roman"/>
+          <w:sz w:val="22"/>
+          <w:szCs w:val="22"/>
+        </w:rPr>
+        <w:t>” %}</w:t>
+      </w:r>
+      <w:r>
+        <w:rPr>
+          <w:rFonts w:ascii="Times New Roman" w:hAnsi="Times New Roman" w:cs="Times New Roman"/>
+          <w:sz w:val="22"/>
+          <w:szCs w:val="22"/>
+        </w:rPr>
+        <w:t xml:space="preserve">an </w:t>
+      </w:r>
+      <w:r>
+        <w:rPr>
+          <w:rFonts w:ascii="Times New Roman" w:hAnsi="Times New Roman" w:cs="Times New Roman"/>
+          <w:sz w:val="22"/>
+          <w:szCs w:val="22"/>
+        </w:rPr>
+        <w:t>Order Regarding Custody, Parenting Time, and Child Support{% endif %}</w:t>
+      </w:r>
+      <w:r>
+        <w:rPr>
+          <w:rFonts w:ascii="Times New Roman" w:hAnsi="Times New Roman" w:cs="Times New Roman"/>
+          <w:sz w:val="22"/>
+          <w:szCs w:val="22"/>
+        </w:rPr>
+        <w:t xml:space="preserve">. </w:t>
+      </w:r>
+      <w:r>
+        <w:rPr>
+          <w:rFonts w:ascii="Times New Roman" w:hAnsi="Times New Roman" w:cs="Times New Roman"/>
+          <w:sz w:val="22"/>
+          <w:szCs w:val="22"/>
+        </w:rPr>
+        <w:t xml:space="preserve">{% if </w:t>
+      </w:r>
+      <w:proofErr w:type="spellStart"/>
+      <w:r>
+        <w:rPr>
+          <w:rFonts w:ascii="Times New Roman" w:hAnsi="Times New Roman" w:cs="Times New Roman"/>
+          <w:sz w:val="22"/>
+          <w:szCs w:val="22"/>
+        </w:rPr>
+        <w:t>tool_ID</w:t>
+      </w:r>
+      <w:proofErr w:type="spellEnd"/>
+      <w:r>
+        <w:rPr>
+          <w:rFonts w:ascii="Times New Roman" w:hAnsi="Times New Roman" w:cs="Times New Roman"/>
+          <w:sz w:val="22"/>
+          <w:szCs w:val="22"/>
+        </w:rPr>
+        <w:t xml:space="preserve"> in [“</w:t>
+      </w:r>
+      <w:proofErr w:type="spellStart"/>
+      <w:r>
+        <w:rPr>
+          <w:rFonts w:ascii="Times New Roman" w:hAnsi="Times New Roman" w:cs="Times New Roman"/>
+          <w:sz w:val="22"/>
+          <w:szCs w:val="22"/>
+        </w:rPr>
+        <w:t>divorce_complaint</w:t>
+      </w:r>
+      <w:proofErr w:type="spellEnd"/>
+      <w:r>
+        <w:rPr>
+          <w:rFonts w:ascii="Times New Roman" w:hAnsi="Times New Roman" w:cs="Times New Roman"/>
+          <w:sz w:val="22"/>
+          <w:szCs w:val="22"/>
+        </w:rPr>
+        <w:t>”, “</w:t>
+      </w:r>
+      <w:proofErr w:type="spellStart"/>
+      <w:r>
+        <w:rPr>
+          <w:rFonts w:ascii="Times New Roman" w:hAnsi="Times New Roman" w:cs="Times New Roman"/>
+          <w:sz w:val="22"/>
+          <w:szCs w:val="22"/>
+        </w:rPr>
+        <w:t>JOD_only</w:t>
+      </w:r>
+      <w:proofErr w:type="spellEnd"/>
+      <w:r>
+        <w:rPr>
+          <w:rFonts w:ascii="Times New Roman" w:hAnsi="Times New Roman" w:cs="Times New Roman"/>
+          <w:sz w:val="22"/>
+          <w:szCs w:val="22"/>
+        </w:rPr>
+        <w:t>”] %}</w:t>
+      </w:r>
+      <w:r>
+        <w:rPr>
+          <w:rFonts w:ascii="Times New Roman" w:hAnsi="Times New Roman" w:cs="Times New Roman"/>
+          <w:sz w:val="22"/>
+          <w:szCs w:val="22"/>
+        </w:rPr>
+        <w:t>The parties agree on all of the terms of the Judgment of Divorce and have signed a proposed Judgment of Divorce to indicate our agreement.</w:t>
+      </w:r>
+      <w:r>
+        <w:rPr>
+          <w:rFonts w:ascii="Times New Roman" w:hAnsi="Times New Roman" w:cs="Times New Roman"/>
+          <w:sz w:val="22"/>
+          <w:szCs w:val="22"/>
+        </w:rPr>
+        <w:t xml:space="preserve">{% </w:t>
+      </w:r>
+      <w:proofErr w:type="spellStart"/>
+      <w:r>
+        <w:rPr>
+          <w:rFonts w:ascii="Times New Roman" w:hAnsi="Times New Roman" w:cs="Times New Roman"/>
+          <w:sz w:val="22"/>
+          <w:szCs w:val="22"/>
+        </w:rPr>
+        <w:t>elif</w:t>
+      </w:r>
+      <w:proofErr w:type="spellEnd"/>
+      <w:r>
+        <w:rPr>
+          <w:rFonts w:ascii="Times New Roman" w:hAnsi="Times New Roman" w:cs="Times New Roman"/>
+          <w:sz w:val="22"/>
+          <w:szCs w:val="22"/>
+        </w:rPr>
+        <w:t xml:space="preserve"> </w:t>
+      </w:r>
+      <w:proofErr w:type="spellStart"/>
+      <w:r>
+        <w:rPr>
+          <w:rFonts w:ascii="Times New Roman" w:hAnsi="Times New Roman" w:cs="Times New Roman"/>
+          <w:sz w:val="22"/>
+          <w:szCs w:val="22"/>
+        </w:rPr>
+        <w:t>tool_ID</w:t>
+      </w:r>
+      <w:proofErr w:type="spellEnd"/>
+      <w:r>
+        <w:rPr>
+          <w:rFonts w:ascii="Times New Roman" w:hAnsi="Times New Roman" w:cs="Times New Roman"/>
+          <w:sz w:val="22"/>
+          <w:szCs w:val="22"/>
+        </w:rPr>
+        <w:t xml:space="preserve"> == “</w:t>
+      </w:r>
+      <w:proofErr w:type="spellStart"/>
+      <w:r>
+        <w:rPr>
+          <w:rFonts w:ascii="Times New Roman" w:hAnsi="Times New Roman" w:cs="Times New Roman"/>
+          <w:sz w:val="22"/>
+          <w:szCs w:val="22"/>
+        </w:rPr>
+        <w:t>custody_complaint</w:t>
+      </w:r>
+      <w:proofErr w:type="spellEnd"/>
+      <w:r>
+        <w:rPr>
+          <w:rFonts w:ascii="Times New Roman" w:hAnsi="Times New Roman" w:cs="Times New Roman"/>
+          <w:sz w:val="22"/>
+          <w:szCs w:val="22"/>
+        </w:rPr>
+        <w:t>” %}The</w:t>
+      </w:r>
+      <w:r>
+        <w:rPr>
+          <w:rFonts w:ascii="Times New Roman" w:hAnsi="Times New Roman" w:cs="Times New Roman"/>
+          <w:sz w:val="22"/>
+          <w:szCs w:val="22"/>
+        </w:rPr>
+        <w:t xml:space="preserve"> </w:t>
+      </w:r>
+      <w:r>
+        <w:rPr>
+          <w:rFonts w:ascii="Times New Roman" w:hAnsi="Times New Roman" w:cs="Times New Roman"/>
+          <w:sz w:val="22"/>
+          <w:szCs w:val="22"/>
+        </w:rPr>
+        <w:t>parties agree on all of the terms of the order and have signed a proposed Order Regarding</w:t>
+      </w:r>
+      <w:r>
+        <w:rPr>
+          <w:rFonts w:ascii="Times New Roman" w:hAnsi="Times New Roman" w:cs="Times New Roman"/>
+          <w:sz w:val="22"/>
+          <w:szCs w:val="22"/>
+        </w:rPr>
+        <w:t xml:space="preserve"> </w:t>
+      </w:r>
+      <w:r>
+        <w:rPr>
+          <w:rFonts w:ascii="Times New Roman" w:hAnsi="Times New Roman" w:cs="Times New Roman"/>
+          <w:sz w:val="22"/>
+          <w:szCs w:val="22"/>
+        </w:rPr>
+        <w:t>Custody, Parenting Time, and Child Support to indicate our agreement.</w:t>
+      </w:r>
+      <w:r>
+        <w:rPr>
+          <w:rFonts w:ascii="Times New Roman" w:hAnsi="Times New Roman" w:cs="Times New Roman"/>
+          <w:sz w:val="22"/>
+          <w:szCs w:val="22"/>
+        </w:rPr>
+        <w:t>{% endif %}</w:t>
       </w:r>
     </w:p>
     <w:p>

</xml_diff>